<commit_message>
feat(contracts): step 5 — flat sequential numbering in spec_v2
</commit_message>
<xml_diff>
--- a/templates/contracts/spec_v2.docx
+++ b/templates/contracts/spec_v2.docx
@@ -21,8 +21,13 @@
         <w:jc w:val="center"/>
       </w:pPr>
       <w:r>
-        <w:t>к Договору № {{ДОГОВОР_НОМЕР}} от {{ДОГОВОР_ДАТА_ПОЛНАЯ}}г.</w:t>
+        <w:t>к Договору № {{ДОГОВОР_НОМЕР}} от {{ДОГОВОР_ДАТА_ПОЛНАЯ</w:t>
       </w:r>
+      <w:proofErr w:type="gramStart"/>
+      <w:r>
+        <w:t>}}г.</w:t>
+      </w:r>
+      <w:proofErr w:type="gramEnd"/>
     </w:p>
     <w:p>
       <w:pPr>
@@ -59,7 +64,15 @@
         <w:jc w:val="both"/>
       </w:pPr>
       <w:r>
-        <w:t>г. Воронеж                                                                                                                         «{{ДОГОВОР_ДЕНЬ}}» {{ДОГОВОР_МЕСЯЦ}} {{ДОГОВОР_ГОД}} г.</w:t>
+        <w:t xml:space="preserve">г. Воронеж                                                                                                                      </w:t>
+      </w:r>
+      <w:proofErr w:type="gramStart"/>
+      <w:r>
+        <w:t xml:space="preserve">   «</w:t>
+      </w:r>
+      <w:proofErr w:type="gramEnd"/>
+      <w:r>
+        <w:t>{{ДОГОВОР_ДЕНЬ}}» {{ДОГОВОР_МЕСЯЦ}} {{ДОГОВОР_ГОД}} г.</w:t>
       </w:r>
     </w:p>
     <w:p>
@@ -437,7 +450,23 @@
         <w:jc w:val="both"/>
       </w:pPr>
       <w:r>
-        <w:t>Итого по спецификации: {{СПЕЦ_ИТОГО}} ({{СПЕЦ_ИТОГО_ПРОПИСЬ}}) рублей, в т.ч. НДС {{СПЕЦ_НДС}}%.</w:t>
+        <w:t xml:space="preserve">Итого по спецификации: {{СПЕЦ_ИТОГО}} ({{СПЕЦ_ИТОГО_ПРОПИСЬ}}) рублей, в </w:t>
+      </w:r>
+      <w:proofErr w:type="gramStart"/>
+      <w:r>
+        <w:t>т.ч.</w:t>
+      </w:r>
+      <w:proofErr w:type="gramEnd"/>
+      <w:r>
+        <w:t xml:space="preserve"> НДС {{СПЕЦ_НДС</w:t>
+      </w:r>
+      <w:proofErr w:type="gramStart"/>
+      <w:r>
+        <w:t>}}%</w:t>
+      </w:r>
+      <w:proofErr w:type="gramEnd"/>
+      <w:r>
+        <w:t>.</w:t>
       </w:r>
     </w:p>
     <w:p>
@@ -461,7 +490,7 @@
     </w:p>
     <w:p>
       <w:r>
-        <w:t xml:space="preserve">{{PAYMENT_SECTION}}</w:t>
+        <w:t>{{PAYMENT_SECTION}}</w:t>
       </w:r>
     </w:p>
     <w:p>
@@ -485,7 +514,7 @@
     </w:p>
     <w:p>
       <w:r>
-        <w:t xml:space="preserve">{{TERMS_SECTION}}</w:t>
+        <w:t>{{TERMS_SECTION}}</w:t>
       </w:r>
     </w:p>
     <w:p>
@@ -502,23 +531,111 @@
       </w:r>
     </w:p>
     <w:p>
+      <w:pPr>
+        <w:rPr>
+          <w:lang w:val="en-US"/>
+        </w:rPr>
+      </w:pPr>
       <w:r>
-        <w:t xml:space="preserve">{{CLAUSE_SECTION_obligations_supplier}}</w:t>
+        <w:rPr>
+          <w:lang w:val="en-US"/>
+        </w:rPr>
+        <w:t>{{</w:t>
+      </w:r>
+      <w:proofErr w:type="spellStart"/>
+      <w:r>
+        <w:rPr>
+          <w:lang w:val="en-US"/>
+        </w:rPr>
+        <w:t>CLAUSE_SECTION_obligations_supplier</w:t>
+      </w:r>
+      <w:proofErr w:type="spellEnd"/>
+      <w:r>
+        <w:rPr>
+          <w:lang w:val="en-US"/>
+        </w:rPr>
+        <w:t>}}</w:t>
       </w:r>
     </w:p>
     <w:p>
+      <w:pPr>
+        <w:rPr>
+          <w:lang w:val="en-US"/>
+        </w:rPr>
+      </w:pPr>
       <w:r>
-        <w:t xml:space="preserve">{{CLAUSE_SECTION_obligations_customer}}</w:t>
+        <w:rPr>
+          <w:lang w:val="en-US"/>
+        </w:rPr>
+        <w:t>{{</w:t>
+      </w:r>
+      <w:proofErr w:type="spellStart"/>
+      <w:r>
+        <w:rPr>
+          <w:lang w:val="en-US"/>
+        </w:rPr>
+        <w:t>CLAUSE_SECTION_obligations_customer</w:t>
+      </w:r>
+      <w:proofErr w:type="spellEnd"/>
+      <w:r>
+        <w:rPr>
+          <w:lang w:val="en-US"/>
+        </w:rPr>
+        <w:t>}}</w:t>
       </w:r>
     </w:p>
     <w:p>
+      <w:pPr>
+        <w:rPr>
+          <w:lang w:val="en-US"/>
+        </w:rPr>
+      </w:pPr>
       <w:r>
-        <w:t xml:space="preserve">{{CLAUSE_SECTION_special_conditions}}</w:t>
+        <w:rPr>
+          <w:lang w:val="en-US"/>
+        </w:rPr>
+        <w:t>{{</w:t>
+      </w:r>
+      <w:proofErr w:type="spellStart"/>
+      <w:r>
+        <w:rPr>
+          <w:lang w:val="en-US"/>
+        </w:rPr>
+        <w:t>CLAUSE_SECTION_special_conditions</w:t>
+      </w:r>
+      <w:proofErr w:type="spellEnd"/>
+      <w:r>
+        <w:rPr>
+          <w:lang w:val="en-US"/>
+        </w:rPr>
+        <w:t>}}</w:t>
       </w:r>
     </w:p>
     <w:p>
+      <w:pPr>
+        <w:rPr>
+          <w:lang w:val="en-US"/>
+        </w:rPr>
+      </w:pPr>
       <w:r>
-        <w:t xml:space="preserve">{{CLAUSE_SECTION_final}}</w:t>
+        <w:rPr>
+          <w:lang w:val="en-US"/>
+        </w:rPr>
+        <w:t>{{</w:t>
+      </w:r>
+      <w:proofErr w:type="spellStart"/>
+      <w:r>
+        <w:rPr>
+          <w:lang w:val="en-US"/>
+        </w:rPr>
+        <w:t>CLAUSE_SECTION_final</w:t>
+      </w:r>
+      <w:proofErr w:type="spellEnd"/>
+      <w:r>
+        <w:rPr>
+          <w:lang w:val="en-US"/>
+        </w:rPr>
+        <w:t>}}</w:t>
       </w:r>
     </w:p>
     <w:p>
@@ -526,12 +643,7 @@
         <w:pStyle w:val="af3"/>
         <w:keepNext/>
         <w:pageBreakBefore/>
-        <w:numPr>
-          <w:ilvl w:val="0"/>
-          <w:numId w:val="1"/>
-        </w:numPr>
-        <w:tabs>
-          <w:tab w:val="clear" w:pos="465"/>
+        <w:tabs>
           <w:tab w:val="left" w:pos="461"/>
         </w:tabs>
       </w:pPr>
@@ -540,7 +652,7 @@
           <w:bCs/>
         </w:rPr>
         <w:lastRenderedPageBreak/>
-        <w:t>Технические характеристики весов {{СПЕЦ_МОДЕЛЬ_КРАТКОЕ}}</w:t>
+        <w:t>{{ТТХ_НОМЕР}}. Технические характеристики весов {{СПЕЦ_МОДЕЛЬ_КРАТКОЕ}}</w:t>
       </w:r>
     </w:p>
     <w:p>
@@ -568,9 +680,9 @@
         <w:tblLook w:val="0000" w:firstRow="0" w:lastRow="0" w:firstColumn="0" w:lastColumn="0" w:noHBand="0" w:noVBand="0"/>
       </w:tblPr>
       <w:tblGrid>
-        <w:gridCol w:w="639"/>
-        <w:gridCol w:w="5912"/>
-        <w:gridCol w:w="3520"/>
+        <w:gridCol w:w="627"/>
+        <w:gridCol w:w="4507"/>
+        <w:gridCol w:w="4937"/>
       </w:tblGrid>
       <w:tr>
         <w:trPr>
@@ -951,16 +1063,26 @@
               <w:keepNext/>
             </w:pPr>
             <w:r>
-              <w:t>- от 0 до {{ТТХ_ГРАНИЦА_1}}т</w:t>
+              <w:t>- от 0 до {{ТТХ_ГРАНИЦА_1</w:t>
             </w:r>
+            <w:proofErr w:type="gramStart"/>
+            <w:r>
+              <w:t>}}т</w:t>
+            </w:r>
+            <w:proofErr w:type="gramEnd"/>
           </w:p>
           <w:p>
             <w:pPr>
               <w:keepNext/>
             </w:pPr>
             <w:r>
-              <w:t>- от {{ТТХ_ГРАНИЦА_1}} до {{ТТХ_ГРАНИЦА_2}}т</w:t>
+              <w:t>- от {{ТТХ_ГРАНИЦА_1}} до {{ТТХ_ГРАНИЦА_2</w:t>
             </w:r>
+            <w:proofErr w:type="gramStart"/>
+            <w:r>
+              <w:t>}}т</w:t>
+            </w:r>
+            <w:proofErr w:type="gramEnd"/>
           </w:p>
         </w:tc>
         <w:tc>
@@ -979,11 +1101,29 @@
               <w:keepNext/>
               <w:jc w:val="center"/>
             </w:pPr>
+          </w:p>
+          <w:p>
+            <w:pPr>
+              <w:keepNext/>
+              <w:jc w:val="center"/>
+            </w:pPr>
+          </w:p>
+          <w:p>
+            <w:pPr>
+              <w:keepNext/>
+              <w:jc w:val="center"/>
+            </w:pPr>
             <w:r>
               <w:t>{{ТТХ_ДИСКРЕТНОСТЬ_1}}</w:t>
             </w:r>
           </w:p>
           <w:p>
+            <w:r>
+              <w:rPr>
+                <w:lang w:val="en-US"/>
+              </w:rPr>
+              <w:t xml:space="preserve">             </w:t>
+            </w:r>
             <w:r>
               <w:t>{{ТТХ_ДИСКРЕТНОСТЬ_2}}</w:t>
             </w:r>
@@ -1395,10 +1535,6 @@
       <w:pPr>
         <w:pStyle w:val="af3"/>
         <w:keepNext/>
-        <w:numPr>
-          <w:ilvl w:val="0"/>
-          <w:numId w:val="1"/>
-        </w:numPr>
         <w:rPr>
           <w:bCs/>
         </w:rPr>
@@ -1407,7 +1543,7 @@
         <w:rPr>
           <w:bCs/>
         </w:rPr>
-        <w:t>Комплект поставки весов {{СПЕЦ_МОДЕЛЬ_КРАТКОЕ}} на единицу продукции</w:t>
+        <w:t>{{КОМПЛЕКТ_НОМЕР}}. Комплект поставки весов {{СПЕЦ_МОДЕЛЬ_КРАТКОЕ}} на единицу продукции</w:t>
       </w:r>
     </w:p>
     <w:p>
@@ -1520,7 +1656,6 @@
               <w:keepNext/>
               <w:jc w:val="center"/>
             </w:pPr>
-            <w:r/>
           </w:p>
         </w:tc>
         <w:tc>
@@ -1541,7 +1676,6 @@
               <w:keepNext/>
               <w:jc w:val="center"/>
             </w:pPr>
-            <w:r/>
           </w:p>
         </w:tc>
       </w:tr>
@@ -1801,7 +1935,6 @@
               <w:jc w:val="both"/>
             </w:pPr>
             <w:r>
-              <w:lastRenderedPageBreak/>
               <w:t xml:space="preserve">      </w:t>
             </w:r>
           </w:p>
@@ -1921,6 +2054,7 @@
         <w:br w:type="page"/>
       </w:r>
       <w:r>
+        <w:lastRenderedPageBreak/>
         <w:t>Приложение №{{ПРИЛОЖЕНИЕ_НОМЕР}} к Спецификации №{{СПЕЦ_НОМЕР}} от {{ДОГОВОР_ДАТА_ПОЛНАЯ}} г.</w:t>
       </w:r>
     </w:p>
@@ -1944,7 +2078,7 @@
     </w:p>
     <w:p>
       <w:r>
-        <w:t xml:space="preserve">{{APPENDIX_FOUNDATION_CHECK}}</w:t>
+        <w:t>{{APPENDIX_FOUNDATION_CHECK}}</w:t>
       </w:r>
     </w:p>
     <w:p>
@@ -2477,8 +2611,18 @@
         <w:sz w:val="20"/>
         <w:szCs w:val="20"/>
       </w:rPr>
-      <w:t>Договор № {{ДОГОВОР_НОМЕР}} от {{ДОГОВОР_ДАТА_ПОЛНАЯ}}г</w:t>
+      <w:t>Договор № {{ДОГОВОР_НОМЕР}} от {{ДОГОВОР_ДАТА_ПОЛНАЯ</w:t>
     </w:r>
+    <w:proofErr w:type="gramStart"/>
+    <w:r>
+      <w:rPr>
+        <w:i/>
+        <w:sz w:val="20"/>
+        <w:szCs w:val="20"/>
+      </w:rPr>
+      <w:t>}}г</w:t>
+    </w:r>
+    <w:proofErr w:type="gramEnd"/>
   </w:p>
   <w:p>
     <w:pPr>

</xml_diff>

<commit_message>
fix(contracts): close v2.1 template and compose updates
</commit_message>
<xml_diff>
--- a/templates/contracts/spec_v2.docx
+++ b/templates/contracts/spec_v2.docx
@@ -1,2061 +1,2061 @@
 
 <file path=word/document.xml><?xml version="1.0" encoding="utf-8"?>
-<w:document xmlns:wpc="http://schemas.microsoft.com/office/word/2010/wordprocessingCanvas" xmlns:cx="http://schemas.microsoft.com/office/drawing/2014/chartex" xmlns:cx1="http://schemas.microsoft.com/office/drawing/2015/9/8/chartex" xmlns:cx2="http://schemas.microsoft.com/office/drawing/2015/10/21/chartex" xmlns:cx3="http://schemas.microsoft.com/office/drawing/2016/5/9/chartex" xmlns:cx4="http://schemas.microsoft.com/office/drawing/2016/5/10/chartex" xmlns:cx5="http://schemas.microsoft.com/office/drawing/2016/5/11/chartex" xmlns:cx6="http://schemas.microsoft.com/office/drawing/2016/5/12/chartex" xmlns:cx7="http://schemas.microsoft.com/office/drawing/2016/5/13/chartex" xmlns:cx8="http://schemas.microsoft.com/office/drawing/2016/5/14/chartex" xmlns:mc="http://schemas.openxmlformats.org/markup-compatibility/2006" xmlns:aink="http://schemas.microsoft.com/office/drawing/2016/ink" xmlns:am3d="http://schemas.microsoft.com/office/drawing/2017/model3d" xmlns:o="urn:schemas-microsoft-com:office:office" xmlns:oel="http://schemas.microsoft.com/office/2019/extlst" xmlns:r="http://schemas.openxmlformats.org/officeDocument/2006/relationships" xmlns:m="http://schemas.openxmlformats.org/officeDocument/2006/math" xmlns:v="urn:schemas-microsoft-com:vml" xmlns:wp14="http://schemas.microsoft.com/office/word/2010/wordprocessingDrawing" xmlns:wp="http://schemas.openxmlformats.org/drawingml/2006/wordprocessingDrawing" xmlns:w10="urn:schemas-microsoft-com:office:word" xmlns:w="http://schemas.openxmlformats.org/wordprocessingml/2006/main" xmlns:w14="http://schemas.microsoft.com/office/word/2010/wordml" xmlns:w15="http://schemas.microsoft.com/office/word/2012/wordml" xmlns:w16cex="http://schemas.microsoft.com/office/word/2018/wordml/cex" xmlns:w16cid="http://schemas.microsoft.com/office/word/2016/wordml/cid" xmlns:w16="http://schemas.microsoft.com/office/word/2018/wordml" xmlns:w16du="http://schemas.microsoft.com/office/word/2023/wordml/word16du" xmlns:w16sdtdh="http://schemas.microsoft.com/office/word/2020/wordml/sdtdatahash" xmlns:w16sdtfl="http://schemas.microsoft.com/office/word/2024/wordml/sdtformatlock" xmlns:w16se="http://schemas.microsoft.com/office/word/2015/wordml/symex" xmlns:wpg="http://schemas.microsoft.com/office/word/2010/wordprocessingGroup" xmlns:wpi="http://schemas.microsoft.com/office/word/2010/wordprocessingInk" xmlns:wne="http://schemas.microsoft.com/office/word/2006/wordml" xmlns:wps="http://schemas.microsoft.com/office/word/2010/wordprocessingShape" mc:Ignorable="w14 w15 w16se w16cid w16 w16cex w16sdtdh w16sdtfl w16du wp14">
-  <w:body>
-    <w:p>
-      <w:pPr>
-        <w:jc w:val="center"/>
-        <w:rPr>
-          <w:b/>
-        </w:rPr>
-      </w:pPr>
-      <w:r>
-        <w:rPr>
-          <w:b/>
-        </w:rPr>
-        <w:t>Спецификация №{{СПЕЦ_НОМЕР}}</w:t>
-      </w:r>
-    </w:p>
-    <w:p>
-      <w:pPr>
-        <w:jc w:val="center"/>
-      </w:pPr>
-      <w:r>
-        <w:t>к Договору № {{ДОГОВОР_НОМЕР}} от {{ДОГОВОР_ДАТА_ПОЛНАЯ</w:t>
-      </w:r>
-      <w:proofErr w:type="gramStart"/>
-      <w:r>
-        <w:t>}}г.</w:t>
-      </w:r>
-      <w:proofErr w:type="gramEnd"/>
-    </w:p>
-    <w:p>
-      <w:pPr>
-        <w:jc w:val="center"/>
-      </w:pPr>
-      <w:r>
-        <w:t>на поставку весов автомобильных и выполнение сопутствующих работ</w:t>
-      </w:r>
-    </w:p>
-    <w:p>
-      <w:pPr>
-        <w:pStyle w:val="a7"/>
-        <w:jc w:val="right"/>
-        <w:rPr>
-          <w:b w:val="0"/>
-          <w:bCs w:val="0"/>
-          <w:sz w:val="24"/>
-        </w:rPr>
-      </w:pPr>
-    </w:p>
-    <w:p>
-      <w:pPr>
-        <w:pStyle w:val="a7"/>
-        <w:jc w:val="right"/>
-        <w:rPr>
-          <w:b w:val="0"/>
-          <w:bCs w:val="0"/>
-          <w:sz w:val="24"/>
-        </w:rPr>
-      </w:pPr>
-    </w:p>
-    <w:p>
-      <w:pPr>
-        <w:jc w:val="both"/>
-      </w:pPr>
-      <w:r>
-        <w:t xml:space="preserve">г. Воронеж                                                                                                                      </w:t>
-      </w:r>
-      <w:proofErr w:type="gramStart"/>
-      <w:r>
-        <w:t xml:space="preserve">   «</w:t>
-      </w:r>
-      <w:proofErr w:type="gramEnd"/>
-      <w:r>
-        <w:t>{{ДОГОВОР_ДЕНЬ}}» {{ДОГОВОР_МЕСЯЦ}} {{ДОГОВОР_ГОД}} г.</w:t>
-      </w:r>
-    </w:p>
-    <w:p>
-      <w:pPr>
-        <w:jc w:val="both"/>
-      </w:pPr>
-    </w:p>
-    <w:p>
-      <w:pPr>
-        <w:ind w:firstLine="708"/>
-        <w:jc w:val="both"/>
-      </w:pPr>
-      <w:r>
-        <w:rPr>
-          <w:b/>
-        </w:rPr>
-        <w:t>ООО «ТПК «</w:t>
-      </w:r>
-      <w:proofErr w:type="spellStart"/>
-      <w:r>
-        <w:rPr>
-          <w:b/>
-        </w:rPr>
-        <w:t>Тензосила</w:t>
-      </w:r>
-      <w:proofErr w:type="spellEnd"/>
-      <w:r>
-        <w:rPr>
-          <w:b/>
-        </w:rPr>
-        <w:t>»»</w:t>
-      </w:r>
-      <w:r>
-        <w:t xml:space="preserve">, именуемое в дальнейшем «Подрядчик», в лице директора Сенаторова Олега Александровича, действующего на основании Устава, с одной стороны и </w:t>
-      </w:r>
-      <w:r>
-        <w:rPr>
-          <w:b/>
-          <w:bCs/>
-        </w:rPr>
-        <w:t>{{ЗАКАЗЧИК_ПОЛНОЕ_НАИМЕНОВАНИЕ}}</w:t>
-      </w:r>
-      <w:r>
-        <w:rPr>
-          <w:b/>
-        </w:rPr>
-        <w:t>,</w:t>
-      </w:r>
-      <w:r>
-        <w:t xml:space="preserve"> именуемое в дальнейшем «Заказчик», в лице {{ЗАКАЗЧИК_ДИРЕКТОР_ДОЛЖНОСТЬ_РП}} {{ЗАКАЗЧИК_ДИРЕКТОР_ФИО_РП}}, {{ДИРЕКТОР_ПРИЧАСТИЕ}} на основании {{ЗАКАЗЧИК_ОСНОВАНИЕ}}, с другой стороны, именуемые совместно «Стороны», подписали настоящую Спецификацию:</w:t>
-      </w:r>
-    </w:p>
-    <w:p>
-      <w:pPr>
-        <w:jc w:val="both"/>
-      </w:pPr>
-    </w:p>
-    <w:p>
-      <w:pPr>
-        <w:jc w:val="both"/>
-      </w:pPr>
-      <w:r>
-        <w:t>1. Подрядчик обязуется поставить товар и выполнить сопутствующие работы согласно настоящей Спецификации:</w:t>
-      </w:r>
-      <w:bookmarkStart w:id="0" w:name="_Hlk108792741"/>
-    </w:p>
-    <w:bookmarkEnd w:id="0"/>
-    <w:p>
-      <w:pPr>
-        <w:jc w:val="both"/>
-      </w:pPr>
-    </w:p>
-    <w:tbl>
-      <w:tblPr>
-        <w:tblW w:w="9840" w:type="dxa"/>
-        <w:tblBorders>
-          <w:top w:val="single" w:sz="4" w:space="0" w:color="auto"/>
-          <w:left w:val="single" w:sz="4" w:space="0" w:color="auto"/>
-          <w:bottom w:val="single" w:sz="4" w:space="0" w:color="auto"/>
-          <w:right w:val="single" w:sz="4" w:space="0" w:color="auto"/>
-          <w:insideH w:val="single" w:sz="4" w:space="0" w:color="auto"/>
-          <w:insideV w:val="single" w:sz="4" w:space="0" w:color="auto"/>
-        </w:tblBorders>
-        <w:tblLook w:val="01E0" w:firstRow="1" w:lastRow="1" w:firstColumn="1" w:lastColumn="1" w:noHBand="0" w:noVBand="0"/>
-      </w:tblPr>
-      <w:tblGrid>
-        <w:gridCol w:w="7046"/>
-        <w:gridCol w:w="2794"/>
-      </w:tblGrid>
-      <w:tr>
-        <w:trPr>
-          <w:trHeight w:val="414"/>
-        </w:trPr>
-        <w:tc>
-          <w:tcPr>
-            <w:tcW w:w="7366" w:type="dxa"/>
-            <w:vAlign w:val="center"/>
-          </w:tcPr>
-          <w:p>
-            <w:pPr>
-              <w:ind w:left="360"/>
-              <w:jc w:val="center"/>
-              <w:rPr>
-                <w:b/>
-              </w:rPr>
-            </w:pPr>
-            <w:r>
-              <w:rPr>
-                <w:b/>
-              </w:rPr>
-              <w:t>Наименование</w:t>
-            </w:r>
-          </w:p>
-        </w:tc>
-        <w:tc>
-          <w:tcPr>
-            <w:tcW w:w="2474" w:type="dxa"/>
-            <w:vAlign w:val="center"/>
-          </w:tcPr>
-          <w:p>
-            <w:pPr>
-              <w:jc w:val="center"/>
-              <w:rPr>
-                <w:b/>
-              </w:rPr>
-            </w:pPr>
-            <w:r>
-              <w:rPr>
-                <w:b/>
-              </w:rPr>
-              <w:t>Стоимость с НДС, руб.</w:t>
-            </w:r>
-          </w:p>
-        </w:tc>
-      </w:tr>
-      <w:tr>
-        <w:trPr>
-          <w:trHeight w:val="705"/>
-        </w:trPr>
-        <w:tc>
-          <w:tcPr>
-            <w:tcW w:w="7366" w:type="dxa"/>
-            <w:vAlign w:val="center"/>
-          </w:tcPr>
-          <w:p>
-            <w:pPr>
-              <w:ind w:left="360"/>
-            </w:pPr>
-            <w:r>
-              <w:t>{{СПЕЦ_П1_НАИМЕНОВАНИЕ}}</w:t>
-            </w:r>
-          </w:p>
-        </w:tc>
-        <w:tc>
-          <w:tcPr>
-            <w:tcW w:w="2474" w:type="dxa"/>
-            <w:vAlign w:val="center"/>
-          </w:tcPr>
-          <w:p>
-            <w:pPr>
-              <w:jc w:val="center"/>
-              <w:rPr>
-                <w:bCs/>
-              </w:rPr>
-            </w:pPr>
-            <w:r>
-              <w:rPr>
-                <w:bCs/>
-              </w:rPr>
-              <w:t>{{СПЕЦ_П1_СУММА}}</w:t>
-            </w:r>
-          </w:p>
-        </w:tc>
-      </w:tr>
-      <w:tr>
-        <w:trPr>
-          <w:trHeight w:val="561"/>
-        </w:trPr>
-        <w:tc>
-          <w:tcPr>
-            <w:tcW w:w="7366" w:type="dxa"/>
-            <w:vAlign w:val="center"/>
-          </w:tcPr>
-          <w:p>
-            <w:pPr>
-              <w:ind w:left="357"/>
-            </w:pPr>
-          </w:p>
-          <w:p>
-            <w:pPr>
-              <w:ind w:left="357"/>
-            </w:pPr>
-            <w:r>
-              <w:t>{{СПЕЦ_П2_НАИМЕНОВАНИЕ}}</w:t>
-            </w:r>
-          </w:p>
-        </w:tc>
-        <w:tc>
-          <w:tcPr>
-            <w:tcW w:w="2474" w:type="dxa"/>
-            <w:vAlign w:val="center"/>
-          </w:tcPr>
-          <w:p>
-            <w:pPr>
-              <w:jc w:val="center"/>
-            </w:pPr>
-            <w:r>
-              <w:t>{{СПЕЦ_П2_СУММА}}</w:t>
-            </w:r>
-          </w:p>
-        </w:tc>
-      </w:tr>
-      <w:tr>
-        <w:trPr>
-          <w:trHeight w:val="561"/>
-        </w:trPr>
-        <w:tc>
-          <w:tcPr>
-            <w:tcW w:w="7366" w:type="dxa"/>
-            <w:vAlign w:val="center"/>
-          </w:tcPr>
-          <w:p>
-            <w:pPr>
-              <w:ind w:left="330"/>
-            </w:pPr>
-            <w:r>
-              <w:t>{{СПЕЦ_П3_НАИМЕНОВАНИЕ}}</w:t>
-            </w:r>
-          </w:p>
-        </w:tc>
-        <w:tc>
-          <w:tcPr>
-            <w:tcW w:w="2474" w:type="dxa"/>
-            <w:vAlign w:val="center"/>
-          </w:tcPr>
-          <w:p>
-            <w:pPr>
-              <w:jc w:val="center"/>
-            </w:pPr>
-            <w:r>
-              <w:t>{{СПЕЦ_П3_СУММА}}</w:t>
-            </w:r>
-          </w:p>
-        </w:tc>
-      </w:tr>
-      <w:tr>
-        <w:trPr>
-          <w:trHeight w:val="414"/>
-        </w:trPr>
-        <w:tc>
-          <w:tcPr>
-            <w:tcW w:w="7366" w:type="dxa"/>
-            <w:vAlign w:val="center"/>
-          </w:tcPr>
-          <w:p>
-            <w:pPr>
-              <w:ind w:left="360"/>
-            </w:pPr>
-            <w:r>
-              <w:t>{{СПЕЦ_П4_НАИМЕНОВАНИЕ}}</w:t>
-            </w:r>
-          </w:p>
-        </w:tc>
-        <w:tc>
-          <w:tcPr>
-            <w:tcW w:w="2474" w:type="dxa"/>
-            <w:vAlign w:val="center"/>
-          </w:tcPr>
-          <w:p>
-            <w:pPr>
-              <w:jc w:val="center"/>
-            </w:pPr>
-            <w:r>
-              <w:t>{{СПЕЦ_П4_СУММА}}</w:t>
-            </w:r>
-          </w:p>
-        </w:tc>
-      </w:tr>
-      <w:tr>
-        <w:trPr>
-          <w:trHeight w:val="575"/>
-        </w:trPr>
-        <w:tc>
-          <w:tcPr>
-            <w:tcW w:w="7366" w:type="dxa"/>
-            <w:vAlign w:val="center"/>
-          </w:tcPr>
-          <w:p>
-            <w:pPr>
-              <w:spacing w:line="288" w:lineRule="auto"/>
-            </w:pPr>
-            <w:r>
-              <w:rPr>
-                <w:b/>
-              </w:rPr>
-              <w:t xml:space="preserve">      </w:t>
-            </w:r>
-            <w:r>
-              <w:t>{{СПЕЦ_П5_НАИМЕНОВАНИЕ}}</w:t>
-            </w:r>
-          </w:p>
-        </w:tc>
-        <w:tc>
-          <w:tcPr>
-            <w:tcW w:w="2474" w:type="dxa"/>
-            <w:vAlign w:val="center"/>
-          </w:tcPr>
-          <w:p>
-            <w:pPr>
-              <w:jc w:val="center"/>
-            </w:pPr>
-            <w:r>
-              <w:t>{{СПЕЦ_П5_СУММА}}</w:t>
-            </w:r>
-          </w:p>
-        </w:tc>
-      </w:tr>
-      <w:tr>
-        <w:trPr>
-          <w:trHeight w:val="421"/>
-        </w:trPr>
-        <w:tc>
-          <w:tcPr>
-            <w:tcW w:w="7366" w:type="dxa"/>
-            <w:vAlign w:val="center"/>
-          </w:tcPr>
-          <w:p>
-            <w:pPr>
-              <w:ind w:left="360"/>
-              <w:rPr>
-                <w:b/>
-              </w:rPr>
-            </w:pPr>
-            <w:r>
-              <w:rPr>
-                <w:b/>
-              </w:rPr>
-              <w:t>ИТОГО с НДС, руб.</w:t>
-            </w:r>
-          </w:p>
-        </w:tc>
-        <w:tc>
-          <w:tcPr>
-            <w:tcW w:w="2474" w:type="dxa"/>
-            <w:vAlign w:val="center"/>
-          </w:tcPr>
-          <w:p>
-            <w:pPr>
-              <w:jc w:val="center"/>
-              <w:rPr>
-                <w:b/>
-              </w:rPr>
-            </w:pPr>
-            <w:r>
-              <w:rPr>
-                <w:b/>
-              </w:rPr>
-              <w:t>{{СПЕЦ_ИТОГО}}</w:t>
-            </w:r>
-          </w:p>
-        </w:tc>
-      </w:tr>
-    </w:tbl>
-    <w:p>
-      <w:pPr>
-        <w:tabs>
-          <w:tab w:val="left" w:pos="461"/>
-        </w:tabs>
-      </w:pPr>
-    </w:p>
-    <w:p>
-      <w:pPr>
-        <w:pStyle w:val="af3"/>
-        <w:ind w:left="0"/>
-        <w:jc w:val="both"/>
-      </w:pPr>
-      <w:r>
-        <w:t xml:space="preserve">Итого по спецификации: {{СПЕЦ_ИТОГО}} ({{СПЕЦ_ИТОГО_ПРОПИСЬ}}) рублей, в </w:t>
-      </w:r>
-      <w:proofErr w:type="gramStart"/>
-      <w:r>
-        <w:t>т.ч.</w:t>
-      </w:r>
-      <w:proofErr w:type="gramEnd"/>
-      <w:r>
-        <w:t xml:space="preserve"> НДС {{СПЕЦ_НДС</w:t>
-      </w:r>
-      <w:proofErr w:type="gramStart"/>
-      <w:r>
-        <w:t>}}%</w:t>
-      </w:r>
-      <w:proofErr w:type="gramEnd"/>
-      <w:r>
-        <w:t>.</w:t>
-      </w:r>
-    </w:p>
-    <w:p>
-      <w:pPr>
-        <w:pStyle w:val="af3"/>
-        <w:ind w:left="0"/>
-        <w:jc w:val="both"/>
-      </w:pPr>
-    </w:p>
-    <w:p>
-      <w:pPr>
-        <w:pStyle w:val="af3"/>
-        <w:numPr>
-          <w:ilvl w:val="0"/>
-          <w:numId w:val="1"/>
-        </w:numPr>
-      </w:pPr>
-      <w:r>
-        <w:t xml:space="preserve">Порядок оплаты: </w:t>
-      </w:r>
-    </w:p>
-    <w:p>
-      <w:r>
-        <w:t>{{PAYMENT_SECTION}}</w:t>
-      </w:r>
-    </w:p>
-    <w:p>
-      <w:pPr>
-        <w:pStyle w:val="af3"/>
-        <w:ind w:left="0"/>
-      </w:pPr>
-    </w:p>
-    <w:p>
-      <w:pPr>
-        <w:pStyle w:val="af3"/>
-        <w:numPr>
-          <w:ilvl w:val="0"/>
-          <w:numId w:val="1"/>
-        </w:numPr>
-        <w:jc w:val="both"/>
-      </w:pPr>
-      <w:r>
-        <w:t>Срок поставки Весов и выполнения Работ:</w:t>
-      </w:r>
-    </w:p>
-    <w:p>
-      <w:r>
-        <w:t>{{TERMS_SECTION}}</w:t>
-      </w:r>
-    </w:p>
-    <w:p>
-      <w:pPr>
-        <w:tabs>
-          <w:tab w:val="left" w:pos="461"/>
-        </w:tabs>
-        <w:ind w:right="-142"/>
-        <w:contextualSpacing/>
-        <w:jc w:val="both"/>
-      </w:pPr>
-      <w:r>
-        <w:t>Выезд строительной и монтажной бригад на Объект работ осуществляется при соблюдении вышеперечисленных условий и получения Подрядчиком письменного уведомления от Заказчика о готовности принять на площадку монтажа специалистов Подрядчика.</w:t>
-      </w:r>
-    </w:p>
-    <w:p>
-      <w:pPr>
-        <w:rPr>
-          <w:lang w:val="en-US"/>
-        </w:rPr>
-      </w:pPr>
-      <w:r>
-        <w:rPr>
-          <w:lang w:val="en-US"/>
-        </w:rPr>
-        <w:t>{{</w:t>
-      </w:r>
-      <w:proofErr w:type="spellStart"/>
-      <w:r>
-        <w:rPr>
-          <w:lang w:val="en-US"/>
-        </w:rPr>
-        <w:t>CLAUSE_SECTION_obligations_supplier</w:t>
-      </w:r>
-      <w:proofErr w:type="spellEnd"/>
-      <w:r>
-        <w:rPr>
-          <w:lang w:val="en-US"/>
-        </w:rPr>
-        <w:t>}}</w:t>
-      </w:r>
-    </w:p>
-    <w:p>
-      <w:pPr>
-        <w:rPr>
-          <w:lang w:val="en-US"/>
-        </w:rPr>
-      </w:pPr>
-      <w:r>
-        <w:rPr>
-          <w:lang w:val="en-US"/>
-        </w:rPr>
-        <w:t>{{</w:t>
-      </w:r>
-      <w:proofErr w:type="spellStart"/>
-      <w:r>
-        <w:rPr>
-          <w:lang w:val="en-US"/>
-        </w:rPr>
-        <w:t>CLAUSE_SECTION_obligations_customer</w:t>
-      </w:r>
-      <w:proofErr w:type="spellEnd"/>
-      <w:r>
-        <w:rPr>
-          <w:lang w:val="en-US"/>
-        </w:rPr>
-        <w:t>}}</w:t>
-      </w:r>
-    </w:p>
-    <w:p>
-      <w:pPr>
-        <w:rPr>
-          <w:lang w:val="en-US"/>
-        </w:rPr>
-      </w:pPr>
-      <w:r>
-        <w:rPr>
-          <w:lang w:val="en-US"/>
-        </w:rPr>
-        <w:t>{{</w:t>
-      </w:r>
-      <w:proofErr w:type="spellStart"/>
-      <w:r>
-        <w:rPr>
-          <w:lang w:val="en-US"/>
-        </w:rPr>
-        <w:t>CLAUSE_SECTION_special_conditions</w:t>
-      </w:r>
-      <w:proofErr w:type="spellEnd"/>
-      <w:r>
-        <w:rPr>
-          <w:lang w:val="en-US"/>
-        </w:rPr>
-        <w:t>}}</w:t>
-      </w:r>
-    </w:p>
-    <w:p>
-      <w:pPr>
-        <w:rPr>
-          <w:lang w:val="en-US"/>
-        </w:rPr>
-      </w:pPr>
-      <w:r>
-        <w:rPr>
-          <w:lang w:val="en-US"/>
-        </w:rPr>
-        <w:t>{{</w:t>
-      </w:r>
-      <w:proofErr w:type="spellStart"/>
-      <w:r>
-        <w:rPr>
-          <w:lang w:val="en-US"/>
-        </w:rPr>
-        <w:t>CLAUSE_SECTION_final</w:t>
-      </w:r>
-      <w:proofErr w:type="spellEnd"/>
-      <w:r>
-        <w:rPr>
-          <w:lang w:val="en-US"/>
-        </w:rPr>
-        <w:t>}}</w:t>
-      </w:r>
-    </w:p>
-    <w:p>
-      <w:pPr>
-        <w:pStyle w:val="af3"/>
-        <w:keepNext/>
-        <w:pageBreakBefore/>
-        <w:tabs>
-          <w:tab w:val="left" w:pos="461"/>
-        </w:tabs>
-      </w:pPr>
-      <w:r>
-        <w:rPr>
-          <w:bCs/>
-        </w:rPr>
-        <w:lastRenderedPageBreak/>
-        <w:t>{{ТТХ_НОМЕР}}. Технические характеристики весов {{СПЕЦ_МОДЕЛЬ_КРАТКОЕ}}</w:t>
-      </w:r>
-    </w:p>
-    <w:p>
-      <w:pPr>
-        <w:pStyle w:val="ab"/>
-        <w:keepNext/>
-        <w:spacing w:after="0"/>
-        <w:jc w:val="center"/>
-        <w:rPr>
-          <w:b/>
-        </w:rPr>
-      </w:pPr>
-    </w:p>
-    <w:tbl>
-      <w:tblPr>
-        <w:tblW w:w="10071" w:type="dxa"/>
-        <w:tblBorders>
-          <w:top w:val="single" w:sz="4" w:space="0" w:color="auto"/>
-          <w:left w:val="single" w:sz="4" w:space="0" w:color="auto"/>
-          <w:bottom w:val="single" w:sz="4" w:space="0" w:color="auto"/>
-          <w:right w:val="single" w:sz="4" w:space="0" w:color="auto"/>
-          <w:insideH w:val="single" w:sz="4" w:space="0" w:color="auto"/>
-          <w:insideV w:val="single" w:sz="4" w:space="0" w:color="auto"/>
-        </w:tblBorders>
-        <w:tblLook w:val="0000" w:firstRow="0" w:lastRow="0" w:firstColumn="0" w:lastColumn="0" w:noHBand="0" w:noVBand="0"/>
-      </w:tblPr>
-      <w:tblGrid>
-        <w:gridCol w:w="627"/>
-        <w:gridCol w:w="4507"/>
-        <w:gridCol w:w="4937"/>
-      </w:tblGrid>
-      <w:tr>
-        <w:trPr>
-          <w:cantSplit/>
-          <w:trHeight w:val="591"/>
-        </w:trPr>
-        <w:tc>
-          <w:tcPr>
-            <w:tcW w:w="647" w:type="dxa"/>
-            <w:tcBorders>
-              <w:top w:val="single" w:sz="4" w:space="0" w:color="auto"/>
-              <w:left w:val="single" w:sz="4" w:space="0" w:color="auto"/>
-              <w:bottom w:val="single" w:sz="4" w:space="0" w:color="auto"/>
-              <w:right w:val="single" w:sz="4" w:space="0" w:color="auto"/>
-            </w:tcBorders>
-            <w:vAlign w:val="center"/>
-          </w:tcPr>
-          <w:p>
-            <w:pPr>
-              <w:keepNext/>
-              <w:jc w:val="center"/>
-              <w:rPr>
-                <w:b/>
-              </w:rPr>
-            </w:pPr>
-            <w:r>
-              <w:rPr>
-                <w:b/>
-              </w:rPr>
-              <w:t xml:space="preserve">№ </w:t>
-            </w:r>
-            <w:proofErr w:type="spellStart"/>
-            <w:r>
-              <w:rPr>
-                <w:b/>
-              </w:rPr>
-              <w:t>п.п</w:t>
-            </w:r>
-            <w:proofErr w:type="spellEnd"/>
-            <w:r>
-              <w:rPr>
-                <w:b/>
-              </w:rPr>
-              <w:t>.</w:t>
-            </w:r>
-          </w:p>
-        </w:tc>
-        <w:tc>
-          <w:tcPr>
-            <w:tcW w:w="7021" w:type="dxa"/>
-            <w:tcBorders>
-              <w:top w:val="single" w:sz="4" w:space="0" w:color="auto"/>
-              <w:left w:val="single" w:sz="4" w:space="0" w:color="auto"/>
-              <w:bottom w:val="single" w:sz="4" w:space="0" w:color="auto"/>
-              <w:right w:val="single" w:sz="4" w:space="0" w:color="auto"/>
-            </w:tcBorders>
-            <w:vAlign w:val="center"/>
-          </w:tcPr>
-          <w:p>
-            <w:pPr>
-              <w:keepNext/>
-              <w:jc w:val="center"/>
-              <w:rPr>
-                <w:b/>
-              </w:rPr>
-            </w:pPr>
-            <w:r>
-              <w:rPr>
-                <w:b/>
-              </w:rPr>
-              <w:t>НАИМЕНОВАНИЕ ПОКАЗАТЕЛЯ</w:t>
-            </w:r>
-          </w:p>
-        </w:tc>
-        <w:tc>
-          <w:tcPr>
-            <w:tcW w:w="2403" w:type="dxa"/>
-            <w:tcBorders>
-              <w:top w:val="single" w:sz="4" w:space="0" w:color="auto"/>
-              <w:left w:val="single" w:sz="4" w:space="0" w:color="auto"/>
-              <w:bottom w:val="single" w:sz="4" w:space="0" w:color="auto"/>
-              <w:right w:val="single" w:sz="4" w:space="0" w:color="auto"/>
-            </w:tcBorders>
-            <w:vAlign w:val="center"/>
-          </w:tcPr>
-          <w:p>
-            <w:pPr>
-              <w:pStyle w:val="20"/>
-              <w:tabs>
-                <w:tab w:val="left" w:pos="708"/>
-              </w:tabs>
-              <w:spacing w:before="0" w:after="0"/>
-              <w:jc w:val="center"/>
-              <w:rPr>
-                <w:rFonts w:ascii="Times New Roman" w:hAnsi="Times New Roman" w:cs="Times New Roman"/>
-                <w:i w:val="0"/>
-                <w:sz w:val="24"/>
-                <w:szCs w:val="24"/>
-              </w:rPr>
-            </w:pPr>
-            <w:r>
-              <w:rPr>
-                <w:rFonts w:ascii="Times New Roman" w:hAnsi="Times New Roman" w:cs="Times New Roman"/>
-                <w:i w:val="0"/>
-                <w:sz w:val="24"/>
-                <w:szCs w:val="24"/>
-              </w:rPr>
-              <w:t>ЗНАЧЕНИЕ ПОКАЗАТЕЛЯ</w:t>
-            </w:r>
-          </w:p>
-        </w:tc>
-      </w:tr>
-      <w:tr>
-        <w:trPr>
-          <w:cantSplit/>
-          <w:trHeight w:val="336"/>
-        </w:trPr>
-        <w:tc>
-          <w:tcPr>
-            <w:tcW w:w="647" w:type="dxa"/>
-            <w:tcBorders>
-              <w:top w:val="single" w:sz="4" w:space="0" w:color="auto"/>
-              <w:left w:val="single" w:sz="4" w:space="0" w:color="auto"/>
-              <w:bottom w:val="single" w:sz="4" w:space="0" w:color="auto"/>
-              <w:right w:val="single" w:sz="4" w:space="0" w:color="auto"/>
-            </w:tcBorders>
-            <w:vAlign w:val="center"/>
-          </w:tcPr>
-          <w:p>
-            <w:pPr>
-              <w:keepNext/>
-              <w:jc w:val="center"/>
-            </w:pPr>
-            <w:r>
-              <w:t>1.</w:t>
-            </w:r>
-          </w:p>
-        </w:tc>
-        <w:tc>
-          <w:tcPr>
-            <w:tcW w:w="7021" w:type="dxa"/>
-            <w:tcBorders>
-              <w:top w:val="single" w:sz="4" w:space="0" w:color="auto"/>
-              <w:left w:val="single" w:sz="4" w:space="0" w:color="auto"/>
-              <w:bottom w:val="single" w:sz="4" w:space="0" w:color="auto"/>
-              <w:right w:val="single" w:sz="4" w:space="0" w:color="auto"/>
-            </w:tcBorders>
-          </w:tcPr>
-          <w:p>
-            <w:pPr>
-              <w:pStyle w:val="20"/>
-              <w:tabs>
-                <w:tab w:val="left" w:pos="708"/>
-              </w:tabs>
-              <w:spacing w:before="0" w:after="0"/>
-              <w:rPr>
-                <w:rFonts w:ascii="Times New Roman" w:hAnsi="Times New Roman" w:cs="Times New Roman"/>
-                <w:b w:val="0"/>
-                <w:i w:val="0"/>
-                <w:sz w:val="24"/>
-                <w:szCs w:val="24"/>
-              </w:rPr>
-            </w:pPr>
-            <w:r>
-              <w:rPr>
-                <w:rFonts w:ascii="Times New Roman" w:hAnsi="Times New Roman" w:cs="Times New Roman"/>
-                <w:b w:val="0"/>
-                <w:i w:val="0"/>
-                <w:sz w:val="24"/>
-                <w:szCs w:val="24"/>
-              </w:rPr>
-              <w:t>Максимальная нагрузка, т</w:t>
-            </w:r>
-          </w:p>
-        </w:tc>
-        <w:tc>
-          <w:tcPr>
-            <w:tcW w:w="2403" w:type="dxa"/>
-            <w:tcBorders>
-              <w:top w:val="single" w:sz="4" w:space="0" w:color="auto"/>
-              <w:left w:val="single" w:sz="4" w:space="0" w:color="auto"/>
-              <w:bottom w:val="single" w:sz="4" w:space="0" w:color="auto"/>
-              <w:right w:val="single" w:sz="4" w:space="0" w:color="auto"/>
-            </w:tcBorders>
-            <w:vAlign w:val="center"/>
-          </w:tcPr>
-          <w:p>
-            <w:pPr>
-              <w:keepNext/>
-              <w:jc w:val="center"/>
-              <w:rPr>
-                <w:lang w:val="en-US"/>
-              </w:rPr>
-            </w:pPr>
-            <w:r>
-              <w:t>{{СПЕЦ_МАКС_НАГРУЗКА}}</w:t>
-            </w:r>
-          </w:p>
-        </w:tc>
-      </w:tr>
-      <w:tr>
-        <w:trPr>
-          <w:cantSplit/>
-        </w:trPr>
-        <w:tc>
-          <w:tcPr>
-            <w:tcW w:w="647" w:type="dxa"/>
-            <w:tcBorders>
-              <w:top w:val="single" w:sz="4" w:space="0" w:color="auto"/>
-              <w:left w:val="single" w:sz="4" w:space="0" w:color="auto"/>
-              <w:bottom w:val="single" w:sz="4" w:space="0" w:color="auto"/>
-              <w:right w:val="single" w:sz="4" w:space="0" w:color="auto"/>
-            </w:tcBorders>
-            <w:vAlign w:val="center"/>
-          </w:tcPr>
-          <w:p>
-            <w:pPr>
-              <w:keepNext/>
-              <w:jc w:val="center"/>
-            </w:pPr>
-            <w:r>
-              <w:t>2.</w:t>
-            </w:r>
-          </w:p>
-        </w:tc>
-        <w:tc>
-          <w:tcPr>
-            <w:tcW w:w="7021" w:type="dxa"/>
-            <w:tcBorders>
-              <w:top w:val="single" w:sz="4" w:space="0" w:color="auto"/>
-              <w:left w:val="single" w:sz="4" w:space="0" w:color="auto"/>
-              <w:bottom w:val="single" w:sz="4" w:space="0" w:color="auto"/>
-              <w:right w:val="single" w:sz="4" w:space="0" w:color="auto"/>
-            </w:tcBorders>
-          </w:tcPr>
-          <w:p>
-            <w:pPr>
-              <w:keepNext/>
-            </w:pPr>
-            <w:r>
-              <w:t>Наибольшая нагрузка на ось, т</w:t>
-            </w:r>
-          </w:p>
-        </w:tc>
-        <w:tc>
-          <w:tcPr>
-            <w:tcW w:w="2403" w:type="dxa"/>
-            <w:tcBorders>
-              <w:top w:val="single" w:sz="4" w:space="0" w:color="auto"/>
-              <w:left w:val="single" w:sz="4" w:space="0" w:color="auto"/>
-              <w:bottom w:val="single" w:sz="4" w:space="0" w:color="auto"/>
-              <w:right w:val="single" w:sz="4" w:space="0" w:color="auto"/>
-            </w:tcBorders>
-            <w:vAlign w:val="center"/>
-          </w:tcPr>
-          <w:p>
-            <w:pPr>
-              <w:keepNext/>
-              <w:jc w:val="center"/>
-            </w:pPr>
-            <w:r>
-              <w:t>{{ТТХ_НАГРУЗКА_НА_ОСЬ}}</w:t>
-            </w:r>
-          </w:p>
-        </w:tc>
-      </w:tr>
-      <w:tr>
-        <w:trPr>
-          <w:cantSplit/>
-        </w:trPr>
-        <w:tc>
-          <w:tcPr>
-            <w:tcW w:w="647" w:type="dxa"/>
-            <w:tcBorders>
-              <w:top w:val="single" w:sz="4" w:space="0" w:color="auto"/>
-              <w:left w:val="single" w:sz="4" w:space="0" w:color="auto"/>
-              <w:bottom w:val="single" w:sz="4" w:space="0" w:color="auto"/>
-              <w:right w:val="single" w:sz="4" w:space="0" w:color="auto"/>
-            </w:tcBorders>
-            <w:vAlign w:val="center"/>
-          </w:tcPr>
-          <w:p>
-            <w:pPr>
-              <w:keepNext/>
-              <w:jc w:val="center"/>
-            </w:pPr>
-            <w:r>
-              <w:t>3.</w:t>
-            </w:r>
-          </w:p>
-        </w:tc>
-        <w:tc>
-          <w:tcPr>
-            <w:tcW w:w="7021" w:type="dxa"/>
-            <w:tcBorders>
-              <w:top w:val="single" w:sz="4" w:space="0" w:color="auto"/>
-              <w:left w:val="single" w:sz="4" w:space="0" w:color="auto"/>
-              <w:bottom w:val="single" w:sz="4" w:space="0" w:color="auto"/>
-              <w:right w:val="single" w:sz="4" w:space="0" w:color="auto"/>
-            </w:tcBorders>
-          </w:tcPr>
-          <w:p>
-            <w:pPr>
-              <w:keepNext/>
-            </w:pPr>
-            <w:r>
-              <w:t>Расстояние от платформы весов до весового терминала, м</w:t>
-            </w:r>
-          </w:p>
-        </w:tc>
-        <w:tc>
-          <w:tcPr>
-            <w:tcW w:w="2403" w:type="dxa"/>
-            <w:tcBorders>
-              <w:top w:val="single" w:sz="4" w:space="0" w:color="auto"/>
-              <w:left w:val="single" w:sz="4" w:space="0" w:color="auto"/>
-              <w:bottom w:val="single" w:sz="4" w:space="0" w:color="auto"/>
-              <w:right w:val="single" w:sz="4" w:space="0" w:color="auto"/>
-            </w:tcBorders>
-            <w:vAlign w:val="center"/>
-          </w:tcPr>
-          <w:p>
-            <w:pPr>
-              <w:keepNext/>
-              <w:jc w:val="center"/>
-            </w:pPr>
-            <w:r>
-              <w:t>{{ТТХ_РАССТОЯНИЕ_ДО_ТЕРМИНАЛА}}</w:t>
-            </w:r>
-          </w:p>
-        </w:tc>
-      </w:tr>
-      <w:tr>
-        <w:trPr>
-          <w:cantSplit/>
-        </w:trPr>
-        <w:tc>
-          <w:tcPr>
-            <w:tcW w:w="647" w:type="dxa"/>
-            <w:tcBorders>
-              <w:top w:val="single" w:sz="4" w:space="0" w:color="auto"/>
-              <w:left w:val="single" w:sz="4" w:space="0" w:color="auto"/>
-              <w:bottom w:val="single" w:sz="4" w:space="0" w:color="auto"/>
-              <w:right w:val="single" w:sz="4" w:space="0" w:color="auto"/>
-            </w:tcBorders>
-            <w:vAlign w:val="center"/>
-          </w:tcPr>
-          <w:p>
-            <w:pPr>
-              <w:keepNext/>
-              <w:jc w:val="center"/>
-            </w:pPr>
-            <w:r>
-              <w:t>4.</w:t>
-            </w:r>
-          </w:p>
-        </w:tc>
-        <w:tc>
-          <w:tcPr>
-            <w:tcW w:w="7021" w:type="dxa"/>
-            <w:tcBorders>
-              <w:top w:val="single" w:sz="4" w:space="0" w:color="auto"/>
-              <w:left w:val="single" w:sz="4" w:space="0" w:color="auto"/>
-              <w:bottom w:val="single" w:sz="4" w:space="0" w:color="auto"/>
-              <w:right w:val="single" w:sz="4" w:space="0" w:color="auto"/>
-            </w:tcBorders>
-          </w:tcPr>
-          <w:p>
-            <w:pPr>
-              <w:keepNext/>
-            </w:pPr>
-            <w:r>
-              <w:t>Требуемая дискретность отсчета или цена поверочного деления при эксплуатации, кг:</w:t>
-            </w:r>
-          </w:p>
-          <w:p>
-            <w:pPr>
-              <w:keepNext/>
-            </w:pPr>
-            <w:r>
-              <w:t>- от 0 до {{ТТХ_ГРАНИЦА_1</w:t>
-            </w:r>
-            <w:proofErr w:type="gramStart"/>
-            <w:r>
-              <w:t>}}т</w:t>
-            </w:r>
-            <w:proofErr w:type="gramEnd"/>
-          </w:p>
-          <w:p>
-            <w:pPr>
-              <w:keepNext/>
-            </w:pPr>
-            <w:r>
-              <w:t>- от {{ТТХ_ГРАНИЦА_1}} до {{ТТХ_ГРАНИЦА_2</w:t>
-            </w:r>
-            <w:proofErr w:type="gramStart"/>
-            <w:r>
-              <w:t>}}т</w:t>
-            </w:r>
-            <w:proofErr w:type="gramEnd"/>
-          </w:p>
-        </w:tc>
-        <w:tc>
-          <w:tcPr>
-            <w:tcW w:w="2403" w:type="dxa"/>
-            <w:tcBorders>
-              <w:top w:val="single" w:sz="4" w:space="0" w:color="auto"/>
-              <w:left w:val="single" w:sz="4" w:space="0" w:color="auto"/>
-              <w:bottom w:val="single" w:sz="4" w:space="0" w:color="auto"/>
-              <w:right w:val="single" w:sz="4" w:space="0" w:color="auto"/>
-            </w:tcBorders>
-            <w:vAlign w:val="center"/>
-          </w:tcPr>
-          <w:p>
-            <w:pPr>
-              <w:keepNext/>
-              <w:jc w:val="center"/>
-            </w:pPr>
-          </w:p>
-          <w:p>
-            <w:pPr>
-              <w:keepNext/>
-              <w:jc w:val="center"/>
-            </w:pPr>
-          </w:p>
-          <w:p>
-            <w:pPr>
-              <w:keepNext/>
-              <w:jc w:val="center"/>
-            </w:pPr>
-            <w:r>
-              <w:t>{{ТТХ_ДИСКРЕТНОСТЬ_1}}</w:t>
-            </w:r>
-          </w:p>
-          <w:p>
-            <w:r>
-              <w:rPr>
-                <w:lang w:val="en-US"/>
-              </w:rPr>
-              <w:t xml:space="preserve">             </w:t>
-            </w:r>
-            <w:r>
-              <w:t>{{ТТХ_ДИСКРЕТНОСТЬ_2}}</w:t>
-            </w:r>
-          </w:p>
-        </w:tc>
-      </w:tr>
-      <w:tr>
-        <w:trPr>
-          <w:cantSplit/>
-        </w:trPr>
-        <w:tc>
-          <w:tcPr>
-            <w:tcW w:w="647" w:type="dxa"/>
-            <w:tcBorders>
-              <w:top w:val="single" w:sz="4" w:space="0" w:color="auto"/>
-              <w:left w:val="single" w:sz="4" w:space="0" w:color="auto"/>
-              <w:bottom w:val="single" w:sz="4" w:space="0" w:color="auto"/>
-              <w:right w:val="single" w:sz="4" w:space="0" w:color="auto"/>
-            </w:tcBorders>
-            <w:vAlign w:val="center"/>
-          </w:tcPr>
-          <w:p>
-            <w:pPr>
-              <w:keepNext/>
-              <w:jc w:val="center"/>
-            </w:pPr>
-            <w:r>
-              <w:t>5.</w:t>
-            </w:r>
-          </w:p>
-        </w:tc>
-        <w:tc>
-          <w:tcPr>
-            <w:tcW w:w="7021" w:type="dxa"/>
-            <w:tcBorders>
-              <w:top w:val="single" w:sz="4" w:space="0" w:color="auto"/>
-              <w:left w:val="single" w:sz="4" w:space="0" w:color="auto"/>
-              <w:bottom w:val="single" w:sz="4" w:space="0" w:color="auto"/>
-              <w:right w:val="single" w:sz="4" w:space="0" w:color="auto"/>
-            </w:tcBorders>
-            <w:vAlign w:val="center"/>
-          </w:tcPr>
-          <w:p>
-            <w:pPr>
-              <w:keepNext/>
-            </w:pPr>
-            <w:r>
-              <w:t xml:space="preserve">Габаритные размеры грузоприемной платформы, м </w:t>
-            </w:r>
-          </w:p>
-        </w:tc>
-        <w:tc>
-          <w:tcPr>
-            <w:tcW w:w="2403" w:type="dxa"/>
-            <w:tcBorders>
-              <w:top w:val="single" w:sz="4" w:space="0" w:color="auto"/>
-              <w:left w:val="single" w:sz="4" w:space="0" w:color="auto"/>
-              <w:bottom w:val="single" w:sz="4" w:space="0" w:color="auto"/>
-              <w:right w:val="single" w:sz="4" w:space="0" w:color="auto"/>
-            </w:tcBorders>
-            <w:vAlign w:val="center"/>
-          </w:tcPr>
-          <w:p>
-            <w:pPr>
-              <w:keepNext/>
-              <w:jc w:val="center"/>
-            </w:pPr>
-            <w:r>
-              <w:t>{{ТТХ_ГАБАРИТЫ}}</w:t>
-            </w:r>
-          </w:p>
-        </w:tc>
-      </w:tr>
-      <w:tr>
-        <w:trPr>
-          <w:cantSplit/>
-        </w:trPr>
-        <w:tc>
-          <w:tcPr>
-            <w:tcW w:w="647" w:type="dxa"/>
-            <w:tcBorders>
-              <w:top w:val="single" w:sz="4" w:space="0" w:color="auto"/>
-              <w:left w:val="single" w:sz="4" w:space="0" w:color="auto"/>
-              <w:bottom w:val="single" w:sz="4" w:space="0" w:color="auto"/>
-              <w:right w:val="single" w:sz="4" w:space="0" w:color="auto"/>
-            </w:tcBorders>
-            <w:vAlign w:val="center"/>
-          </w:tcPr>
-          <w:p>
-            <w:pPr>
-              <w:keepNext/>
-              <w:jc w:val="center"/>
-            </w:pPr>
-            <w:r>
-              <w:t>6.</w:t>
-            </w:r>
-          </w:p>
-        </w:tc>
-        <w:tc>
-          <w:tcPr>
-            <w:tcW w:w="7021" w:type="dxa"/>
-            <w:tcBorders>
-              <w:top w:val="single" w:sz="4" w:space="0" w:color="auto"/>
-              <w:left w:val="single" w:sz="4" w:space="0" w:color="auto"/>
-              <w:bottom w:val="single" w:sz="4" w:space="0" w:color="auto"/>
-              <w:right w:val="single" w:sz="4" w:space="0" w:color="auto"/>
-            </w:tcBorders>
-          </w:tcPr>
-          <w:p>
-            <w:pPr>
-              <w:keepNext/>
-            </w:pPr>
-            <w:r>
-              <w:t>Температурный диапазон условий эксплуатации весов, °С</w:t>
-            </w:r>
-          </w:p>
-        </w:tc>
-        <w:tc>
-          <w:tcPr>
-            <w:tcW w:w="2403" w:type="dxa"/>
-            <w:tcBorders>
-              <w:top w:val="single" w:sz="4" w:space="0" w:color="auto"/>
-              <w:left w:val="single" w:sz="4" w:space="0" w:color="auto"/>
-              <w:bottom w:val="single" w:sz="4" w:space="0" w:color="auto"/>
-              <w:right w:val="single" w:sz="4" w:space="0" w:color="auto"/>
-            </w:tcBorders>
-          </w:tcPr>
-          <w:p>
-            <w:pPr>
-              <w:keepNext/>
-              <w:jc w:val="center"/>
-            </w:pPr>
-            <w:r>
-              <w:t>{{ТТХ_ТЕМПЕРАТУРА}}</w:t>
-            </w:r>
-          </w:p>
-        </w:tc>
-      </w:tr>
-      <w:tr>
-        <w:trPr>
-          <w:cantSplit/>
-        </w:trPr>
-        <w:tc>
-          <w:tcPr>
-            <w:tcW w:w="647" w:type="dxa"/>
-            <w:tcBorders>
-              <w:top w:val="single" w:sz="4" w:space="0" w:color="auto"/>
-              <w:left w:val="single" w:sz="4" w:space="0" w:color="auto"/>
-              <w:bottom w:val="single" w:sz="4" w:space="0" w:color="auto"/>
-              <w:right w:val="single" w:sz="4" w:space="0" w:color="auto"/>
-            </w:tcBorders>
-            <w:vAlign w:val="center"/>
-          </w:tcPr>
-          <w:p>
-            <w:pPr>
-              <w:keepNext/>
-              <w:jc w:val="center"/>
-            </w:pPr>
-            <w:r>
-              <w:t>7.</w:t>
-            </w:r>
-          </w:p>
-        </w:tc>
-        <w:tc>
-          <w:tcPr>
-            <w:tcW w:w="7021" w:type="dxa"/>
-            <w:tcBorders>
-              <w:top w:val="single" w:sz="4" w:space="0" w:color="auto"/>
-              <w:left w:val="single" w:sz="4" w:space="0" w:color="auto"/>
-              <w:bottom w:val="single" w:sz="4" w:space="0" w:color="auto"/>
-              <w:right w:val="single" w:sz="4" w:space="0" w:color="auto"/>
-            </w:tcBorders>
-          </w:tcPr>
-          <w:p>
-            <w:pPr>
-              <w:keepNext/>
-            </w:pPr>
-            <w:r>
-              <w:t>Канал внешней связи</w:t>
-            </w:r>
-          </w:p>
-        </w:tc>
-        <w:tc>
-          <w:tcPr>
-            <w:tcW w:w="2403" w:type="dxa"/>
-            <w:tcBorders>
-              <w:top w:val="single" w:sz="4" w:space="0" w:color="auto"/>
-              <w:left w:val="single" w:sz="4" w:space="0" w:color="auto"/>
-              <w:bottom w:val="single" w:sz="4" w:space="0" w:color="auto"/>
-              <w:right w:val="single" w:sz="4" w:space="0" w:color="auto"/>
-            </w:tcBorders>
-          </w:tcPr>
-          <w:p>
-            <w:pPr>
-              <w:keepNext/>
-              <w:jc w:val="center"/>
-            </w:pPr>
-            <w:r>
-              <w:rPr>
-                <w:lang w:val="en-US"/>
-              </w:rPr>
-              <w:t>RS</w:t>
-            </w:r>
-            <w:r>
-              <w:t xml:space="preserve"> 232/485</w:t>
-            </w:r>
-          </w:p>
-        </w:tc>
-      </w:tr>
-      <w:tr>
-        <w:trPr>
-          <w:cantSplit/>
-        </w:trPr>
-        <w:tc>
-          <w:tcPr>
-            <w:tcW w:w="647" w:type="dxa"/>
-            <w:tcBorders>
-              <w:top w:val="single" w:sz="4" w:space="0" w:color="auto"/>
-              <w:left w:val="single" w:sz="4" w:space="0" w:color="auto"/>
-              <w:bottom w:val="single" w:sz="4" w:space="0" w:color="auto"/>
-              <w:right w:val="single" w:sz="4" w:space="0" w:color="auto"/>
-            </w:tcBorders>
-            <w:vAlign w:val="center"/>
-          </w:tcPr>
-          <w:p>
-            <w:pPr>
-              <w:keepNext/>
-              <w:jc w:val="center"/>
-            </w:pPr>
-            <w:r>
-              <w:t>8.</w:t>
-            </w:r>
-          </w:p>
-        </w:tc>
-        <w:tc>
-          <w:tcPr>
-            <w:tcW w:w="7021" w:type="dxa"/>
-            <w:tcBorders>
-              <w:top w:val="single" w:sz="4" w:space="0" w:color="auto"/>
-              <w:left w:val="single" w:sz="4" w:space="0" w:color="auto"/>
-              <w:bottom w:val="single" w:sz="4" w:space="0" w:color="auto"/>
-              <w:right w:val="single" w:sz="4" w:space="0" w:color="auto"/>
-            </w:tcBorders>
-          </w:tcPr>
-          <w:p>
-            <w:pPr>
-              <w:keepNext/>
-            </w:pPr>
-            <w:r>
-              <w:t>Электропитание, В</w:t>
-            </w:r>
-          </w:p>
-        </w:tc>
-        <w:tc>
-          <w:tcPr>
-            <w:tcW w:w="2403" w:type="dxa"/>
-            <w:tcBorders>
-              <w:top w:val="single" w:sz="4" w:space="0" w:color="auto"/>
-              <w:left w:val="single" w:sz="4" w:space="0" w:color="auto"/>
-              <w:bottom w:val="single" w:sz="4" w:space="0" w:color="auto"/>
-              <w:right w:val="single" w:sz="4" w:space="0" w:color="auto"/>
-            </w:tcBorders>
-          </w:tcPr>
-          <w:p>
-            <w:pPr>
-              <w:keepNext/>
-              <w:jc w:val="center"/>
-            </w:pPr>
-            <w:r>
-              <w:t>≈220 ± 15</w:t>
-            </w:r>
-          </w:p>
-        </w:tc>
-      </w:tr>
-      <w:tr>
-        <w:trPr>
-          <w:cantSplit/>
-        </w:trPr>
-        <w:tc>
-          <w:tcPr>
-            <w:tcW w:w="647" w:type="dxa"/>
-            <w:tcBorders>
-              <w:top w:val="single" w:sz="4" w:space="0" w:color="auto"/>
-              <w:left w:val="single" w:sz="4" w:space="0" w:color="auto"/>
-              <w:bottom w:val="single" w:sz="4" w:space="0" w:color="auto"/>
-              <w:right w:val="single" w:sz="4" w:space="0" w:color="auto"/>
-            </w:tcBorders>
-            <w:vAlign w:val="center"/>
-          </w:tcPr>
-          <w:p>
-            <w:pPr>
-              <w:keepNext/>
-              <w:jc w:val="center"/>
-            </w:pPr>
-            <w:r>
-              <w:t>9.</w:t>
-            </w:r>
-          </w:p>
-        </w:tc>
-        <w:tc>
-          <w:tcPr>
-            <w:tcW w:w="7021" w:type="dxa"/>
-            <w:tcBorders>
-              <w:top w:val="single" w:sz="4" w:space="0" w:color="auto"/>
-              <w:left w:val="single" w:sz="4" w:space="0" w:color="auto"/>
-              <w:bottom w:val="single" w:sz="4" w:space="0" w:color="auto"/>
-              <w:right w:val="single" w:sz="4" w:space="0" w:color="auto"/>
-            </w:tcBorders>
-            <w:vAlign w:val="center"/>
-          </w:tcPr>
-          <w:p>
-            <w:pPr>
-              <w:keepNext/>
-            </w:pPr>
-            <w:r>
-              <w:t>Потребляемая мощность, не более, Вт</w:t>
-            </w:r>
-          </w:p>
-        </w:tc>
-        <w:tc>
-          <w:tcPr>
-            <w:tcW w:w="2403" w:type="dxa"/>
-            <w:tcBorders>
-              <w:top w:val="single" w:sz="4" w:space="0" w:color="auto"/>
-              <w:left w:val="single" w:sz="4" w:space="0" w:color="auto"/>
-              <w:bottom w:val="single" w:sz="4" w:space="0" w:color="auto"/>
-              <w:right w:val="single" w:sz="4" w:space="0" w:color="auto"/>
-            </w:tcBorders>
-            <w:vAlign w:val="center"/>
-          </w:tcPr>
-          <w:p>
-            <w:pPr>
-              <w:keepNext/>
-              <w:jc w:val="center"/>
-            </w:pPr>
-            <w:r>
-              <w:t>15</w:t>
-            </w:r>
-          </w:p>
-        </w:tc>
-      </w:tr>
-      <w:tr>
-        <w:trPr>
-          <w:cantSplit/>
-          <w:trHeight w:val="936"/>
-        </w:trPr>
-        <w:tc>
-          <w:tcPr>
-            <w:tcW w:w="647" w:type="dxa"/>
-            <w:tcBorders>
-              <w:top w:val="single" w:sz="4" w:space="0" w:color="auto"/>
-              <w:left w:val="single" w:sz="4" w:space="0" w:color="auto"/>
-              <w:bottom w:val="single" w:sz="4" w:space="0" w:color="auto"/>
-              <w:right w:val="single" w:sz="4" w:space="0" w:color="auto"/>
-            </w:tcBorders>
-            <w:vAlign w:val="center"/>
-          </w:tcPr>
-          <w:p>
-            <w:pPr>
-              <w:keepNext/>
-              <w:jc w:val="center"/>
-            </w:pPr>
-            <w:r>
-              <w:t>10.</w:t>
-            </w:r>
-          </w:p>
-        </w:tc>
-        <w:tc>
-          <w:tcPr>
-            <w:tcW w:w="9424" w:type="dxa"/>
-            <w:gridSpan w:val="2"/>
-            <w:tcBorders>
-              <w:top w:val="single" w:sz="4" w:space="0" w:color="auto"/>
-              <w:left w:val="single" w:sz="4" w:space="0" w:color="auto"/>
-              <w:bottom w:val="single" w:sz="4" w:space="0" w:color="auto"/>
-              <w:right w:val="single" w:sz="4" w:space="0" w:color="auto"/>
-            </w:tcBorders>
-            <w:vAlign w:val="center"/>
-          </w:tcPr>
-          <w:p>
-            <w:pPr>
-              <w:keepNext/>
-              <w:jc w:val="both"/>
-            </w:pPr>
-            <w:r>
-              <w:t>Весы автомобильные ВЕСТА выпускаются ООО «ТПК «</w:t>
-            </w:r>
-            <w:proofErr w:type="spellStart"/>
-            <w:r>
-              <w:t>Тензосила</w:t>
-            </w:r>
-            <w:proofErr w:type="spellEnd"/>
-            <w:r>
-              <w:t>»» по                               ГОСТ OIML R-76-1-2011. Тип весов утвержден и внесен в Госреестр средств измерений РФ под № 78871-20</w:t>
-            </w:r>
-          </w:p>
-        </w:tc>
-      </w:tr>
-    </w:tbl>
-    <w:p>
-      <w:pPr>
-        <w:keepNext/>
-        <w:rPr>
-          <w:b/>
-        </w:rPr>
-      </w:pPr>
-    </w:p>
-    <w:p>
-      <w:pPr>
-        <w:pStyle w:val="af3"/>
-        <w:keepNext/>
-        <w:rPr>
-          <w:bCs/>
-        </w:rPr>
-      </w:pPr>
-      <w:r>
-        <w:rPr>
-          <w:bCs/>
-        </w:rPr>
-        <w:t>{{КОМПЛЕКТ_НОМЕР}}. Комплект поставки весов {{СПЕЦ_МОДЕЛЬ_КРАТКОЕ}} на единицу продукции</w:t>
-      </w:r>
-    </w:p>
-    <w:p>
-      <w:pPr>
-        <w:keepNext/>
-        <w:jc w:val="center"/>
-        <w:rPr>
-          <w:b/>
-        </w:rPr>
-      </w:pPr>
-    </w:p>
-    <w:tbl>
-      <w:tblPr>
-        <w:tblW w:w="10071" w:type="dxa"/>
-        <w:tblInd w:w="26" w:type="dxa"/>
-        <w:tblBorders>
-          <w:top w:val="single" w:sz="2" w:space="0" w:color="000001"/>
-          <w:left w:val="single" w:sz="2" w:space="0" w:color="000001"/>
-          <w:bottom w:val="single" w:sz="2" w:space="0" w:color="000001"/>
-        </w:tblBorders>
-        <w:tblCellMar>
-          <w:top w:w="28" w:type="dxa"/>
-          <w:left w:w="25" w:type="dxa"/>
-          <w:bottom w:w="28" w:type="dxa"/>
-          <w:right w:w="28" w:type="dxa"/>
-        </w:tblCellMar>
-        <w:tblLook w:val="04A0" w:firstRow="1" w:lastRow="0" w:firstColumn="1" w:lastColumn="0" w:noHBand="0" w:noVBand="1"/>
-      </w:tblPr>
-      <w:tblGrid>
-        <w:gridCol w:w="7626"/>
-        <w:gridCol w:w="2445"/>
-      </w:tblGrid>
-      <w:tr>
-        <w:trPr>
-          <w:cantSplit/>
-          <w:tblHeader/>
-        </w:trPr>
-        <w:tc>
-          <w:tcPr>
-            <w:tcW w:w="7626" w:type="dxa"/>
-            <w:tcBorders>
-              <w:top w:val="single" w:sz="2" w:space="0" w:color="000001"/>
-              <w:left w:val="single" w:sz="2" w:space="0" w:color="000001"/>
-              <w:bottom w:val="single" w:sz="2" w:space="0" w:color="000001"/>
-            </w:tcBorders>
-            <w:tcMar>
-              <w:left w:w="25" w:type="dxa"/>
-            </w:tcMar>
-            <w:vAlign w:val="center"/>
-          </w:tcPr>
-          <w:p>
-            <w:pPr>
-              <w:keepNext/>
-              <w:jc w:val="center"/>
-            </w:pPr>
-            <w:r>
-              <w:rPr>
-                <w:b/>
-              </w:rPr>
-              <w:t>Комплект</w:t>
-            </w:r>
-          </w:p>
-        </w:tc>
-        <w:tc>
-          <w:tcPr>
-            <w:tcW w:w="2445" w:type="dxa"/>
-            <w:tcBorders>
-              <w:top w:val="single" w:sz="2" w:space="0" w:color="000001"/>
-              <w:left w:val="single" w:sz="2" w:space="0" w:color="000001"/>
-              <w:bottom w:val="single" w:sz="2" w:space="0" w:color="000001"/>
-              <w:right w:val="single" w:sz="2" w:space="0" w:color="000001"/>
-            </w:tcBorders>
-            <w:tcMar>
-              <w:left w:w="25" w:type="dxa"/>
-            </w:tcMar>
-            <w:vAlign w:val="center"/>
-          </w:tcPr>
-          <w:p>
-            <w:pPr>
-              <w:keepNext/>
-              <w:jc w:val="center"/>
-            </w:pPr>
-            <w:r>
-              <w:rPr>
-                <w:b/>
-              </w:rPr>
-              <w:t>Количество</w:t>
-            </w:r>
-          </w:p>
-        </w:tc>
-      </w:tr>
-      <w:tr>
-        <w:trPr>
-          <w:cantSplit/>
-        </w:trPr>
-        <w:tc>
-          <w:tcPr>
-            <w:tcW w:w="7626" w:type="dxa"/>
-            <w:tcBorders>
-              <w:left w:val="single" w:sz="2" w:space="0" w:color="000001"/>
-              <w:bottom w:val="single" w:sz="2" w:space="0" w:color="000001"/>
-            </w:tcBorders>
-            <w:tcMar>
-              <w:left w:w="25" w:type="dxa"/>
-            </w:tcMar>
-            <w:vAlign w:val="center"/>
-          </w:tcPr>
-          <w:p>
-            <w:pPr>
-              <w:keepNext/>
-              <w:jc w:val="center"/>
-            </w:pPr>
-          </w:p>
-        </w:tc>
-        <w:tc>
-          <w:tcPr>
-            <w:tcW w:w="2445" w:type="dxa"/>
-            <w:tcBorders>
-              <w:left w:val="single" w:sz="2" w:space="0" w:color="000001"/>
-              <w:bottom w:val="single" w:sz="2" w:space="0" w:color="000001"/>
-              <w:right w:val="single" w:sz="2" w:space="0" w:color="000001"/>
-            </w:tcBorders>
-            <w:tcMar>
-              <w:left w:w="25" w:type="dxa"/>
-            </w:tcMar>
-            <w:vAlign w:val="center"/>
-          </w:tcPr>
-          <w:p>
-            <w:pPr>
-              <w:keepNext/>
-              <w:jc w:val="center"/>
-            </w:pPr>
-          </w:p>
-        </w:tc>
-      </w:tr>
-    </w:tbl>
-    <w:p>
-      <w:pPr>
-        <w:keepNext/>
-      </w:pPr>
-    </w:p>
-    <w:tbl>
-      <w:tblPr>
-        <w:tblpPr w:leftFromText="180" w:rightFromText="180" w:vertAnchor="text" w:horzAnchor="margin" w:tblpXSpec="center" w:tblpY="706"/>
-        <w:tblW w:w="8928" w:type="dxa"/>
-        <w:tblLayout w:type="fixed"/>
-        <w:tblLook w:val="0000" w:firstRow="0" w:lastRow="0" w:firstColumn="0" w:lastColumn="0" w:noHBand="0" w:noVBand="0"/>
-      </w:tblPr>
-      <w:tblGrid>
-        <w:gridCol w:w="4608"/>
-        <w:gridCol w:w="4320"/>
-      </w:tblGrid>
-      <w:tr>
-        <w:trPr>
-          <w:cantSplit/>
-          <w:trHeight w:val="2025"/>
-        </w:trPr>
-        <w:tc>
-          <w:tcPr>
-            <w:tcW w:w="4608" w:type="dxa"/>
-          </w:tcPr>
-          <w:p>
-            <w:pPr>
-              <w:pStyle w:val="3"/>
-              <w:widowControl w:val="0"/>
-              <w:rPr>
-                <w:b w:val="0"/>
-                <w:sz w:val="24"/>
-                <w:szCs w:val="24"/>
-              </w:rPr>
-            </w:pPr>
-            <w:r>
-              <w:rPr>
-                <w:b w:val="0"/>
-                <w:sz w:val="24"/>
-                <w:szCs w:val="24"/>
-              </w:rPr>
-              <w:t>ПОДРЯДЧИК:</w:t>
-            </w:r>
-          </w:p>
-          <w:p>
-            <w:pPr>
-              <w:pStyle w:val="3"/>
-              <w:widowControl w:val="0"/>
-              <w:rPr>
-                <w:b w:val="0"/>
-                <w:sz w:val="24"/>
-                <w:szCs w:val="24"/>
-              </w:rPr>
-            </w:pPr>
-            <w:r>
-              <w:rPr>
-                <w:b w:val="0"/>
-                <w:sz w:val="24"/>
-                <w:szCs w:val="24"/>
-              </w:rPr>
-              <w:t xml:space="preserve">Директор </w:t>
-            </w:r>
-          </w:p>
-          <w:p>
-            <w:pPr>
-              <w:pStyle w:val="3"/>
-              <w:widowControl w:val="0"/>
-              <w:rPr>
-                <w:b w:val="0"/>
-                <w:sz w:val="24"/>
-                <w:szCs w:val="24"/>
-              </w:rPr>
-            </w:pPr>
-            <w:r>
-              <w:rPr>
-                <w:b w:val="0"/>
-                <w:sz w:val="24"/>
-                <w:szCs w:val="24"/>
-              </w:rPr>
-              <w:t>ООО «ТПК «</w:t>
-            </w:r>
-            <w:proofErr w:type="spellStart"/>
-            <w:r>
-              <w:rPr>
-                <w:b w:val="0"/>
-                <w:sz w:val="24"/>
-                <w:szCs w:val="24"/>
-              </w:rPr>
-              <w:t>Тензосила</w:t>
-            </w:r>
-            <w:proofErr w:type="spellEnd"/>
-            <w:r>
-              <w:rPr>
-                <w:b w:val="0"/>
-                <w:sz w:val="24"/>
-                <w:szCs w:val="24"/>
-              </w:rPr>
-              <w:t>»»</w:t>
-            </w:r>
-          </w:p>
-          <w:p>
-            <w:pPr>
-              <w:pStyle w:val="3"/>
-              <w:widowControl w:val="0"/>
-              <w:rPr>
-                <w:b w:val="0"/>
-                <w:sz w:val="24"/>
-                <w:szCs w:val="24"/>
-              </w:rPr>
-            </w:pPr>
-          </w:p>
-          <w:p>
-            <w:pPr>
-              <w:pStyle w:val="3"/>
-              <w:widowControl w:val="0"/>
-              <w:rPr>
-                <w:b w:val="0"/>
-                <w:sz w:val="24"/>
-                <w:szCs w:val="24"/>
-              </w:rPr>
-            </w:pPr>
-            <w:r>
-              <w:rPr>
-                <w:b w:val="0"/>
-                <w:sz w:val="24"/>
-                <w:szCs w:val="24"/>
-              </w:rPr>
-              <w:t>________________/</w:t>
-            </w:r>
-            <w:proofErr w:type="spellStart"/>
-            <w:r>
-              <w:rPr>
-                <w:b w:val="0"/>
-                <w:sz w:val="24"/>
-                <w:szCs w:val="24"/>
-              </w:rPr>
-              <w:t>О.А.Сенаторов</w:t>
-            </w:r>
-            <w:proofErr w:type="spellEnd"/>
-            <w:r>
-              <w:rPr>
-                <w:b w:val="0"/>
-                <w:sz w:val="24"/>
-                <w:szCs w:val="24"/>
-              </w:rPr>
-              <w:t>/</w:t>
-            </w:r>
-          </w:p>
-          <w:p>
-            <w:pPr>
-              <w:widowControl w:val="0"/>
-              <w:jc w:val="both"/>
-            </w:pPr>
-          </w:p>
-          <w:p>
-            <w:pPr>
-              <w:widowControl w:val="0"/>
-              <w:jc w:val="both"/>
-            </w:pPr>
-            <w:r>
-              <w:t>"____" ___________{{ТЕКУЩИЙ_ГОД}} г.</w:t>
-            </w:r>
-          </w:p>
-          <w:p>
-            <w:pPr>
-              <w:widowControl w:val="0"/>
-              <w:ind w:firstLine="709"/>
-              <w:jc w:val="both"/>
-            </w:pPr>
-          </w:p>
-          <w:p>
-            <w:pPr>
-              <w:widowControl w:val="0"/>
-              <w:jc w:val="both"/>
-              <w:rPr>
-                <w:sz w:val="16"/>
-                <w:szCs w:val="16"/>
-              </w:rPr>
-            </w:pPr>
-            <w:r>
-              <w:t xml:space="preserve">       М.П.</w:t>
-            </w:r>
-          </w:p>
-        </w:tc>
-        <w:tc>
-          <w:tcPr>
-            <w:tcW w:w="4320" w:type="dxa"/>
-          </w:tcPr>
-          <w:p>
-            <w:r>
-              <w:t>ЗАКАЗЧИК:</w:t>
-            </w:r>
-          </w:p>
-          <w:p>
-            <w:pPr>
-              <w:rPr>
-                <w:bCs/>
-              </w:rPr>
-            </w:pPr>
-            <w:r>
-              <w:t>{{ЗАКАЗЧИК_ДИРЕКТОР_ДОЛЖНОСТЬ}}</w:t>
-            </w:r>
-            <w:r>
-              <w:rPr>
-                <w:bCs/>
-              </w:rPr>
-              <w:t xml:space="preserve"> </w:t>
-            </w:r>
-          </w:p>
-          <w:p>
-            <w:pPr>
-              <w:rPr>
-                <w:bCs/>
-              </w:rPr>
-            </w:pPr>
-            <w:r>
-              <w:rPr>
-                <w:bCs/>
-              </w:rPr>
-              <w:t>{{ЗАКАЗЧИК_ПОЛНОЕ_НАИМЕНОВАНИЕ}}</w:t>
-            </w:r>
-          </w:p>
-          <w:p>
-            <w:pPr>
-              <w:rPr>
-                <w:bCs/>
-              </w:rPr>
-            </w:pPr>
-          </w:p>
-          <w:p>
-            <w:pPr>
-              <w:rPr>
-                <w:bCs/>
-              </w:rPr>
-            </w:pPr>
-            <w:r>
-              <w:t>__________________ /{{ЗАКАЗЧИК_ДИРЕКТОР_ИНИЦИАЛЫ}}/</w:t>
-            </w:r>
-          </w:p>
-          <w:p/>
-          <w:p>
-            <w:pPr>
-              <w:widowControl w:val="0"/>
-              <w:jc w:val="both"/>
-            </w:pPr>
-            <w:r>
-              <w:t>"____"__________{{ТЕКУЩИЙ_ГОД}} г.</w:t>
-            </w:r>
-          </w:p>
-          <w:p>
-            <w:pPr>
-              <w:widowControl w:val="0"/>
-              <w:jc w:val="both"/>
-            </w:pPr>
-            <w:r>
-              <w:t xml:space="preserve">      </w:t>
-            </w:r>
-          </w:p>
-          <w:p>
-            <w:pPr>
-              <w:widowControl w:val="0"/>
-              <w:jc w:val="both"/>
-              <w:rPr>
-                <w:sz w:val="16"/>
-                <w:szCs w:val="16"/>
-              </w:rPr>
-            </w:pPr>
-            <w:r>
-              <w:t xml:space="preserve">      М.П.</w:t>
-            </w:r>
-          </w:p>
-        </w:tc>
-      </w:tr>
-    </w:tbl>
-    <w:p>
-      <w:pPr>
-        <w:pStyle w:val="a7"/>
-        <w:jc w:val="right"/>
-        <w:rPr>
-          <w:b w:val="0"/>
-          <w:sz w:val="24"/>
-        </w:rPr>
-      </w:pPr>
-    </w:p>
-    <w:p>
-      <w:pPr>
-        <w:pStyle w:val="a7"/>
-        <w:jc w:val="right"/>
-        <w:rPr>
-          <w:b w:val="0"/>
-          <w:sz w:val="24"/>
-        </w:rPr>
-      </w:pPr>
-    </w:p>
-    <w:p>
-      <w:pPr>
-        <w:pStyle w:val="a7"/>
-        <w:jc w:val="right"/>
-        <w:rPr>
-          <w:b w:val="0"/>
-          <w:sz w:val="24"/>
-        </w:rPr>
-      </w:pPr>
-    </w:p>
-    <w:p>
-      <w:pPr>
-        <w:pStyle w:val="a7"/>
-        <w:jc w:val="right"/>
-        <w:rPr>
-          <w:b w:val="0"/>
-          <w:sz w:val="24"/>
-        </w:rPr>
-      </w:pPr>
-    </w:p>
-    <w:p>
-      <w:pPr>
-        <w:pStyle w:val="a7"/>
-        <w:jc w:val="right"/>
-        <w:rPr>
-          <w:b w:val="0"/>
-          <w:sz w:val="24"/>
-        </w:rPr>
-      </w:pPr>
-    </w:p>
-    <w:p>
-      <w:pPr>
-        <w:pStyle w:val="a7"/>
-        <w:jc w:val="right"/>
-        <w:rPr>
-          <w:b w:val="0"/>
-          <w:sz w:val="24"/>
-        </w:rPr>
-      </w:pPr>
-    </w:p>
-    <w:p>
-      <w:pPr>
-        <w:pStyle w:val="a7"/>
-        <w:jc w:val="left"/>
-        <w:rPr>
-          <w:b w:val="0"/>
-          <w:sz w:val="24"/>
-        </w:rPr>
-      </w:pPr>
-    </w:p>
-    <w:p>
-      <w:pPr>
-        <w:pStyle w:val="a7"/>
-        <w:jc w:val="right"/>
-        <w:rPr>
-          <w:b w:val="0"/>
-          <w:sz w:val="24"/>
-        </w:rPr>
-      </w:pPr>
-    </w:p>
-    <w:p>
-      <w:pPr>
-        <w:pStyle w:val="a7"/>
-        <w:jc w:val="right"/>
-        <w:rPr>
-          <w:b w:val="0"/>
-          <w:sz w:val="24"/>
-        </w:rPr>
-      </w:pPr>
-    </w:p>
-    <w:sectPr>
-      <w:headerReference w:type="default" r:id="rId9"/>
-      <w:footerReference w:type="even" r:id="rId10"/>
-      <w:footerReference w:type="default" r:id="rId11"/>
-      <w:pgSz w:w="11906" w:h="16838"/>
-      <w:pgMar w:top="567" w:right="424" w:bottom="0" w:left="1418" w:header="709" w:footer="709" w:gutter="0"/>
-      <w:pgNumType w:start="1"/>
-      <w:cols w:space="708"/>
-      <w:docGrid w:linePitch="360"/>
-    </w:sectPr>
-  </w:body>
-</w:document>
+<ns0:document xmlns:ns0="http://schemas.openxmlformats.org/wordprocessingml/2006/main" xmlns:ns1="http://schemas.openxmlformats.org/markup-compatibility/2006" xmlns:ns2="http://schemas.microsoft.com/office/word/2010/wordml" xmlns:ns3="http://schemas.openxmlformats.org/officeDocument/2006/relationships" ns1:Ignorable="w14 w15 w16se w16cid w16 w16cex w16sdtdh w16sdtfl w16du wp14">
+  <ns0:body>
+    <ns0:p ns2:paraId="45B52775" ns2:textId="77777777" ns0:rsidR="004C1787" ns0:rsidRDefault="004C1787" ns0:rsidP="004C1787">
+      <ns0:pPr>
+        <ns0:jc ns0:val="center"/>
+        <ns0:rPr>
+          <ns0:b/>
+        </ns0:rPr>
+      </ns0:pPr>
+      <ns0:r>
+        <ns0:rPr>
+          <ns0:b/>
+        </ns0:rPr>
+        <ns0:t>Спецификация №{{СПЕЦ_НОМЕР}}</ns0:t>
+      </ns0:r>
+    </ns0:p>
+    <ns0:p ns2:paraId="51B78B52" ns2:textId="77777777" ns0:rsidR="004C1787" ns0:rsidRDefault="004C1787" ns0:rsidP="004C1787">
+      <ns0:pPr>
+        <ns0:jc ns0:val="center"/>
+      </ns0:pPr>
+      <ns0:r>
+        <ns0:t>к Договору № {{ДОГОВОР_НОМЕР}} от {{ДОГОВОР_ДАТА_ПОЛНАЯ</ns0:t>
+      </ns0:r>
+      <ns0:proofErr ns0:type="gramStart"/>
+      <ns0:r>
+        <ns0:t>}}г.</ns0:t>
+      </ns0:r>
+      <ns0:proofErr ns0:type="gramEnd"/>
+    </ns0:p>
+    <ns0:p ns2:paraId="09689E23" ns2:textId="77777777" ns0:rsidR="004C1787" ns0:rsidRDefault="004C1787" ns0:rsidP="004C1787">
+      <ns0:pPr>
+        <ns0:jc ns0:val="center"/>
+      </ns0:pPr>
+      <ns0:r>
+        <ns0:t>на поставку весов автомобильных и выполнение сопутствующих работ</ns0:t>
+      </ns0:r>
+    </ns0:p>
+    <ns0:p ns2:paraId="0D8753EC" ns2:textId="77777777" ns0:rsidR="004C1787" ns0:rsidRDefault="004C1787">
+      <ns0:pPr>
+        <ns0:pStyle ns0:val="a7"/>
+        <ns0:jc ns0:val="right"/>
+        <ns0:rPr>
+          <ns0:b ns0:val="0"/>
+          <ns0:bCs ns0:val="0"/>
+          <ns0:sz ns0:val="24"/>
+        </ns0:rPr>
+      </ns0:pPr>
+    </ns0:p>
+    <ns0:p ns2:paraId="1BAB48D9" ns2:textId="77777777" ns0:rsidR="004C1787" ns0:rsidRDefault="004C1787">
+      <ns0:pPr>
+        <ns0:pStyle ns0:val="a7"/>
+        <ns0:jc ns0:val="right"/>
+        <ns0:rPr>
+          <ns0:b ns0:val="0"/>
+          <ns0:bCs ns0:val="0"/>
+          <ns0:sz ns0:val="24"/>
+        </ns0:rPr>
+      </ns0:pPr>
+    </ns0:p>
+    <ns0:p ns2:paraId="15166495" ns2:textId="77777777" ns0:rsidR="004C1787" ns0:rsidRDefault="004C1787" ns0:rsidP="004C1787">
+      <ns0:pPr>
+        <ns0:jc ns0:val="both"/>
+      </ns0:pPr>
+      <ns0:r>
+        <ns0:t xml:space="preserve">г. Воронеж                                                                                                                      </ns0:t>
+      </ns0:r>
+      <ns0:proofErr ns0:type="gramStart"/>
+      <ns0:r>
+        <ns0:t xml:space="preserve">   «</ns0:t>
+      </ns0:r>
+      <ns0:proofErr ns0:type="gramEnd"/>
+      <ns0:r>
+        <ns0:t>{{ДОГОВОР_ДЕНЬ}}» {{ДОГОВОР_МЕСЯЦ}} {{ДОГОВОР_ГОД}} г.</ns0:t>
+      </ns0:r>
+    </ns0:p>
+    <ns0:p ns2:paraId="171D6101" ns2:textId="77777777" ns0:rsidR="004C1787" ns0:rsidRDefault="004C1787" ns0:rsidP="004C1787">
+      <ns0:pPr>
+        <ns0:jc ns0:val="both"/>
+      </ns0:pPr>
+    </ns0:p>
+    <ns0:p ns2:paraId="5D1F11AB" ns2:textId="77777777" ns0:rsidR="008613D9" ns0:rsidRPr="008B62CE" ns0:rsidRDefault="00E325B7" ns0:rsidP="00676EC6">
+      <ns0:pPr>
+        <ns0:ind ns0:firstLine="708"/>
+        <ns0:jc ns0:val="both"/>
+      </ns0:pPr>
+      <ns0:r>
+        <ns0:rPr>
+          <ns0:b/>
+        </ns0:rPr>
+        <ns0:t>ООО «ТПК «</ns0:t>
+      </ns0:r>
+      <ns0:proofErr ns0:type="spellStart"/>
+      <ns0:r>
+        <ns0:rPr>
+          <ns0:b/>
+        </ns0:rPr>
+        <ns0:t>Тензосила</ns0:t>
+      </ns0:r>
+      <ns0:proofErr ns0:type="spellEnd"/>
+      <ns0:r>
+        <ns0:rPr>
+          <ns0:b/>
+        </ns0:rPr>
+        <ns0:t>»»</ns0:t>
+      </ns0:r>
+      <ns0:r>
+        <ns0:t xml:space="preserve">, именуемое в дальнейшем «Подрядчик», в лице директора Сенаторова Олега Александровича, действующего на основании Устава, с одной стороны и </ns0:t>
+      </ns0:r>
+      <ns0:r>
+        <ns0:rPr>
+          <ns0:b/>
+          <ns0:bCs/>
+        </ns0:rPr>
+        <ns0:t>{{ЗАКАЗЧИК_КРАТКОЕ_НАИМЕНОВАНИЕ}}</ns0:t>
+      </ns0:r>
+      <ns0:r>
+        <ns0:rPr>
+          <ns0:b/>
+        </ns0:rPr>
+        <ns0:t>,</ns0:t>
+      </ns0:r>
+      <ns0:r>
+        <ns0:t xml:space="preserve"> именуемое в дальнейшем «Заказчик», в лице {{ЗАКАЗЧИК_ДИРЕКТОР_ДОЛЖНОСТЬ_РП}} {{ЗАКАЗЧИК_ДИРЕКТОР_ФИО_РП}}, {{ДИРЕКТОР_ПРИЧАСТИЕ}} на основании {{ЗАКАЗЧИК_ОСНОВАНИЕ}}, с другой стороны, именуемые совместно «Стороны», подписали настоящую Спецификацию:</ns0:t>
+      </ns0:r>
+    </ns0:p>
+    <ns0:p ns2:paraId="0BF5B0B4" ns2:textId="77777777" ns0:rsidR="008613D9" ns0:rsidRPr="008B62CE" ns0:rsidRDefault="008613D9" ns0:rsidP="008613D9">
+      <ns0:pPr>
+        <ns0:jc ns0:val="both"/>
+      </ns0:pPr>
+    </ns0:p>
+    <ns0:p ns2:paraId="6B88AC39" ns2:textId="77777777" ns0:rsidR="008613D9" ns0:rsidRPr="008B62CE" ns0:rsidRDefault="008613D9" ns0:rsidP="00800433">
+      <ns0:pPr>
+        <ns0:jc ns0:val="both"/>
+      </ns0:pPr>
+      <ns0:r>
+        <ns0:t>1. Подрядчик обязуется поставить товар и выполнить сопутствующие работы согласно настоящей Спецификации:</ns0:t>
+      </ns0:r>
+      <ns0:bookmarkStart ns0:id="0" ns0:name="_Hlk108792741"/>
+    </ns0:p>
+    <ns0:bookmarkEnd ns0:id="0"/>
+    <ns0:p ns2:paraId="754407CE" ns2:textId="77777777" ns0:rsidR="008613D9" ns0:rsidRPr="008B62CE" ns0:rsidRDefault="008613D9" ns0:rsidP="008613D9">
+      <ns0:pPr>
+        <ns0:jc ns0:val="both"/>
+      </ns0:pPr>
+    </ns0:p>
+    <ns0:tbl>
+      <ns0:tblPr>
+        <ns0:tblW ns0:w="9840" ns0:type="dxa"/>
+        <ns0:tblBorders>
+          <ns0:top ns0:val="single" ns0:sz="4" ns0:space="0" ns0:color="auto"/>
+          <ns0:left ns0:val="single" ns0:sz="4" ns0:space="0" ns0:color="auto"/>
+          <ns0:bottom ns0:val="single" ns0:sz="4" ns0:space="0" ns0:color="auto"/>
+          <ns0:right ns0:val="single" ns0:sz="4" ns0:space="0" ns0:color="auto"/>
+          <ns0:insideH ns0:val="single" ns0:sz="4" ns0:space="0" ns0:color="auto"/>
+          <ns0:insideV ns0:val="single" ns0:sz="4" ns0:space="0" ns0:color="auto"/>
+        </ns0:tblBorders>
+        <ns0:tblLook ns0:val="01E0" ns0:firstRow="1" ns0:lastRow="1" ns0:firstColumn="1" ns0:lastColumn="1" ns0:noHBand="0" ns0:noVBand="0"/>
+      </ns0:tblPr>
+      <ns0:tblGrid>
+        <ns0:gridCol ns0:w="7046"/>
+        <ns0:gridCol ns0:w="2794"/>
+      </ns0:tblGrid>
+      <ns0:tr ns0:rsidR="008B62CE" ns0:rsidRPr="008B62CE" ns2:paraId="79CF7258" ns2:textId="77777777" ns0:rsidTr="00AA0CBB">
+        <ns0:trPr>
+          <ns0:trHeight ns0:val="414"/>
+        </ns0:trPr>
+        <ns0:tc>
+          <ns0:tcPr>
+            <ns0:tcW ns0:w="7366" ns0:type="dxa"/>
+            <ns0:vAlign ns0:val="center"/>
+          </ns0:tcPr>
+          <ns0:p ns2:paraId="4DEC68D7" ns2:textId="77777777" ns0:rsidR="008613D9" ns0:rsidRPr="008B62CE" ns0:rsidRDefault="008613D9" ns0:rsidP="00AA0CBB">
+            <ns0:pPr>
+              <ns0:ind ns0:left="360"/>
+              <ns0:jc ns0:val="center"/>
+              <ns0:rPr>
+                <ns0:b/>
+              </ns0:rPr>
+            </ns0:pPr>
+            <ns0:r>
+              <ns0:rPr>
+                <ns0:b/>
+              </ns0:rPr>
+              <ns0:t>Наименование</ns0:t>
+            </ns0:r>
+          </ns0:p>
+        </ns0:tc>
+        <ns0:tc>
+          <ns0:tcPr>
+            <ns0:tcW ns0:w="2474" ns0:type="dxa"/>
+            <ns0:vAlign ns0:val="center"/>
+          </ns0:tcPr>
+          <ns0:p ns2:paraId="017ED574" ns2:textId="77777777" ns0:rsidR="008613D9" ns0:rsidRPr="008B62CE" ns0:rsidRDefault="008613D9" ns0:rsidP="00AA0CBB">
+            <ns0:pPr>
+              <ns0:jc ns0:val="center"/>
+              <ns0:rPr>
+                <ns0:b/>
+              </ns0:rPr>
+            </ns0:pPr>
+            <ns0:r>
+              <ns0:rPr>
+                <ns0:b/>
+              </ns0:rPr>
+              <ns0:t>Стоимость с НДС, руб.</ns0:t>
+            </ns0:r>
+          </ns0:p>
+        </ns0:tc>
+      </ns0:tr>
+      <ns0:tr ns0:rsidR="008B62CE" ns0:rsidRPr="008B62CE" ns2:paraId="3DDFAD15" ns2:textId="77777777" ns0:rsidTr="003042EE">
+        <ns0:trPr>
+          <ns0:trHeight ns0:val="705"/>
+        </ns0:trPr>
+        <ns0:tc>
+          <ns0:tcPr>
+            <ns0:tcW ns0:w="7366" ns0:type="dxa"/>
+            <ns0:vAlign ns0:val="center"/>
+          </ns0:tcPr>
+          <ns0:p ns2:paraId="26628472" ns2:textId="77777777" ns0:rsidR="008613D9" ns0:rsidRPr="008B62CE" ns0:rsidRDefault="008613D9" ns0:rsidP="003042EE">
+            <ns0:pPr>
+              <ns0:ind ns0:left="360"/>
+            </ns0:pPr>
+            <ns0:r>
+              <ns0:t>{{СПЕЦ_П1_НАИМЕНОВАНИЕ}}</ns0:t>
+            </ns0:r>
+          </ns0:p>
+        </ns0:tc>
+        <ns0:tc>
+          <ns0:tcPr>
+            <ns0:tcW ns0:w="2474" ns0:type="dxa"/>
+            <ns0:vAlign ns0:val="center"/>
+          </ns0:tcPr>
+          <ns0:p ns2:paraId="2C7FCCC7" ns2:textId="77777777" ns0:rsidR="008613D9" ns0:rsidRPr="008B62CE" ns0:rsidRDefault="00E325B7" ns0:rsidP="00E325B7">
+            <ns0:pPr>
+              <ns0:jc ns0:val="center"/>
+              <ns0:rPr>
+                <ns0:bCs/>
+              </ns0:rPr>
+            </ns0:pPr>
+            <ns0:r>
+              <ns0:rPr>
+                <ns0:bCs/>
+              </ns0:rPr>
+              <ns0:t>{{СПЕЦ_П1_СУММА}}</ns0:t>
+            </ns0:r>
+          </ns0:p>
+        </ns0:tc>
+      </ns0:tr>
+      <ns0:tr ns0:rsidR="008B62CE" ns0:rsidRPr="008B62CE" ns2:paraId="19FCAC40" ns2:textId="77777777" ns0:rsidTr="00AA0CBB">
+        <ns0:trPr>
+          <ns0:trHeight ns0:val="561"/>
+        </ns0:trPr>
+        <ns0:tc>
+          <ns0:tcPr>
+            <ns0:tcW ns0:w="7366" ns0:type="dxa"/>
+            <ns0:vAlign ns0:val="center"/>
+          </ns0:tcPr>
+          <ns0:p ns2:paraId="48FFE0B6" ns2:textId="77777777" ns0:rsidR="00434785" ns0:rsidRPr="008B62CE" ns0:rsidRDefault="00434785" ns0:rsidP="00593C25">
+            <ns0:pPr>
+              <ns0:ind ns0:left="357"/>
+            </ns0:pPr>
+          </ns0:p>
+          <ns0:p ns2:paraId="1B5C770B" ns2:textId="77777777" ns0:rsidR="00593C25" ns0:rsidRPr="008B62CE" ns0:rsidRDefault="00593C25" ns0:rsidP="00593C25">
+            <ns0:pPr>
+              <ns0:ind ns0:left="357"/>
+            </ns0:pPr>
+            <ns0:r>
+              <ns0:t>{{СПЕЦ_П2_НАИМЕНОВАНИЕ}}</ns0:t>
+            </ns0:r>
+          </ns0:p>
+        </ns0:tc>
+        <ns0:tc>
+          <ns0:tcPr>
+            <ns0:tcW ns0:w="2474" ns0:type="dxa"/>
+            <ns0:vAlign ns0:val="center"/>
+          </ns0:tcPr>
+          <ns0:p ns2:paraId="454F9B11" ns2:textId="77777777" ns0:rsidR="008613D9" ns0:rsidRPr="008B62CE" ns0:rsidRDefault="00E325B7" ns0:rsidP="00E325B7">
+            <ns0:pPr>
+              <ns0:jc ns0:val="center"/>
+            </ns0:pPr>
+            <ns0:r>
+              <ns0:t>{{СПЕЦ_П2_СУММА}}</ns0:t>
+            </ns0:r>
+          </ns0:p>
+        </ns0:tc>
+      </ns0:tr>
+      <ns0:tr ns0:rsidR="00D616F3" ns0:rsidRPr="008B62CE" ns2:paraId="25F33CF5" ns2:textId="77777777" ns0:rsidTr="00AA0CBB">
+        <ns0:trPr>
+          <ns0:trHeight ns0:val="561"/>
+        </ns0:trPr>
+        <ns0:tc>
+          <ns0:tcPr>
+            <ns0:tcW ns0:w="7366" ns0:type="dxa"/>
+            <ns0:vAlign ns0:val="center"/>
+          </ns0:tcPr>
+          <ns0:p ns2:paraId="0D68DB42" ns2:textId="77777777" ns0:rsidR="00D616F3" ns0:rsidRPr="008B62CE" ns0:rsidRDefault="00D616F3" ns0:rsidP="00DA32F5">
+            <ns0:pPr>
+              <ns0:ind ns0:left="330"/>
+            </ns0:pPr>
+            <ns0:r>
+              <ns0:t>{{СПЕЦ_П3_НАИМЕНОВАНИЕ}}</ns0:t>
+            </ns0:r>
+          </ns0:p>
+        </ns0:tc>
+        <ns0:tc>
+          <ns0:tcPr>
+            <ns0:tcW ns0:w="2474" ns0:type="dxa"/>
+            <ns0:vAlign ns0:val="center"/>
+          </ns0:tcPr>
+          <ns0:p ns2:paraId="0AB03BCF" ns2:textId="77777777" ns0:rsidR="00D616F3" ns0:rsidRPr="008B62CE" ns0:rsidRDefault="00D616F3" ns0:rsidP="00D616F3">
+            <ns0:pPr>
+              <ns0:jc ns0:val="center"/>
+            </ns0:pPr>
+            <ns0:r>
+              <ns0:t>{{СПЕЦ_П3_СУММА}}</ns0:t>
+            </ns0:r>
+          </ns0:p>
+        </ns0:tc>
+      </ns0:tr>
+      <ns0:tr ns0:rsidR="00D616F3" ns0:rsidRPr="008B62CE" ns2:paraId="032C23A5" ns2:textId="77777777" ns0:rsidTr="00AA0CBB">
+        <ns0:trPr>
+          <ns0:trHeight ns0:val="414"/>
+        </ns0:trPr>
+        <ns0:tc>
+          <ns0:tcPr>
+            <ns0:tcW ns0:w="7366" ns0:type="dxa"/>
+            <ns0:vAlign ns0:val="center"/>
+          </ns0:tcPr>
+          <ns0:p ns2:paraId="7F7644CA" ns2:textId="77777777" ns0:rsidR="00D616F3" ns0:rsidRPr="008B62CE" ns0:rsidRDefault="00D616F3" ns0:rsidP="00D616F3">
+            <ns0:pPr>
+              <ns0:ind ns0:left="360"/>
+            </ns0:pPr>
+            <ns0:r>
+              <ns0:t>{{СПЕЦ_П4_НАИМЕНОВАНИЕ}}</ns0:t>
+            </ns0:r>
+          </ns0:p>
+        </ns0:tc>
+        <ns0:tc>
+          <ns0:tcPr>
+            <ns0:tcW ns0:w="2474" ns0:type="dxa"/>
+            <ns0:vAlign ns0:val="center"/>
+          </ns0:tcPr>
+          <ns0:p ns2:paraId="7739E5A7" ns2:textId="77777777" ns0:rsidR="00D616F3" ns0:rsidRPr="008B62CE" ns0:rsidRDefault="00D616F3" ns0:rsidP="00D616F3">
+            <ns0:pPr>
+              <ns0:jc ns0:val="center"/>
+            </ns0:pPr>
+            <ns0:r>
+              <ns0:t>{{СПЕЦ_П4_СУММА}}</ns0:t>
+            </ns0:r>
+          </ns0:p>
+        </ns0:tc>
+      </ns0:tr>
+      <ns0:tr ns0:rsidR="00D616F3" ns0:rsidRPr="008B62CE" ns2:paraId="6647751A" ns2:textId="77777777" ns0:rsidTr="00AA0CBB">
+        <ns0:trPr>
+          <ns0:trHeight ns0:val="575"/>
+        </ns0:trPr>
+        <ns0:tc>
+          <ns0:tcPr>
+            <ns0:tcW ns0:w="7366" ns0:type="dxa"/>
+            <ns0:vAlign ns0:val="center"/>
+          </ns0:tcPr>
+          <ns0:p ns2:paraId="4F601AAD" ns2:textId="77777777" ns0:rsidR="00D616F3" ns0:rsidRPr="008B62CE" ns0:rsidRDefault="00D616F3" ns0:rsidP="00D616F3">
+            <ns0:pPr>
+              <ns0:spacing ns0:line="288" ns0:lineRule="auto"/>
+            </ns0:pPr>
+            <ns0:r>
+              <ns0:rPr>
+                <ns0:b/>
+              </ns0:rPr>
+              <ns0:t xml:space="preserve">      </ns0:t>
+            </ns0:r>
+            <ns0:r>
+              <ns0:t>{{СПЕЦ_П5_НАИМЕНОВАНИЕ}}</ns0:t>
+            </ns0:r>
+          </ns0:p>
+        </ns0:tc>
+        <ns0:tc>
+          <ns0:tcPr>
+            <ns0:tcW ns0:w="2474" ns0:type="dxa"/>
+            <ns0:vAlign ns0:val="center"/>
+          </ns0:tcPr>
+          <ns0:p ns2:paraId="34EC3F5C" ns2:textId="77777777" ns0:rsidR="00D616F3" ns0:rsidRPr="008B62CE" ns0:rsidRDefault="00D616F3" ns0:rsidP="00D616F3">
+            <ns0:pPr>
+              <ns0:jc ns0:val="center"/>
+            </ns0:pPr>
+            <ns0:r>
+              <ns0:t>{{СПЕЦ_П5_СУММА}}</ns0:t>
+            </ns0:r>
+          </ns0:p>
+        </ns0:tc>
+      </ns0:tr>
+      <ns0:tr ns0:rsidR="00D616F3" ns0:rsidRPr="008B62CE" ns2:paraId="106C747A" ns2:textId="77777777" ns0:rsidTr="00AA0CBB">
+        <ns0:trPr>
+          <ns0:trHeight ns0:val="421"/>
+        </ns0:trPr>
+        <ns0:tc>
+          <ns0:tcPr>
+            <ns0:tcW ns0:w="7366" ns0:type="dxa"/>
+            <ns0:vAlign ns0:val="center"/>
+          </ns0:tcPr>
+          <ns0:p ns2:paraId="5E6447A0" ns2:textId="77777777" ns0:rsidR="00D616F3" ns0:rsidRPr="008B62CE" ns0:rsidRDefault="00D616F3" ns0:rsidP="00D616F3">
+            <ns0:pPr>
+              <ns0:ind ns0:left="360"/>
+              <ns0:rPr>
+                <ns0:b/>
+              </ns0:rPr>
+            </ns0:pPr>
+            <ns0:r>
+              <ns0:rPr>
+                <ns0:b/>
+              </ns0:rPr>
+              <ns0:t>ИТОГО с НДС, руб.</ns0:t>
+            </ns0:r>
+          </ns0:p>
+        </ns0:tc>
+        <ns0:tc>
+          <ns0:tcPr>
+            <ns0:tcW ns0:w="2474" ns0:type="dxa"/>
+            <ns0:vAlign ns0:val="center"/>
+          </ns0:tcPr>
+          <ns0:p ns2:paraId="481CB584" ns2:textId="77777777" ns0:rsidR="00D616F3" ns0:rsidRPr="008B62CE" ns0:rsidRDefault="00D616F3" ns0:rsidP="00D616F3">
+            <ns0:pPr>
+              <ns0:jc ns0:val="center"/>
+              <ns0:rPr>
+                <ns0:b/>
+              </ns0:rPr>
+            </ns0:pPr>
+            <ns0:r>
+              <ns0:rPr>
+                <ns0:b/>
+              </ns0:rPr>
+              <ns0:t>{{СПЕЦ_ИТОГО}}</ns0:t>
+            </ns0:r>
+          </ns0:p>
+        </ns0:tc>
+      </ns0:tr>
+    </ns0:tbl>
+    <ns0:p ns2:paraId="2BBD38E6" ns2:textId="77777777" ns0:rsidR="008613D9" ns0:rsidRPr="008B62CE" ns0:rsidRDefault="008613D9" ns0:rsidP="008613D9">
+      <ns0:pPr>
+        <ns0:tabs>
+          <ns0:tab ns0:val="left" ns0:pos="461"/>
+        </ns0:tabs>
+      </ns0:pPr>
+    </ns0:p>
+    <ns0:p ns2:paraId="153C9B76" ns2:textId="77777777" ns0:rsidR="00AF3DD5" ns0:rsidRPr="008B62CE" ns0:rsidRDefault="00AF3DD5" ns0:rsidP="00800433">
+      <ns0:pPr>
+        <ns0:pStyle ns0:val="af3"/>
+        <ns0:ind ns0:left="0"/>
+        <ns0:jc ns0:val="both"/>
+      </ns0:pPr>
+      <ns0:r>
+        <ns0:t xml:space="preserve">Итого по спецификации: {{СПЕЦ_ИТОГО}} ({{СПЕЦ_ИТОГО_ПРОПИСЬ}}) рублей, в </ns0:t>
+      </ns0:r>
+      <ns0:proofErr ns0:type="gramStart"/>
+      <ns0:r>
+        <ns0:t>т.ч.</ns0:t>
+      </ns0:r>
+      <ns0:proofErr ns0:type="gramEnd"/>
+      <ns0:r>
+        <ns0:t xml:space="preserve"> НДС {{СПЕЦ_НДС</ns0:t>
+      </ns0:r>
+      <ns0:proofErr ns0:type="gramStart"/>
+      <ns0:r>
+        <ns0:t>}}%</ns0:t>
+      </ns0:r>
+      <ns0:proofErr ns0:type="gramEnd"/>
+      <ns0:r>
+        <ns0:t>.</ns0:t>
+      </ns0:r>
+    </ns0:p>
+    <ns0:p ns2:paraId="5124B16B" ns2:textId="77777777" ns0:rsidR="00B86145" ns0:rsidRPr="008B62CE" ns0:rsidRDefault="00B86145" ns0:rsidP="00B86145">
+      <ns0:pPr>
+        <ns0:pStyle ns0:val="af3"/>
+        <ns0:ind ns0:left="0"/>
+        <ns0:jc ns0:val="both"/>
+      </ns0:pPr>
+    </ns0:p>
+    <ns0:p ns2:paraId="07B72E84" ns2:textId="77777777" ns0:rsidR="00AF3DD5" ns0:rsidRPr="008B62CE" ns0:rsidRDefault="00AF3DD5" ns0:rsidP="00800433">
+      <ns0:pPr>
+        <ns0:pStyle ns0:val="af3"/>
+        <ns0:numPr>
+          <ns0:ilvl ns0:val="0"/>
+          <ns0:numId ns0:val="1"/>
+        </ns0:numPr>
+      </ns0:pPr>
+      <ns0:r>
+        <ns0:t xml:space="preserve">Порядок оплаты: </ns0:t>
+      </ns0:r>
+    </ns0:p>
+    <ns0:p ns2:paraId="19802CDC" ns2:textId="77777777" ns0:rsidR="008A29C8" ns0:rsidRDefault="00000000">
+      <ns0:r>
+        <ns0:t>{{PAYMENT_SECTION}}</ns0:t>
+      </ns0:r>
+    </ns0:p>
+    <ns0:p ns2:paraId="6545C285" ns2:textId="77777777" ns0:rsidR="0051748C" ns0:rsidRPr="008B62CE" ns0:rsidRDefault="0051748C" ns0:rsidP="0051748C">
+      <ns0:pPr>
+        <ns0:pStyle ns0:val="af3"/>
+        <ns0:ind ns0:left="0"/>
+      </ns0:pPr>
+    </ns0:p>
+    <ns0:p ns2:paraId="404456E9" ns2:textId="77777777" ns0:rsidR="008613D9" ns0:rsidRPr="00AA6499" ns0:rsidRDefault="008613D9" ns0:rsidP="00246D4C">
+      <ns0:pPr>
+        <ns0:pStyle ns0:val="af3"/>
+        <ns0:numPr>
+          <ns0:ilvl ns0:val="0"/>
+          <ns0:numId ns0:val="1"/>
+        </ns0:numPr>
+        <ns0:jc ns0:val="both"/>
+      </ns0:pPr>
+      <ns0:r>
+        <ns0:t>Срок поставки Весов и выполнения Работ:</ns0:t>
+      </ns0:r>
+    </ns0:p>
+    <ns0:p ns2:paraId="18C70662" ns2:textId="77777777" ns0:rsidR="008A29C8" ns0:rsidRDefault="00000000">
+      <ns0:r>
+        <ns0:t>{{TERMS_SECTION}}</ns0:t>
+      </ns0:r>
+    </ns0:p>
+    <ns0:p ns2:paraId="264C99FF" ns2:textId="77777777" ns0:rsidR="002F68D1" ns0:rsidRPr="00AA6499" ns0:rsidRDefault="002F68D1" ns0:rsidP="002F68D1">
+      <ns0:pPr>
+        <ns0:tabs>
+          <ns0:tab ns0:val="left" ns0:pos="461"/>
+        </ns0:tabs>
+        <ns0:ind ns0:right="-142"/>
+        <ns0:contextualSpacing/>
+        <ns0:jc ns0:val="both"/>
+      </ns0:pPr>
+      <ns0:r>
+        <ns0:t>Выезд строительной и монтажной бригад на Объект работ осуществляется при соблюдении вышеперечисленных условий и получения Подрядчиком письменного уведомления от Заказчика о готовности принять на площадку монтажа специалистов Подрядчика.</ns0:t>
+      </ns0:r>
+    </ns0:p>
+    <ns0:p ns2:paraId="63BC8E8C" ns2:textId="77777777" ns0:rsidR="008A29C8" ns0:rsidRPr="00925360" ns0:rsidRDefault="00000000">
+      <ns0:pPr>
+        <ns0:rPr>
+          <ns0:lang ns0:val="en-US"/>
+        </ns0:rPr>
+      </ns0:pPr>
+      <ns0:r ns0:rsidRPr="00925360">
+        <ns0:rPr>
+          <ns0:lang ns0:val="en-US"/>
+        </ns0:rPr>
+        <ns0:t>{{</ns0:t>
+      </ns0:r>
+      <ns0:proofErr ns0:type="spellStart"/>
+      <ns0:r ns0:rsidRPr="00925360">
+        <ns0:rPr>
+          <ns0:lang ns0:val="en-US"/>
+        </ns0:rPr>
+        <ns0:t>CLAUSE_SECTION_obligations_supplier</ns0:t>
+      </ns0:r>
+      <ns0:proofErr ns0:type="spellEnd"/>
+      <ns0:r ns0:rsidRPr="00925360">
+        <ns0:rPr>
+          <ns0:lang ns0:val="en-US"/>
+        </ns0:rPr>
+        <ns0:t>}}</ns0:t>
+      </ns0:r>
+    </ns0:p>
+    <ns0:p ns2:paraId="53B57291" ns2:textId="77777777" ns0:rsidR="008A29C8" ns0:rsidRPr="00925360" ns0:rsidRDefault="00000000">
+      <ns0:pPr>
+        <ns0:rPr>
+          <ns0:lang ns0:val="en-US"/>
+        </ns0:rPr>
+      </ns0:pPr>
+      <ns0:r ns0:rsidRPr="00925360">
+        <ns0:rPr>
+          <ns0:lang ns0:val="en-US"/>
+        </ns0:rPr>
+        <ns0:t>{{</ns0:t>
+      </ns0:r>
+      <ns0:proofErr ns0:type="spellStart"/>
+      <ns0:r ns0:rsidRPr="00925360">
+        <ns0:rPr>
+          <ns0:lang ns0:val="en-US"/>
+        </ns0:rPr>
+        <ns0:t>CLAUSE_SECTION_obligations_customer</ns0:t>
+      </ns0:r>
+      <ns0:proofErr ns0:type="spellEnd"/>
+      <ns0:r ns0:rsidRPr="00925360">
+        <ns0:rPr>
+          <ns0:lang ns0:val="en-US"/>
+        </ns0:rPr>
+        <ns0:t>}}</ns0:t>
+      </ns0:r>
+    </ns0:p>
+    <ns0:p ns2:paraId="72F8F91E" ns2:textId="77777777" ns0:rsidR="008A29C8" ns0:rsidRPr="00925360" ns0:rsidRDefault="00000000">
+      <ns0:pPr>
+        <ns0:rPr>
+          <ns0:lang ns0:val="en-US"/>
+        </ns0:rPr>
+      </ns0:pPr>
+      <ns0:r ns0:rsidRPr="00925360">
+        <ns0:rPr>
+          <ns0:lang ns0:val="en-US"/>
+        </ns0:rPr>
+        <ns0:t>{{</ns0:t>
+      </ns0:r>
+      <ns0:proofErr ns0:type="spellStart"/>
+      <ns0:r ns0:rsidRPr="00925360">
+        <ns0:rPr>
+          <ns0:lang ns0:val="en-US"/>
+        </ns0:rPr>
+        <ns0:t>CLAUSE_SECTION_special_conditions</ns0:t>
+      </ns0:r>
+      <ns0:proofErr ns0:type="spellEnd"/>
+      <ns0:r ns0:rsidRPr="00925360">
+        <ns0:rPr>
+          <ns0:lang ns0:val="en-US"/>
+        </ns0:rPr>
+        <ns0:t>}}</ns0:t>
+      </ns0:r>
+    </ns0:p>
+    <ns0:p ns2:paraId="5479E8EF" ns2:textId="77777777" ns0:rsidR="008A29C8" ns0:rsidRPr="00925360" ns0:rsidRDefault="00000000">
+      <ns0:pPr>
+        <ns0:rPr>
+          <ns0:lang ns0:val="en-US"/>
+        </ns0:rPr>
+      </ns0:pPr>
+      <ns0:r ns0:rsidRPr="00925360">
+        <ns0:rPr>
+          <ns0:lang ns0:val="en-US"/>
+        </ns0:rPr>
+        <ns0:t>{{</ns0:t>
+      </ns0:r>
+      <ns0:proofErr ns0:type="spellStart"/>
+      <ns0:r ns0:rsidRPr="00925360">
+        <ns0:rPr>
+          <ns0:lang ns0:val="en-US"/>
+        </ns0:rPr>
+        <ns0:t>CLAUSE_SECTION_final</ns0:t>
+      </ns0:r>
+      <ns0:proofErr ns0:type="spellEnd"/>
+      <ns0:r ns0:rsidRPr="00925360">
+        <ns0:rPr>
+          <ns0:lang ns0:val="en-US"/>
+        </ns0:rPr>
+        <ns0:t>}}</ns0:t>
+      </ns0:r>
+    </ns0:p>
+    <ns0:p ns2:paraId="63EA0E89" ns2:textId="77777777" ns0:rsidR="00800433" ns0:rsidRPr="00AA6499" ns0:rsidRDefault="005E49D1" ns0:rsidP="00800433">
+      <ns0:pPr>
+        <ns0:pStyle ns0:val="af3"/>
+        <ns0:keepNext/>
+        <ns0:pageBreakBefore/>
+        <ns0:tabs>
+          <ns0:tab ns0:val="left" ns0:pos="461"/>
+        </ns0:tabs>
+      </ns0:pPr>
+      <ns0:r>
+        <ns0:rPr>
+          <ns0:bCs/>
+        </ns0:rPr>
+        <ns0:lastRenderedPageBreak/>
+        <ns0:t>{{ТТХ_НОМЕР}}. Технические характеристики весов {{СПЕЦ_МОДЕЛЬ_КРАТКОЕ}}</ns0:t>
+      </ns0:r>
+    </ns0:p>
+    <ns0:p ns2:paraId="253C8553" ns2:textId="77777777" ns0:rsidR="00143A36" ns0:rsidRPr="00AA6499" ns0:rsidRDefault="00143A36">
+      <ns0:pPr>
+        <ns0:pStyle ns0:val="ab"/>
+        <ns0:keepNext/>
+        <ns0:spacing ns0:after="0"/>
+        <ns0:jc ns0:val="center"/>
+        <ns0:rPr>
+          <ns0:b/>
+        </ns0:rPr>
+      </ns0:pPr>
+    </ns0:p>
+    <ns0:tbl>
+      <ns0:tblPr>
+        <ns0:tblW ns0:w="10071" ns0:type="dxa"/>
+        <ns0:tblBorders>
+          <ns0:top ns0:val="single" ns0:sz="4" ns0:space="0" ns0:color="auto"/>
+          <ns0:left ns0:val="single" ns0:sz="4" ns0:space="0" ns0:color="auto"/>
+          <ns0:bottom ns0:val="single" ns0:sz="4" ns0:space="0" ns0:color="auto"/>
+          <ns0:right ns0:val="single" ns0:sz="4" ns0:space="0" ns0:color="auto"/>
+          <ns0:insideH ns0:val="single" ns0:sz="4" ns0:space="0" ns0:color="auto"/>
+          <ns0:insideV ns0:val="single" ns0:sz="4" ns0:space="0" ns0:color="auto"/>
+        </ns0:tblBorders>
+        <ns0:tblLook ns0:val="0000" ns0:firstRow="0" ns0:lastRow="0" ns0:firstColumn="0" ns0:lastColumn="0" ns0:noHBand="0" ns0:noVBand="0"/>
+      </ns0:tblPr>
+      <ns0:tblGrid>
+        <ns0:gridCol ns0:w="627"/>
+        <ns0:gridCol ns0:w="4507"/>
+        <ns0:gridCol ns0:w="4937"/>
+      </ns0:tblGrid>
+      <ns0:tr ns0:rsidR="008B62CE" ns0:rsidRPr="00AA6499" ns2:paraId="794BAD95" ns2:textId="77777777">
+        <ns0:trPr>
+          <ns0:cantSplit/>
+          <ns0:trHeight ns0:val="591"/>
+        </ns0:trPr>
+        <ns0:tc>
+          <ns0:tcPr>
+            <ns0:tcW ns0:w="647" ns0:type="dxa"/>
+            <ns0:tcBorders>
+              <ns0:top ns0:val="single" ns0:sz="4" ns0:space="0" ns0:color="auto"/>
+              <ns0:left ns0:val="single" ns0:sz="4" ns0:space="0" ns0:color="auto"/>
+              <ns0:bottom ns0:val="single" ns0:sz="4" ns0:space="0" ns0:color="auto"/>
+              <ns0:right ns0:val="single" ns0:sz="4" ns0:space="0" ns0:color="auto"/>
+            </ns0:tcBorders>
+            <ns0:vAlign ns0:val="center"/>
+          </ns0:tcPr>
+          <ns0:p ns2:paraId="1DD375AE" ns2:textId="77777777" ns0:rsidR="001575C0" ns0:rsidRPr="00AA6499" ns0:rsidRDefault="005E49D1">
+            <ns0:pPr>
+              <ns0:keepNext/>
+              <ns0:jc ns0:val="center"/>
+              <ns0:rPr>
+                <ns0:b/>
+              </ns0:rPr>
+            </ns0:pPr>
+            <ns0:r>
+              <ns0:rPr>
+                <ns0:b/>
+              </ns0:rPr>
+              <ns0:t xml:space="preserve">№ </ns0:t>
+            </ns0:r>
+            <ns0:proofErr ns0:type="spellStart"/>
+            <ns0:r>
+              <ns0:rPr>
+                <ns0:b/>
+              </ns0:rPr>
+              <ns0:t>п.п</ns0:t>
+            </ns0:r>
+            <ns0:proofErr ns0:type="spellEnd"/>
+            <ns0:r>
+              <ns0:rPr>
+                <ns0:b/>
+              </ns0:rPr>
+              <ns0:t>.</ns0:t>
+            </ns0:r>
+          </ns0:p>
+        </ns0:tc>
+        <ns0:tc>
+          <ns0:tcPr>
+            <ns0:tcW ns0:w="7021" ns0:type="dxa"/>
+            <ns0:tcBorders>
+              <ns0:top ns0:val="single" ns0:sz="4" ns0:space="0" ns0:color="auto"/>
+              <ns0:left ns0:val="single" ns0:sz="4" ns0:space="0" ns0:color="auto"/>
+              <ns0:bottom ns0:val="single" ns0:sz="4" ns0:space="0" ns0:color="auto"/>
+              <ns0:right ns0:val="single" ns0:sz="4" ns0:space="0" ns0:color="auto"/>
+            </ns0:tcBorders>
+            <ns0:vAlign ns0:val="center"/>
+          </ns0:tcPr>
+          <ns0:p ns2:paraId="54565459" ns2:textId="77777777" ns0:rsidR="001575C0" ns0:rsidRPr="00AA6499" ns0:rsidRDefault="005E49D1">
+            <ns0:pPr>
+              <ns0:keepNext/>
+              <ns0:jc ns0:val="center"/>
+              <ns0:rPr>
+                <ns0:b/>
+              </ns0:rPr>
+            </ns0:pPr>
+            <ns0:r>
+              <ns0:rPr>
+                <ns0:b/>
+              </ns0:rPr>
+              <ns0:t>НАИМЕНОВАНИЕ ПОКАЗАТЕЛЯ</ns0:t>
+            </ns0:r>
+          </ns0:p>
+        </ns0:tc>
+        <ns0:tc>
+          <ns0:tcPr>
+            <ns0:tcW ns0:w="2403" ns0:type="dxa"/>
+            <ns0:tcBorders>
+              <ns0:top ns0:val="single" ns0:sz="4" ns0:space="0" ns0:color="auto"/>
+              <ns0:left ns0:val="single" ns0:sz="4" ns0:space="0" ns0:color="auto"/>
+              <ns0:bottom ns0:val="single" ns0:sz="4" ns0:space="0" ns0:color="auto"/>
+              <ns0:right ns0:val="single" ns0:sz="4" ns0:space="0" ns0:color="auto"/>
+            </ns0:tcBorders>
+            <ns0:vAlign ns0:val="center"/>
+          </ns0:tcPr>
+          <ns0:p ns2:paraId="0EEEC6C2" ns2:textId="77777777" ns0:rsidR="001575C0" ns0:rsidRPr="00AA6499" ns0:rsidRDefault="005E49D1">
+            <ns0:pPr>
+              <ns0:pStyle ns0:val="20"/>
+              <ns0:tabs>
+                <ns0:tab ns0:val="left" ns0:pos="708"/>
+              </ns0:tabs>
+              <ns0:spacing ns0:before="0" ns0:after="0"/>
+              <ns0:jc ns0:val="center"/>
+              <ns0:rPr>
+                <ns0:rFonts ns0:ascii="Times New Roman" ns0:hAnsi="Times New Roman" ns0:cs="Times New Roman"/>
+                <ns0:i ns0:val="0"/>
+                <ns0:sz ns0:val="24"/>
+                <ns0:szCs ns0:val="24"/>
+              </ns0:rPr>
+            </ns0:pPr>
+            <ns0:r>
+              <ns0:rPr>
+                <ns0:rFonts ns0:ascii="Times New Roman" ns0:hAnsi="Times New Roman" ns0:cs="Times New Roman"/>
+                <ns0:i ns0:val="0"/>
+                <ns0:sz ns0:val="24"/>
+                <ns0:szCs ns0:val="24"/>
+              </ns0:rPr>
+              <ns0:t>ЗНАЧЕНИЕ ПОКАЗАТЕЛЯ</ns0:t>
+            </ns0:r>
+          </ns0:p>
+        </ns0:tc>
+      </ns0:tr>
+      <ns0:tr ns0:rsidR="008B62CE" ns0:rsidRPr="00AA6499" ns2:paraId="2FE84C6E" ns2:textId="77777777">
+        <ns0:trPr>
+          <ns0:cantSplit/>
+          <ns0:trHeight ns0:val="336"/>
+        </ns0:trPr>
+        <ns0:tc>
+          <ns0:tcPr>
+            <ns0:tcW ns0:w="647" ns0:type="dxa"/>
+            <ns0:tcBorders>
+              <ns0:top ns0:val="single" ns0:sz="4" ns0:space="0" ns0:color="auto"/>
+              <ns0:left ns0:val="single" ns0:sz="4" ns0:space="0" ns0:color="auto"/>
+              <ns0:bottom ns0:val="single" ns0:sz="4" ns0:space="0" ns0:color="auto"/>
+              <ns0:right ns0:val="single" ns0:sz="4" ns0:space="0" ns0:color="auto"/>
+            </ns0:tcBorders>
+            <ns0:vAlign ns0:val="center"/>
+          </ns0:tcPr>
+          <ns0:p ns2:paraId="674F144E" ns2:textId="77777777" ns0:rsidR="001575C0" ns0:rsidRPr="00AA6499" ns0:rsidRDefault="001F1E2F">
+            <ns0:pPr>
+              <ns0:keepNext/>
+              <ns0:jc ns0:val="center"/>
+            </ns0:pPr>
+            <ns0:r>
+              <ns0:t>1.</ns0:t>
+            </ns0:r>
+          </ns0:p>
+        </ns0:tc>
+        <ns0:tc>
+          <ns0:tcPr>
+            <ns0:tcW ns0:w="7021" ns0:type="dxa"/>
+            <ns0:tcBorders>
+              <ns0:top ns0:val="single" ns0:sz="4" ns0:space="0" ns0:color="auto"/>
+              <ns0:left ns0:val="single" ns0:sz="4" ns0:space="0" ns0:color="auto"/>
+              <ns0:bottom ns0:val="single" ns0:sz="4" ns0:space="0" ns0:color="auto"/>
+              <ns0:right ns0:val="single" ns0:sz="4" ns0:space="0" ns0:color="auto"/>
+            </ns0:tcBorders>
+          </ns0:tcPr>
+          <ns0:p ns2:paraId="5FCAD2D2" ns2:textId="77777777" ns0:rsidR="001575C0" ns0:rsidRPr="00AA6499" ns0:rsidRDefault="005E49D1">
+            <ns0:pPr>
+              <ns0:pStyle ns0:val="20"/>
+              <ns0:tabs>
+                <ns0:tab ns0:val="left" ns0:pos="708"/>
+              </ns0:tabs>
+              <ns0:spacing ns0:before="0" ns0:after="0"/>
+              <ns0:rPr>
+                <ns0:rFonts ns0:ascii="Times New Roman" ns0:hAnsi="Times New Roman" ns0:cs="Times New Roman"/>
+                <ns0:b ns0:val="0"/>
+                <ns0:i ns0:val="0"/>
+                <ns0:sz ns0:val="24"/>
+                <ns0:szCs ns0:val="24"/>
+              </ns0:rPr>
+            </ns0:pPr>
+            <ns0:r>
+              <ns0:rPr>
+                <ns0:rFonts ns0:ascii="Times New Roman" ns0:hAnsi="Times New Roman" ns0:cs="Times New Roman"/>
+                <ns0:b ns0:val="0"/>
+                <ns0:i ns0:val="0"/>
+                <ns0:sz ns0:val="24"/>
+                <ns0:szCs ns0:val="24"/>
+              </ns0:rPr>
+              <ns0:t>Максимальная нагрузка, т</ns0:t>
+            </ns0:r>
+          </ns0:p>
+        </ns0:tc>
+        <ns0:tc>
+          <ns0:tcPr>
+            <ns0:tcW ns0:w="2403" ns0:type="dxa"/>
+            <ns0:tcBorders>
+              <ns0:top ns0:val="single" ns0:sz="4" ns0:space="0" ns0:color="auto"/>
+              <ns0:left ns0:val="single" ns0:sz="4" ns0:space="0" ns0:color="auto"/>
+              <ns0:bottom ns0:val="single" ns0:sz="4" ns0:space="0" ns0:color="auto"/>
+              <ns0:right ns0:val="single" ns0:sz="4" ns0:space="0" ns0:color="auto"/>
+            </ns0:tcBorders>
+            <ns0:vAlign ns0:val="center"/>
+          </ns0:tcPr>
+          <ns0:p ns2:paraId="03069E01" ns2:textId="77777777" ns0:rsidR="001575C0" ns0:rsidRPr="00AA6499" ns0:rsidRDefault="00143A36">
+            <ns0:pPr>
+              <ns0:keepNext/>
+              <ns0:jc ns0:val="center"/>
+              <ns0:rPr>
+                <ns0:lang ns0:val="en-US"/>
+              </ns0:rPr>
+            </ns0:pPr>
+            <ns0:r>
+              <ns0:t>{{СПЕЦ_МАКС_НАГРУЗКА}}</ns0:t>
+            </ns0:r>
+          </ns0:p>
+        </ns0:tc>
+      </ns0:tr>
+      <ns0:tr ns0:rsidR="008B62CE" ns0:rsidRPr="00AA6499" ns2:paraId="54FE40A6" ns2:textId="77777777">
+        <ns0:trPr>
+          <ns0:cantSplit/>
+        </ns0:trPr>
+        <ns0:tc>
+          <ns0:tcPr>
+            <ns0:tcW ns0:w="647" ns0:type="dxa"/>
+            <ns0:tcBorders>
+              <ns0:top ns0:val="single" ns0:sz="4" ns0:space="0" ns0:color="auto"/>
+              <ns0:left ns0:val="single" ns0:sz="4" ns0:space="0" ns0:color="auto"/>
+              <ns0:bottom ns0:val="single" ns0:sz="4" ns0:space="0" ns0:color="auto"/>
+              <ns0:right ns0:val="single" ns0:sz="4" ns0:space="0" ns0:color="auto"/>
+            </ns0:tcBorders>
+            <ns0:vAlign ns0:val="center"/>
+          </ns0:tcPr>
+          <ns0:p ns2:paraId="7DC8D70D" ns2:textId="77777777" ns0:rsidR="001F1E2F" ns0:rsidRPr="00AA6499" ns0:rsidRDefault="001F1E2F" ns0:rsidP="001F1E2F">
+            <ns0:pPr>
+              <ns0:keepNext/>
+              <ns0:jc ns0:val="center"/>
+            </ns0:pPr>
+            <ns0:r>
+              <ns0:t>2.</ns0:t>
+            </ns0:r>
+          </ns0:p>
+        </ns0:tc>
+        <ns0:tc>
+          <ns0:tcPr>
+            <ns0:tcW ns0:w="7021" ns0:type="dxa"/>
+            <ns0:tcBorders>
+              <ns0:top ns0:val="single" ns0:sz="4" ns0:space="0" ns0:color="auto"/>
+              <ns0:left ns0:val="single" ns0:sz="4" ns0:space="0" ns0:color="auto"/>
+              <ns0:bottom ns0:val="single" ns0:sz="4" ns0:space="0" ns0:color="auto"/>
+              <ns0:right ns0:val="single" ns0:sz="4" ns0:space="0" ns0:color="auto"/>
+            </ns0:tcBorders>
+          </ns0:tcPr>
+          <ns0:p ns2:paraId="1CEEFC52" ns2:textId="77777777" ns0:rsidR="001F1E2F" ns0:rsidRPr="00AA6499" ns0:rsidRDefault="001F1E2F" ns0:rsidP="001F1E2F">
+            <ns0:pPr>
+              <ns0:keepNext/>
+            </ns0:pPr>
+            <ns0:r>
+              <ns0:t>Наибольшая нагрузка на ось, т</ns0:t>
+            </ns0:r>
+          </ns0:p>
+        </ns0:tc>
+        <ns0:tc>
+          <ns0:tcPr>
+            <ns0:tcW ns0:w="2403" ns0:type="dxa"/>
+            <ns0:tcBorders>
+              <ns0:top ns0:val="single" ns0:sz="4" ns0:space="0" ns0:color="auto"/>
+              <ns0:left ns0:val="single" ns0:sz="4" ns0:space="0" ns0:color="auto"/>
+              <ns0:bottom ns0:val="single" ns0:sz="4" ns0:space="0" ns0:color="auto"/>
+              <ns0:right ns0:val="single" ns0:sz="4" ns0:space="0" ns0:color="auto"/>
+            </ns0:tcBorders>
+            <ns0:vAlign ns0:val="center"/>
+          </ns0:tcPr>
+          <ns0:p ns2:paraId="17528D2A" ns2:textId="77777777" ns0:rsidR="001F1E2F" ns0:rsidRPr="00AA6499" ns0:rsidRDefault="001F1E2F" ns0:rsidP="001F1E2F">
+            <ns0:pPr>
+              <ns0:keepNext/>
+              <ns0:jc ns0:val="center"/>
+            </ns0:pPr>
+            <ns0:r>
+              <ns0:t>{{ТТХ_НАГРУЗКА_НА_ОСЬ}}</ns0:t>
+            </ns0:r>
+          </ns0:p>
+        </ns0:tc>
+      </ns0:tr>
+      <ns0:tr ns0:rsidR="008B62CE" ns0:rsidRPr="00AA6499" ns2:paraId="56909017" ns2:textId="77777777">
+        <ns0:trPr>
+          <ns0:cantSplit/>
+        </ns0:trPr>
+        <ns0:tc>
+          <ns0:tcPr>
+            <ns0:tcW ns0:w="647" ns0:type="dxa"/>
+            <ns0:tcBorders>
+              <ns0:top ns0:val="single" ns0:sz="4" ns0:space="0" ns0:color="auto"/>
+              <ns0:left ns0:val="single" ns0:sz="4" ns0:space="0" ns0:color="auto"/>
+              <ns0:bottom ns0:val="single" ns0:sz="4" ns0:space="0" ns0:color="auto"/>
+              <ns0:right ns0:val="single" ns0:sz="4" ns0:space="0" ns0:color="auto"/>
+            </ns0:tcBorders>
+            <ns0:vAlign ns0:val="center"/>
+          </ns0:tcPr>
+          <ns0:p ns2:paraId="39030994" ns2:textId="77777777" ns0:rsidR="001F1E2F" ns0:rsidRPr="00AA6499" ns0:rsidRDefault="001F1E2F" ns0:rsidP="001F1E2F">
+            <ns0:pPr>
+              <ns0:keepNext/>
+              <ns0:jc ns0:val="center"/>
+            </ns0:pPr>
+            <ns0:r>
+              <ns0:t>3.</ns0:t>
+            </ns0:r>
+          </ns0:p>
+        </ns0:tc>
+        <ns0:tc>
+          <ns0:tcPr>
+            <ns0:tcW ns0:w="7021" ns0:type="dxa"/>
+            <ns0:tcBorders>
+              <ns0:top ns0:val="single" ns0:sz="4" ns0:space="0" ns0:color="auto"/>
+              <ns0:left ns0:val="single" ns0:sz="4" ns0:space="0" ns0:color="auto"/>
+              <ns0:bottom ns0:val="single" ns0:sz="4" ns0:space="0" ns0:color="auto"/>
+              <ns0:right ns0:val="single" ns0:sz="4" ns0:space="0" ns0:color="auto"/>
+            </ns0:tcBorders>
+          </ns0:tcPr>
+          <ns0:p ns2:paraId="44935479" ns2:textId="77777777" ns0:rsidR="001F1E2F" ns0:rsidRPr="00AA6499" ns0:rsidRDefault="001F1E2F" ns0:rsidP="001F1E2F">
+            <ns0:pPr>
+              <ns0:keepNext/>
+            </ns0:pPr>
+            <ns0:r>
+              <ns0:t>Расстояние от платформы весов до весового терминала, м</ns0:t>
+            </ns0:r>
+          </ns0:p>
+        </ns0:tc>
+        <ns0:tc>
+          <ns0:tcPr>
+            <ns0:tcW ns0:w="2403" ns0:type="dxa"/>
+            <ns0:tcBorders>
+              <ns0:top ns0:val="single" ns0:sz="4" ns0:space="0" ns0:color="auto"/>
+              <ns0:left ns0:val="single" ns0:sz="4" ns0:space="0" ns0:color="auto"/>
+              <ns0:bottom ns0:val="single" ns0:sz="4" ns0:space="0" ns0:color="auto"/>
+              <ns0:right ns0:val="single" ns0:sz="4" ns0:space="0" ns0:color="auto"/>
+            </ns0:tcBorders>
+            <ns0:vAlign ns0:val="center"/>
+          </ns0:tcPr>
+          <ns0:p ns2:paraId="631C7A66" ns2:textId="77777777" ns0:rsidR="001F1E2F" ns0:rsidRPr="00AA6499" ns0:rsidRDefault="002A33C2" ns0:rsidP="001F1E2F">
+            <ns0:pPr>
+              <ns0:keepNext/>
+              <ns0:jc ns0:val="center"/>
+            </ns0:pPr>
+            <ns0:r>
+              <ns0:t>{{ТТХ_РАССТОЯНИЕ_ДО_ТЕРМИНАЛА}}</ns0:t>
+            </ns0:r>
+          </ns0:p>
+        </ns0:tc>
+      </ns0:tr>
+      <ns0:tr ns0:rsidR="008B62CE" ns0:rsidRPr="00AA6499" ns2:paraId="6F01C960" ns2:textId="77777777">
+        <ns0:trPr>
+          <ns0:cantSplit/>
+        </ns0:trPr>
+        <ns0:tc>
+          <ns0:tcPr>
+            <ns0:tcW ns0:w="647" ns0:type="dxa"/>
+            <ns0:tcBorders>
+              <ns0:top ns0:val="single" ns0:sz="4" ns0:space="0" ns0:color="auto"/>
+              <ns0:left ns0:val="single" ns0:sz="4" ns0:space="0" ns0:color="auto"/>
+              <ns0:bottom ns0:val="single" ns0:sz="4" ns0:space="0" ns0:color="auto"/>
+              <ns0:right ns0:val="single" ns0:sz="4" ns0:space="0" ns0:color="auto"/>
+            </ns0:tcBorders>
+            <ns0:vAlign ns0:val="center"/>
+          </ns0:tcPr>
+          <ns0:p ns2:paraId="02F4B7EC" ns2:textId="77777777" ns0:rsidR="001F1E2F" ns0:rsidRPr="00AA6499" ns0:rsidRDefault="001F1E2F" ns0:rsidP="001F1E2F">
+            <ns0:pPr>
+              <ns0:keepNext/>
+              <ns0:jc ns0:val="center"/>
+            </ns0:pPr>
+            <ns0:r>
+              <ns0:t>4.</ns0:t>
+            </ns0:r>
+          </ns0:p>
+        </ns0:tc>
+        <ns0:tc>
+          <ns0:tcPr>
+            <ns0:tcW ns0:w="7021" ns0:type="dxa"/>
+            <ns0:tcBorders>
+              <ns0:top ns0:val="single" ns0:sz="4" ns0:space="0" ns0:color="auto"/>
+              <ns0:left ns0:val="single" ns0:sz="4" ns0:space="0" ns0:color="auto"/>
+              <ns0:bottom ns0:val="single" ns0:sz="4" ns0:space="0" ns0:color="auto"/>
+              <ns0:right ns0:val="single" ns0:sz="4" ns0:space="0" ns0:color="auto"/>
+            </ns0:tcBorders>
+          </ns0:tcPr>
+          <ns0:p ns2:paraId="01408BFD" ns2:textId="77777777" ns0:rsidR="001F1E2F" ns0:rsidRPr="00AA6499" ns0:rsidRDefault="001F1E2F" ns0:rsidP="001F1E2F">
+            <ns0:pPr>
+              <ns0:keepNext/>
+            </ns0:pPr>
+            <ns0:r>
+              <ns0:t>Требуемая дискретность отсчета или цена поверочного деления при эксплуатации, кг:</ns0:t>
+            </ns0:r>
+          </ns0:p>
+          <ns0:p ns2:paraId="244725AE" ns2:textId="77777777" ns0:rsidR="001F1E2F" ns0:rsidRPr="00AA6499" ns0:rsidRDefault="001F1E2F" ns0:rsidP="001F1E2F">
+            <ns0:pPr>
+              <ns0:keepNext/>
+            </ns0:pPr>
+            <ns0:r>
+              <ns0:t>- от 0 до {{ТТХ_ГРАНИЦА_1</ns0:t>
+            </ns0:r>
+            <ns0:proofErr ns0:type="gramStart"/>
+            <ns0:r>
+              <ns0:t>}}т</ns0:t>
+            </ns0:r>
+            <ns0:proofErr ns0:type="gramEnd"/>
+          </ns0:p>
+          <ns0:p ns2:paraId="587D5A99" ns2:textId="77777777" ns0:rsidR="001F1E2F" ns0:rsidRPr="00AA6499" ns0:rsidRDefault="001F1E2F" ns0:rsidP="001F1E2F">
+            <ns0:pPr>
+              <ns0:keepNext/>
+            </ns0:pPr>
+            <ns0:r>
+              <ns0:t>- от {{ТТХ_ГРАНИЦА_1}} до {{ТТХ_ГРАНИЦА_2</ns0:t>
+            </ns0:r>
+            <ns0:proofErr ns0:type="gramStart"/>
+            <ns0:r>
+              <ns0:t>}}т</ns0:t>
+            </ns0:r>
+            <ns0:proofErr ns0:type="gramEnd"/>
+          </ns0:p>
+        </ns0:tc>
+        <ns0:tc>
+          <ns0:tcPr>
+            <ns0:tcW ns0:w="2403" ns0:type="dxa"/>
+            <ns0:tcBorders>
+              <ns0:top ns0:val="single" ns0:sz="4" ns0:space="0" ns0:color="auto"/>
+              <ns0:left ns0:val="single" ns0:sz="4" ns0:space="0" ns0:color="auto"/>
+              <ns0:bottom ns0:val="single" ns0:sz="4" ns0:space="0" ns0:color="auto"/>
+              <ns0:right ns0:val="single" ns0:sz="4" ns0:space="0" ns0:color="auto"/>
+            </ns0:tcBorders>
+            <ns0:vAlign ns0:val="center"/>
+          </ns0:tcPr>
+          <ns0:p ns2:paraId="4134C59E" ns2:textId="77777777" ns0:rsidR="00925360" ns0:rsidRPr="0082132B" ns0:rsidRDefault="00925360" ns0:rsidP="001F1E2F">
+            <ns0:pPr>
+              <ns0:keepNext/>
+              <ns0:jc ns0:val="center"/>
+            </ns0:pPr>
+          </ns0:p>
+          <ns0:p ns2:paraId="059948A3" ns2:textId="77777777" ns0:rsidR="0082132B" ns0:rsidRDefault="0082132B" ns0:rsidP="001F1E2F">
+            <ns0:pPr>
+              <ns0:keepNext/>
+              <ns0:jc ns0:val="center"/>
+            </ns0:pPr>
+          </ns0:p>
+          <ns0:p ns2:paraId="5C0976D6" ns2:textId="7D537415" ns0:rsidR="001F1E2F" ns0:rsidRPr="00AA6499" ns0:rsidRDefault="001F1E2F" ns0:rsidP="001F1E2F">
+            <ns0:pPr>
+              <ns0:keepNext/>
+              <ns0:jc ns0:val="center"/>
+            </ns0:pPr>
+            <ns0:r>
+              <ns0:t>{{ТТХ_ДИСКРЕТНОСТЬ_1}}</ns0:t>
+            </ns0:r>
+          </ns0:p>
+          <ns0:p ns2:paraId="7220CA67" ns2:textId="3B83DFFF" ns0:rsidR="008A29C8" ns0:rsidRDefault="00925360">
+            <ns0:r>
+              <ns0:rPr>
+                <ns0:lang ns0:val="en-US"/>
+              </ns0:rPr>
+              <ns0:t xml:space="preserve">             </ns0:t>
+            </ns0:r>
+            <ns0:r>
+              <ns0:t>{{ТТХ_ДИСКРЕТНОСТЬ_2}}</ns0:t>
+            </ns0:r>
+          </ns0:p>
+        </ns0:tc>
+      </ns0:tr>
+      <ns0:tr ns0:rsidR="008B62CE" ns0:rsidRPr="00AA6499" ns2:paraId="7FFD9A02" ns2:textId="77777777">
+        <ns0:trPr>
+          <ns0:cantSplit/>
+        </ns0:trPr>
+        <ns0:tc>
+          <ns0:tcPr>
+            <ns0:tcW ns0:w="647" ns0:type="dxa"/>
+            <ns0:tcBorders>
+              <ns0:top ns0:val="single" ns0:sz="4" ns0:space="0" ns0:color="auto"/>
+              <ns0:left ns0:val="single" ns0:sz="4" ns0:space="0" ns0:color="auto"/>
+              <ns0:bottom ns0:val="single" ns0:sz="4" ns0:space="0" ns0:color="auto"/>
+              <ns0:right ns0:val="single" ns0:sz="4" ns0:space="0" ns0:color="auto"/>
+            </ns0:tcBorders>
+            <ns0:vAlign ns0:val="center"/>
+          </ns0:tcPr>
+          <ns0:p ns2:paraId="329760BC" ns2:textId="77777777" ns0:rsidR="001F1E2F" ns0:rsidRPr="00AA6499" ns0:rsidRDefault="001F1E2F" ns0:rsidP="001F1E2F">
+            <ns0:pPr>
+              <ns0:keepNext/>
+              <ns0:jc ns0:val="center"/>
+            </ns0:pPr>
+            <ns0:r>
+              <ns0:t>5.</ns0:t>
+            </ns0:r>
+          </ns0:p>
+        </ns0:tc>
+        <ns0:tc>
+          <ns0:tcPr>
+            <ns0:tcW ns0:w="7021" ns0:type="dxa"/>
+            <ns0:tcBorders>
+              <ns0:top ns0:val="single" ns0:sz="4" ns0:space="0" ns0:color="auto"/>
+              <ns0:left ns0:val="single" ns0:sz="4" ns0:space="0" ns0:color="auto"/>
+              <ns0:bottom ns0:val="single" ns0:sz="4" ns0:space="0" ns0:color="auto"/>
+              <ns0:right ns0:val="single" ns0:sz="4" ns0:space="0" ns0:color="auto"/>
+            </ns0:tcBorders>
+            <ns0:vAlign ns0:val="center"/>
+          </ns0:tcPr>
+          <ns0:p ns2:paraId="7466E5AF" ns2:textId="77777777" ns0:rsidR="001F1E2F" ns0:rsidRPr="00AA6499" ns0:rsidRDefault="001F1E2F" ns0:rsidP="001F1E2F">
+            <ns0:pPr>
+              <ns0:keepNext/>
+            </ns0:pPr>
+            <ns0:r>
+              <ns0:t xml:space="preserve">Габаритные размеры грузоприемной платформы, м </ns0:t>
+            </ns0:r>
+          </ns0:p>
+        </ns0:tc>
+        <ns0:tc>
+          <ns0:tcPr>
+            <ns0:tcW ns0:w="2403" ns0:type="dxa"/>
+            <ns0:tcBorders>
+              <ns0:top ns0:val="single" ns0:sz="4" ns0:space="0" ns0:color="auto"/>
+              <ns0:left ns0:val="single" ns0:sz="4" ns0:space="0" ns0:color="auto"/>
+              <ns0:bottom ns0:val="single" ns0:sz="4" ns0:space="0" ns0:color="auto"/>
+              <ns0:right ns0:val="single" ns0:sz="4" ns0:space="0" ns0:color="auto"/>
+            </ns0:tcBorders>
+            <ns0:vAlign ns0:val="center"/>
+          </ns0:tcPr>
+          <ns0:p ns2:paraId="2A865F2A" ns2:textId="77777777" ns0:rsidR="001F1E2F" ns0:rsidRPr="00AA6499" ns0:rsidRDefault="001F1E2F" ns0:rsidP="001F1E2F">
+            <ns0:pPr>
+              <ns0:keepNext/>
+              <ns0:jc ns0:val="center"/>
+            </ns0:pPr>
+            <ns0:r>
+              <ns0:t>{{ТТХ_ГАБАРИТЫ}}</ns0:t>
+            </ns0:r>
+          </ns0:p>
+        </ns0:tc>
+      </ns0:tr>
+      <ns0:tr ns0:rsidR="008B62CE" ns0:rsidRPr="00AA6499" ns2:paraId="131B4485" ns2:textId="77777777" ns0:rsidTr="005B0EE5">
+        <ns0:trPr>
+          <ns0:cantSplit/>
+        </ns0:trPr>
+        <ns0:tc>
+          <ns0:tcPr>
+            <ns0:tcW ns0:w="647" ns0:type="dxa"/>
+            <ns0:tcBorders>
+              <ns0:top ns0:val="single" ns0:sz="4" ns0:space="0" ns0:color="auto"/>
+              <ns0:left ns0:val="single" ns0:sz="4" ns0:space="0" ns0:color="auto"/>
+              <ns0:bottom ns0:val="single" ns0:sz="4" ns0:space="0" ns0:color="auto"/>
+              <ns0:right ns0:val="single" ns0:sz="4" ns0:space="0" ns0:color="auto"/>
+            </ns0:tcBorders>
+            <ns0:vAlign ns0:val="center"/>
+          </ns0:tcPr>
+          <ns0:p ns2:paraId="3F0A3111" ns2:textId="77777777" ns0:rsidR="001F1E2F" ns0:rsidRPr="00AA6499" ns0:rsidRDefault="001F1E2F" ns0:rsidP="001F1E2F">
+            <ns0:pPr>
+              <ns0:keepNext/>
+              <ns0:jc ns0:val="center"/>
+            </ns0:pPr>
+            <ns0:r>
+              <ns0:t>6.</ns0:t>
+            </ns0:r>
+          </ns0:p>
+        </ns0:tc>
+        <ns0:tc>
+          <ns0:tcPr>
+            <ns0:tcW ns0:w="7021" ns0:type="dxa"/>
+            <ns0:tcBorders>
+              <ns0:top ns0:val="single" ns0:sz="4" ns0:space="0" ns0:color="auto"/>
+              <ns0:left ns0:val="single" ns0:sz="4" ns0:space="0" ns0:color="auto"/>
+              <ns0:bottom ns0:val="single" ns0:sz="4" ns0:space="0" ns0:color="auto"/>
+              <ns0:right ns0:val="single" ns0:sz="4" ns0:space="0" ns0:color="auto"/>
+            </ns0:tcBorders>
+          </ns0:tcPr>
+          <ns0:p ns2:paraId="05093A36" ns2:textId="77777777" ns0:rsidR="001F1E2F" ns0:rsidRPr="00AA6499" ns0:rsidRDefault="001F1E2F" ns0:rsidP="001F1E2F">
+            <ns0:pPr>
+              <ns0:keepNext/>
+            </ns0:pPr>
+            <ns0:r>
+              <ns0:t>Температурный диапазон условий эксплуатации весов, °С</ns0:t>
+            </ns0:r>
+          </ns0:p>
+        </ns0:tc>
+        <ns0:tc>
+          <ns0:tcPr>
+            <ns0:tcW ns0:w="2403" ns0:type="dxa"/>
+            <ns0:tcBorders>
+              <ns0:top ns0:val="single" ns0:sz="4" ns0:space="0" ns0:color="auto"/>
+              <ns0:left ns0:val="single" ns0:sz="4" ns0:space="0" ns0:color="auto"/>
+              <ns0:bottom ns0:val="single" ns0:sz="4" ns0:space="0" ns0:color="auto"/>
+              <ns0:right ns0:val="single" ns0:sz="4" ns0:space="0" ns0:color="auto"/>
+            </ns0:tcBorders>
+          </ns0:tcPr>
+          <ns0:p ns2:paraId="4E0AE5B6" ns2:textId="77777777" ns0:rsidR="001F1E2F" ns0:rsidRPr="00AA6499" ns0:rsidRDefault="001F1E2F" ns0:rsidP="001F1E2F">
+            <ns0:pPr>
+              <ns0:keepNext/>
+              <ns0:jc ns0:val="center"/>
+            </ns0:pPr>
+            <ns0:r>
+              <ns0:t>{{ТТХ_ТЕМПЕРАТУРА}}</ns0:t>
+            </ns0:r>
+          </ns0:p>
+        </ns0:tc>
+      </ns0:tr>
+      <ns0:tr ns0:rsidR="008B62CE" ns0:rsidRPr="00AA6499" ns2:paraId="7C085276" ns2:textId="77777777" ns0:rsidTr="005B0EE5">
+        <ns0:trPr>
+          <ns0:cantSplit/>
+        </ns0:trPr>
+        <ns0:tc>
+          <ns0:tcPr>
+            <ns0:tcW ns0:w="647" ns0:type="dxa"/>
+            <ns0:tcBorders>
+              <ns0:top ns0:val="single" ns0:sz="4" ns0:space="0" ns0:color="auto"/>
+              <ns0:left ns0:val="single" ns0:sz="4" ns0:space="0" ns0:color="auto"/>
+              <ns0:bottom ns0:val="single" ns0:sz="4" ns0:space="0" ns0:color="auto"/>
+              <ns0:right ns0:val="single" ns0:sz="4" ns0:space="0" ns0:color="auto"/>
+            </ns0:tcBorders>
+            <ns0:vAlign ns0:val="center"/>
+          </ns0:tcPr>
+          <ns0:p ns2:paraId="18206E26" ns2:textId="77777777" ns0:rsidR="002A33C2" ns0:rsidRPr="00AA6499" ns0:rsidRDefault="002A33C2" ns0:rsidP="002A33C2">
+            <ns0:pPr>
+              <ns0:keepNext/>
+              <ns0:jc ns0:val="center"/>
+            </ns0:pPr>
+            <ns0:r>
+              <ns0:t>7.</ns0:t>
+            </ns0:r>
+          </ns0:p>
+        </ns0:tc>
+        <ns0:tc>
+          <ns0:tcPr>
+            <ns0:tcW ns0:w="7021" ns0:type="dxa"/>
+            <ns0:tcBorders>
+              <ns0:top ns0:val="single" ns0:sz="4" ns0:space="0" ns0:color="auto"/>
+              <ns0:left ns0:val="single" ns0:sz="4" ns0:space="0" ns0:color="auto"/>
+              <ns0:bottom ns0:val="single" ns0:sz="4" ns0:space="0" ns0:color="auto"/>
+              <ns0:right ns0:val="single" ns0:sz="4" ns0:space="0" ns0:color="auto"/>
+            </ns0:tcBorders>
+          </ns0:tcPr>
+          <ns0:p ns2:paraId="2F2E5463" ns2:textId="77777777" ns0:rsidR="002A33C2" ns0:rsidRPr="00AA6499" ns0:rsidRDefault="002A33C2" ns0:rsidP="002A33C2">
+            <ns0:pPr>
+              <ns0:keepNext/>
+            </ns0:pPr>
+            <ns0:r>
+              <ns0:t>Канал внешней связи</ns0:t>
+            </ns0:r>
+          </ns0:p>
+        </ns0:tc>
+        <ns0:tc>
+          <ns0:tcPr>
+            <ns0:tcW ns0:w="2403" ns0:type="dxa"/>
+            <ns0:tcBorders>
+              <ns0:top ns0:val="single" ns0:sz="4" ns0:space="0" ns0:color="auto"/>
+              <ns0:left ns0:val="single" ns0:sz="4" ns0:space="0" ns0:color="auto"/>
+              <ns0:bottom ns0:val="single" ns0:sz="4" ns0:space="0" ns0:color="auto"/>
+              <ns0:right ns0:val="single" ns0:sz="4" ns0:space="0" ns0:color="auto"/>
+            </ns0:tcBorders>
+          </ns0:tcPr>
+          <ns0:p ns2:paraId="1F6836BA" ns2:textId="77777777" ns0:rsidR="002A33C2" ns0:rsidRPr="00AA6499" ns0:rsidRDefault="002A33C2" ns0:rsidP="002A33C2">
+            <ns0:pPr>
+              <ns0:keepNext/>
+              <ns0:jc ns0:val="center"/>
+            </ns0:pPr>
+            <ns0:r>
+              <ns0:rPr>
+                <ns0:lang ns0:val="en-US"/>
+              </ns0:rPr>
+              <ns0:t>RS</ns0:t>
+            </ns0:r>
+            <ns0:r>
+              <ns0:t xml:space="preserve"> 232/485</ns0:t>
+            </ns0:r>
+          </ns0:p>
+        </ns0:tc>
+      </ns0:tr>
+      <ns0:tr ns0:rsidR="008B62CE" ns0:rsidRPr="00AA6499" ns2:paraId="02776412" ns2:textId="77777777" ns0:rsidTr="005B0EE5">
+        <ns0:trPr>
+          <ns0:cantSplit/>
+        </ns0:trPr>
+        <ns0:tc>
+          <ns0:tcPr>
+            <ns0:tcW ns0:w="647" ns0:type="dxa"/>
+            <ns0:tcBorders>
+              <ns0:top ns0:val="single" ns0:sz="4" ns0:space="0" ns0:color="auto"/>
+              <ns0:left ns0:val="single" ns0:sz="4" ns0:space="0" ns0:color="auto"/>
+              <ns0:bottom ns0:val="single" ns0:sz="4" ns0:space="0" ns0:color="auto"/>
+              <ns0:right ns0:val="single" ns0:sz="4" ns0:space="0" ns0:color="auto"/>
+            </ns0:tcBorders>
+            <ns0:vAlign ns0:val="center"/>
+          </ns0:tcPr>
+          <ns0:p ns2:paraId="6650715A" ns2:textId="77777777" ns0:rsidR="002A33C2" ns0:rsidRPr="00AA6499" ns0:rsidRDefault="002A33C2" ns0:rsidP="002A33C2">
+            <ns0:pPr>
+              <ns0:keepNext/>
+              <ns0:jc ns0:val="center"/>
+            </ns0:pPr>
+            <ns0:r>
+              <ns0:t>8.</ns0:t>
+            </ns0:r>
+          </ns0:p>
+        </ns0:tc>
+        <ns0:tc>
+          <ns0:tcPr>
+            <ns0:tcW ns0:w="7021" ns0:type="dxa"/>
+            <ns0:tcBorders>
+              <ns0:top ns0:val="single" ns0:sz="4" ns0:space="0" ns0:color="auto"/>
+              <ns0:left ns0:val="single" ns0:sz="4" ns0:space="0" ns0:color="auto"/>
+              <ns0:bottom ns0:val="single" ns0:sz="4" ns0:space="0" ns0:color="auto"/>
+              <ns0:right ns0:val="single" ns0:sz="4" ns0:space="0" ns0:color="auto"/>
+            </ns0:tcBorders>
+          </ns0:tcPr>
+          <ns0:p ns2:paraId="37196688" ns2:textId="77777777" ns0:rsidR="002A33C2" ns0:rsidRPr="00AA6499" ns0:rsidRDefault="002A33C2" ns0:rsidP="002A33C2">
+            <ns0:pPr>
+              <ns0:keepNext/>
+            </ns0:pPr>
+            <ns0:r>
+              <ns0:t>Электропитание, В</ns0:t>
+            </ns0:r>
+          </ns0:p>
+        </ns0:tc>
+        <ns0:tc>
+          <ns0:tcPr>
+            <ns0:tcW ns0:w="2403" ns0:type="dxa"/>
+            <ns0:tcBorders>
+              <ns0:top ns0:val="single" ns0:sz="4" ns0:space="0" ns0:color="auto"/>
+              <ns0:left ns0:val="single" ns0:sz="4" ns0:space="0" ns0:color="auto"/>
+              <ns0:bottom ns0:val="single" ns0:sz="4" ns0:space="0" ns0:color="auto"/>
+              <ns0:right ns0:val="single" ns0:sz="4" ns0:space="0" ns0:color="auto"/>
+            </ns0:tcBorders>
+          </ns0:tcPr>
+          <ns0:p ns2:paraId="647F4B44" ns2:textId="77777777" ns0:rsidR="002A33C2" ns0:rsidRPr="00AA6499" ns0:rsidRDefault="002A33C2" ns0:rsidP="002A33C2">
+            <ns0:pPr>
+              <ns0:keepNext/>
+              <ns0:jc ns0:val="center"/>
+            </ns0:pPr>
+            <ns0:r>
+              <ns0:t>≈220 ± 15</ns0:t>
+            </ns0:r>
+          </ns0:p>
+        </ns0:tc>
+      </ns0:tr>
+      <ns0:tr ns0:rsidR="008B62CE" ns0:rsidRPr="00AA6499" ns2:paraId="4F0A8F19" ns2:textId="77777777">
+        <ns0:trPr>
+          <ns0:cantSplit/>
+        </ns0:trPr>
+        <ns0:tc>
+          <ns0:tcPr>
+            <ns0:tcW ns0:w="647" ns0:type="dxa"/>
+            <ns0:tcBorders>
+              <ns0:top ns0:val="single" ns0:sz="4" ns0:space="0" ns0:color="auto"/>
+              <ns0:left ns0:val="single" ns0:sz="4" ns0:space="0" ns0:color="auto"/>
+              <ns0:bottom ns0:val="single" ns0:sz="4" ns0:space="0" ns0:color="auto"/>
+              <ns0:right ns0:val="single" ns0:sz="4" ns0:space="0" ns0:color="auto"/>
+            </ns0:tcBorders>
+            <ns0:vAlign ns0:val="center"/>
+          </ns0:tcPr>
+          <ns0:p ns2:paraId="3946BD63" ns2:textId="77777777" ns0:rsidR="002A33C2" ns0:rsidRPr="00583195" ns0:rsidRDefault="002A33C2" ns0:rsidP="002A33C2">
+            <ns0:pPr>
+              <ns0:keepNext/>
+              <ns0:jc ns0:val="center"/>
+            </ns0:pPr>
+            <ns0:r>
+              <ns0:t>9.</ns0:t>
+            </ns0:r>
+          </ns0:p>
+        </ns0:tc>
+        <ns0:tc>
+          <ns0:tcPr>
+            <ns0:tcW ns0:w="7021" ns0:type="dxa"/>
+            <ns0:tcBorders>
+              <ns0:top ns0:val="single" ns0:sz="4" ns0:space="0" ns0:color="auto"/>
+              <ns0:left ns0:val="single" ns0:sz="4" ns0:space="0" ns0:color="auto"/>
+              <ns0:bottom ns0:val="single" ns0:sz="4" ns0:space="0" ns0:color="auto"/>
+              <ns0:right ns0:val="single" ns0:sz="4" ns0:space="0" ns0:color="auto"/>
+            </ns0:tcBorders>
+            <ns0:vAlign ns0:val="center"/>
+          </ns0:tcPr>
+          <ns0:p ns2:paraId="69DC574E" ns2:textId="77777777" ns0:rsidR="002A33C2" ns0:rsidRPr="00583195" ns0:rsidRDefault="002A33C2" ns0:rsidP="002A33C2">
+            <ns0:pPr>
+              <ns0:keepNext/>
+            </ns0:pPr>
+            <ns0:r>
+              <ns0:t>Потребляемая мощность, не более, Вт</ns0:t>
+            </ns0:r>
+          </ns0:p>
+        </ns0:tc>
+        <ns0:tc>
+          <ns0:tcPr>
+            <ns0:tcW ns0:w="2403" ns0:type="dxa"/>
+            <ns0:tcBorders>
+              <ns0:top ns0:val="single" ns0:sz="4" ns0:space="0" ns0:color="auto"/>
+              <ns0:left ns0:val="single" ns0:sz="4" ns0:space="0" ns0:color="auto"/>
+              <ns0:bottom ns0:val="single" ns0:sz="4" ns0:space="0" ns0:color="auto"/>
+              <ns0:right ns0:val="single" ns0:sz="4" ns0:space="0" ns0:color="auto"/>
+            </ns0:tcBorders>
+            <ns0:vAlign ns0:val="center"/>
+          </ns0:tcPr>
+          <ns0:p ns2:paraId="450E4219" ns2:textId="77777777" ns0:rsidR="002A33C2" ns0:rsidRPr="00583195" ns0:rsidRDefault="002A33C2" ns0:rsidP="002A33C2">
+            <ns0:pPr>
+              <ns0:keepNext/>
+              <ns0:jc ns0:val="center"/>
+            </ns0:pPr>
+            <ns0:r>
+              <ns0:t>15</ns0:t>
+            </ns0:r>
+          </ns0:p>
+        </ns0:tc>
+      </ns0:tr>
+      <ns0:tr ns0:rsidR="002A33C2" ns0:rsidRPr="00AA6499" ns2:paraId="247A7FDF" ns2:textId="77777777" ns0:rsidTr="00583195">
+        <ns0:trPr>
+          <ns0:cantSplit/>
+          <ns0:trHeight ns0:val="936"/>
+        </ns0:trPr>
+        <ns0:tc>
+          <ns0:tcPr>
+            <ns0:tcW ns0:w="647" ns0:type="dxa"/>
+            <ns0:tcBorders>
+              <ns0:top ns0:val="single" ns0:sz="4" ns0:space="0" ns0:color="auto"/>
+              <ns0:left ns0:val="single" ns0:sz="4" ns0:space="0" ns0:color="auto"/>
+              <ns0:bottom ns0:val="single" ns0:sz="4" ns0:space="0" ns0:color="auto"/>
+              <ns0:right ns0:val="single" ns0:sz="4" ns0:space="0" ns0:color="auto"/>
+            </ns0:tcBorders>
+            <ns0:vAlign ns0:val="center"/>
+          </ns0:tcPr>
+          <ns0:p ns2:paraId="6320A000" ns2:textId="77777777" ns0:rsidR="002A33C2" ns0:rsidRPr="00583195" ns0:rsidRDefault="002A33C2" ns0:rsidP="002A33C2">
+            <ns0:pPr>
+              <ns0:keepNext/>
+              <ns0:jc ns0:val="center"/>
+            </ns0:pPr>
+            <ns0:r>
+              <ns0:t>10.</ns0:t>
+            </ns0:r>
+          </ns0:p>
+        </ns0:tc>
+        <ns0:tc>
+          <ns0:tcPr>
+            <ns0:tcW ns0:w="9424" ns0:type="dxa"/>
+            <ns0:gridSpan ns0:val="2"/>
+            <ns0:tcBorders>
+              <ns0:top ns0:val="single" ns0:sz="4" ns0:space="0" ns0:color="auto"/>
+              <ns0:left ns0:val="single" ns0:sz="4" ns0:space="0" ns0:color="auto"/>
+              <ns0:bottom ns0:val="single" ns0:sz="4" ns0:space="0" ns0:color="auto"/>
+              <ns0:right ns0:val="single" ns0:sz="4" ns0:space="0" ns0:color="auto"/>
+            </ns0:tcBorders>
+            <ns0:vAlign ns0:val="center"/>
+          </ns0:tcPr>
+          <ns0:p ns2:paraId="75A70BBE" ns2:textId="77777777" ns0:rsidR="00583195" ns0:rsidRPr="00583195" ns0:rsidRDefault="00583195" ns0:rsidP="00583195">
+            <ns0:pPr>
+              <ns0:keepNext/>
+              <ns0:jc ns0:val="both"/>
+            </ns0:pPr>
+            <ns0:r>
+              <ns0:t>Весы автомобильные ВЕСТА выпускаются ООО «ТПК «</ns0:t>
+            </ns0:r>
+            <ns0:proofErr ns0:type="spellStart"/>
+            <ns0:r>
+              <ns0:t>Тензосила</ns0:t>
+            </ns0:r>
+            <ns0:proofErr ns0:type="spellEnd"/>
+            <ns0:r>
+              <ns0:t>»» по                               ГОСТ OIML R-76-1-2011. Тип весов утвержден и внесен в Госреестр средств измерений РФ под № 78871-20</ns0:t>
+            </ns0:r>
+          </ns0:p>
+        </ns0:tc>
+      </ns0:tr>
+    </ns0:tbl>
+    <ns0:p ns2:paraId="0A884DA1" ns2:textId="77777777" ns0:rsidR="00DB750F" ns0:rsidRPr="00AA6499" ns0:rsidRDefault="00DB750F" ns0:rsidP="00DB750F">
+      <ns0:pPr>
+        <ns0:keepNext/>
+        <ns0:rPr>
+          <ns0:b/>
+        </ns0:rPr>
+      </ns0:pPr>
+    </ns0:p>
+    <ns0:p ns2:paraId="2A16D522" ns2:textId="77777777" ns0:rsidR="004B7264" ns0:rsidRPr="00AA6499" ns0:rsidRDefault="004B7264" ns0:rsidP="00800433">
+      <ns0:pPr>
+        <ns0:pStyle ns0:val="af3"/>
+        <ns0:keepNext/>
+        <ns0:rPr>
+          <ns0:bCs/>
+        </ns0:rPr>
+      </ns0:pPr>
+      <ns0:r>
+        <ns0:rPr>
+          <ns0:bCs/>
+        </ns0:rPr>
+        <ns0:t>{{КОМПЛЕКТ_НОМЕР}}. Комплект поставки весов {{СПЕЦ_МОДЕЛЬ_КРАТКОЕ}} на единицу продукции</ns0:t>
+      </ns0:r>
+    </ns0:p>
+    <ns0:p ns2:paraId="48FB434E" ns2:textId="77777777" ns0:rsidR="00DB750F" ns0:rsidRPr="008B62CE" ns0:rsidRDefault="00DB750F" ns0:rsidP="004B7264">
+      <ns0:pPr>
+        <ns0:keepNext/>
+        <ns0:jc ns0:val="center"/>
+        <ns0:rPr>
+          <ns0:b/>
+        </ns0:rPr>
+      </ns0:pPr>
+    </ns0:p>
+    <ns0:tbl>
+      <ns0:tblPr>
+        <ns0:tblW ns0:w="10071" ns0:type="dxa"/>
+        <ns0:tblInd ns0:w="26" ns0:type="dxa"/>
+        <ns0:tblBorders>
+          <ns0:top ns0:val="single" ns0:sz="2" ns0:space="0" ns0:color="000001"/>
+          <ns0:left ns0:val="single" ns0:sz="2" ns0:space="0" ns0:color="000001"/>
+          <ns0:bottom ns0:val="single" ns0:sz="2" ns0:space="0" ns0:color="000001"/>
+        </ns0:tblBorders>
+        <ns0:tblCellMar>
+          <ns0:top ns0:w="28" ns0:type="dxa"/>
+          <ns0:left ns0:w="25" ns0:type="dxa"/>
+          <ns0:bottom ns0:w="28" ns0:type="dxa"/>
+          <ns0:right ns0:w="28" ns0:type="dxa"/>
+        </ns0:tblCellMar>
+        <ns0:tblLook ns0:val="04A0" ns0:firstRow="1" ns0:lastRow="0" ns0:firstColumn="1" ns0:lastColumn="0" ns0:noHBand="0" ns0:noVBand="1"/>
+      </ns0:tblPr>
+      <ns0:tblGrid>
+        <ns0:gridCol ns0:w="7626"/>
+        <ns0:gridCol ns0:w="2445"/>
+      </ns0:tblGrid>
+      <ns0:tr ns0:rsidR="00A11833" ns0:rsidRPr="000C4A5B" ns2:paraId="3E44B892" ns2:textId="77777777" ns0:rsidTr="00091CEF">
+        <ns0:trPr>
+          <ns0:cantSplit/>
+          <ns0:tblHeader/>
+        </ns0:trPr>
+        <ns0:tc>
+          <ns0:tcPr>
+            <ns0:tcW ns0:w="7626" ns0:type="dxa"/>
+            <ns0:tcBorders>
+              <ns0:top ns0:val="single" ns0:sz="2" ns0:space="0" ns0:color="000001"/>
+              <ns0:left ns0:val="single" ns0:sz="2" ns0:space="0" ns0:color="000001"/>
+              <ns0:bottom ns0:val="single" ns0:sz="2" ns0:space="0" ns0:color="000001"/>
+            </ns0:tcBorders>
+            <ns0:tcMar>
+              <ns0:left ns0:w="25" ns0:type="dxa"/>
+            </ns0:tcMar>
+            <ns0:vAlign ns0:val="center"/>
+          </ns0:tcPr>
+          <ns0:p ns2:paraId="6A51EBE3" ns2:textId="77777777" ns0:rsidR="00A11833" ns0:rsidRPr="00A32478" ns0:rsidRDefault="00A11833" ns0:rsidP="00091CEF">
+            <ns0:pPr>
+              <ns0:keepNext/>
+              <ns0:jc ns0:val="center"/>
+            </ns0:pPr>
+            <ns0:r>
+              <ns0:rPr>
+                <ns0:b/>
+              </ns0:rPr>
+              <ns0:t>Комплект</ns0:t>
+            </ns0:r>
+          </ns0:p>
+        </ns0:tc>
+        <ns0:tc>
+          <ns0:tcPr>
+            <ns0:tcW ns0:w="2445" ns0:type="dxa"/>
+            <ns0:tcBorders>
+              <ns0:top ns0:val="single" ns0:sz="2" ns0:space="0" ns0:color="000001"/>
+              <ns0:left ns0:val="single" ns0:sz="2" ns0:space="0" ns0:color="000001"/>
+              <ns0:bottom ns0:val="single" ns0:sz="2" ns0:space="0" ns0:color="000001"/>
+              <ns0:right ns0:val="single" ns0:sz="2" ns0:space="0" ns0:color="000001"/>
+            </ns0:tcBorders>
+            <ns0:tcMar>
+              <ns0:left ns0:w="25" ns0:type="dxa"/>
+            </ns0:tcMar>
+            <ns0:vAlign ns0:val="center"/>
+          </ns0:tcPr>
+          <ns0:p ns2:paraId="63D35A86" ns2:textId="77777777" ns0:rsidR="00A11833" ns0:rsidRPr="00A32478" ns0:rsidRDefault="00A11833" ns0:rsidP="00091CEF">
+            <ns0:pPr>
+              <ns0:keepNext/>
+              <ns0:jc ns0:val="center"/>
+            </ns0:pPr>
+            <ns0:r>
+              <ns0:rPr>
+                <ns0:b/>
+              </ns0:rPr>
+              <ns0:t>Количество</ns0:t>
+            </ns0:r>
+          </ns0:p>
+        </ns0:tc>
+      </ns0:tr>
+      <ns0:tr ns0:rsidR="00A11833" ns0:rsidRPr="000C4A5B" ns2:paraId="573BD76F" ns2:textId="77777777" ns0:rsidTr="00091CEF">
+        <ns0:trPr>
+          <ns0:cantSplit/>
+        </ns0:trPr>
+        <ns0:tc>
+          <ns0:tcPr>
+            <ns0:tcW ns0:w="7626" ns0:type="dxa"/>
+            <ns0:tcBorders>
+              <ns0:left ns0:val="single" ns0:sz="2" ns0:space="0" ns0:color="000001"/>
+              <ns0:bottom ns0:val="single" ns0:sz="2" ns0:space="0" ns0:color="000001"/>
+            </ns0:tcBorders>
+            <ns0:tcMar>
+              <ns0:left ns0:w="25" ns0:type="dxa"/>
+            </ns0:tcMar>
+            <ns0:vAlign ns0:val="center"/>
+          </ns0:tcPr>
+          <ns0:p ns2:paraId="6D699679" ns2:textId="77777777" ns0:rsidR="00A11833" ns0:rsidRPr="00A32478" ns0:rsidRDefault="00A11833" ns0:rsidP="00091CEF">
+            <ns0:pPr>
+              <ns0:keepNext/>
+              <ns0:jc ns0:val="center"/>
+            </ns0:pPr>
+          </ns0:p>
+        </ns0:tc>
+        <ns0:tc>
+          <ns0:tcPr>
+            <ns0:tcW ns0:w="2445" ns0:type="dxa"/>
+            <ns0:tcBorders>
+              <ns0:left ns0:val="single" ns0:sz="2" ns0:space="0" ns0:color="000001"/>
+              <ns0:bottom ns0:val="single" ns0:sz="2" ns0:space="0" ns0:color="000001"/>
+              <ns0:right ns0:val="single" ns0:sz="2" ns0:space="0" ns0:color="000001"/>
+            </ns0:tcBorders>
+            <ns0:tcMar>
+              <ns0:left ns0:w="25" ns0:type="dxa"/>
+            </ns0:tcMar>
+            <ns0:vAlign ns0:val="center"/>
+          </ns0:tcPr>
+          <ns0:p ns2:paraId="06BE8D35" ns2:textId="77777777" ns0:rsidR="00A11833" ns0:rsidRPr="00A32478" ns0:rsidRDefault="00A11833" ns0:rsidP="00091CEF">
+            <ns0:pPr>
+              <ns0:keepNext/>
+              <ns0:jc ns0:val="center"/>
+            </ns0:pPr>
+          </ns0:p>
+        </ns0:tc>
+      </ns0:tr>
+    </ns0:tbl>
+    <ns0:p ns2:paraId="2DC4AB78" ns2:textId="77777777" ns0:rsidR="004B7264" ns0:rsidRPr="008B62CE" ns0:rsidRDefault="004B7264" ns0:rsidP="004B7264">
+      <ns0:pPr>
+        <ns0:keepNext/>
+      </ns0:pPr>
+    </ns0:p>
+    <ns0:tbl>
+      <ns0:tblPr>
+        <ns0:tblpPr ns0:leftFromText="180" ns0:rightFromText="180" ns0:vertAnchor="text" ns0:horzAnchor="margin" ns0:tblpXSpec="center" ns0:tblpY="706"/>
+        <ns0:tblW ns0:w="8928" ns0:type="dxa"/>
+        <ns0:tblLayout ns0:type="fixed"/>
+        <ns0:tblLook ns0:val="0000" ns0:firstRow="0" ns0:lastRow="0" ns0:firstColumn="0" ns0:lastColumn="0" ns0:noHBand="0" ns0:noVBand="0"/>
+      </ns0:tblPr>
+      <ns0:tblGrid>
+        <ns0:gridCol ns0:w="4608"/>
+        <ns0:gridCol ns0:w="4320"/>
+      </ns0:tblGrid>
+      <ns0:tr ns0:rsidR="008B62CE" ns0:rsidRPr="008B62CE" ns2:paraId="16AB4F1C" ns2:textId="77777777" ns0:rsidTr="00800433">
+        <ns0:trPr>
+          <ns0:cantSplit/>
+          <ns0:trHeight ns0:val="2025"/>
+        </ns0:trPr>
+        <ns0:tc>
+          <ns0:tcPr>
+            <ns0:tcW ns0:w="4608" ns0:type="dxa"/>
+          </ns0:tcPr>
+          <ns0:p ns2:paraId="6CF2F4E1" ns2:textId="77777777" ns0:rsidR="002A33C2" ns0:rsidRPr="008B62CE" ns0:rsidRDefault="002A33C2" ns0:rsidP="00800433">
+            <ns0:pPr>
+              <ns0:pStyle ns0:val="3"/>
+              <ns0:widowControl ns0:val="0"/>
+              <ns0:rPr>
+                <ns0:b ns0:val="0"/>
+                <ns0:sz ns0:val="24"/>
+                <ns0:szCs ns0:val="24"/>
+              </ns0:rPr>
+            </ns0:pPr>
+            <ns0:r>
+              <ns0:rPr>
+                <ns0:b ns0:val="0"/>
+                <ns0:sz ns0:val="24"/>
+                <ns0:szCs ns0:val="24"/>
+              </ns0:rPr>
+              <ns0:t>ПОДРЯДЧИК:</ns0:t>
+            </ns0:r>
+          </ns0:p>
+          <ns0:p ns2:paraId="3FA95738" ns2:textId="77777777" ns0:rsidR="00676EC6" ns0:rsidRPr="008B62CE" ns0:rsidRDefault="002A33C2" ns0:rsidP="00800433">
+            <ns0:pPr>
+              <ns0:pStyle ns0:val="3"/>
+              <ns0:widowControl ns0:val="0"/>
+              <ns0:rPr>
+                <ns0:b ns0:val="0"/>
+                <ns0:sz ns0:val="24"/>
+                <ns0:szCs ns0:val="24"/>
+              </ns0:rPr>
+            </ns0:pPr>
+            <ns0:r>
+              <ns0:rPr>
+                <ns0:b ns0:val="0"/>
+                <ns0:sz ns0:val="24"/>
+                <ns0:szCs ns0:val="24"/>
+              </ns0:rPr>
+              <ns0:t xml:space="preserve">Директор </ns0:t>
+            </ns0:r>
+          </ns0:p>
+          <ns0:p ns2:paraId="5E83E65E" ns2:textId="77777777" ns0:rsidR="002A33C2" ns0:rsidRPr="008B62CE" ns0:rsidRDefault="002A33C2" ns0:rsidP="00800433">
+            <ns0:pPr>
+              <ns0:pStyle ns0:val="3"/>
+              <ns0:widowControl ns0:val="0"/>
+              <ns0:rPr>
+                <ns0:b ns0:val="0"/>
+                <ns0:sz ns0:val="24"/>
+                <ns0:szCs ns0:val="24"/>
+              </ns0:rPr>
+            </ns0:pPr>
+            <ns0:r>
+              <ns0:rPr>
+                <ns0:b ns0:val="0"/>
+                <ns0:sz ns0:val="24"/>
+                <ns0:szCs ns0:val="24"/>
+              </ns0:rPr>
+              <ns0:t>ООО «ТПК «</ns0:t>
+            </ns0:r>
+            <ns0:proofErr ns0:type="spellStart"/>
+            <ns0:r>
+              <ns0:rPr>
+                <ns0:b ns0:val="0"/>
+                <ns0:sz ns0:val="24"/>
+                <ns0:szCs ns0:val="24"/>
+              </ns0:rPr>
+              <ns0:t>Тензосила</ns0:t>
+            </ns0:r>
+            <ns0:proofErr ns0:type="spellEnd"/>
+            <ns0:r>
+              <ns0:rPr>
+                <ns0:b ns0:val="0"/>
+                <ns0:sz ns0:val="24"/>
+                <ns0:szCs ns0:val="24"/>
+              </ns0:rPr>
+              <ns0:t>»»</ns0:t>
+            </ns0:r>
+          </ns0:p>
+          <ns0:p ns2:paraId="05299AFD" ns2:textId="77777777" ns0:rsidR="002A33C2" ns0:rsidRPr="008B62CE" ns0:rsidRDefault="002A33C2" ns0:rsidP="00800433">
+            <ns0:pPr>
+              <ns0:pStyle ns0:val="3"/>
+              <ns0:widowControl ns0:val="0"/>
+              <ns0:rPr>
+                <ns0:b ns0:val="0"/>
+                <ns0:sz ns0:val="24"/>
+                <ns0:szCs ns0:val="24"/>
+              </ns0:rPr>
+            </ns0:pPr>
+          </ns0:p>
+          <ns0:p ns2:paraId="282B9289" ns2:textId="77777777" ns0:rsidR="002A33C2" ns0:rsidRPr="008B62CE" ns0:rsidRDefault="002A33C2" ns0:rsidP="00800433">
+            <ns0:pPr>
+              <ns0:pStyle ns0:val="3"/>
+              <ns0:widowControl ns0:val="0"/>
+              <ns0:rPr>
+                <ns0:b ns0:val="0"/>
+                <ns0:sz ns0:val="24"/>
+                <ns0:szCs ns0:val="24"/>
+              </ns0:rPr>
+            </ns0:pPr>
+            <ns0:r>
+              <ns0:rPr>
+                <ns0:b ns0:val="0"/>
+                <ns0:sz ns0:val="24"/>
+                <ns0:szCs ns0:val="24"/>
+              </ns0:rPr>
+              <ns0:t>________________/</ns0:t>
+            </ns0:r>
+            <ns0:proofErr ns0:type="spellStart"/>
+            <ns0:r>
+              <ns0:rPr>
+                <ns0:b ns0:val="0"/>
+                <ns0:sz ns0:val="24"/>
+                <ns0:szCs ns0:val="24"/>
+              </ns0:rPr>
+              <ns0:t>О.А.Сенаторов</ns0:t>
+            </ns0:r>
+            <ns0:proofErr ns0:type="spellEnd"/>
+            <ns0:r>
+              <ns0:rPr>
+                <ns0:b ns0:val="0"/>
+                <ns0:sz ns0:val="24"/>
+                <ns0:szCs ns0:val="24"/>
+              </ns0:rPr>
+              <ns0:t>/</ns0:t>
+            </ns0:r>
+          </ns0:p>
+          <ns0:p ns2:paraId="2AA15535" ns2:textId="77777777" ns0:rsidR="002A33C2" ns0:rsidRPr="008B62CE" ns0:rsidRDefault="002A33C2" ns0:rsidP="00800433">
+            <ns0:pPr>
+              <ns0:widowControl ns0:val="0"/>
+              <ns0:jc ns0:val="both"/>
+            </ns0:pPr>
+          </ns0:p>
+          <ns0:p ns2:paraId="0A4E9804" ns2:textId="77777777" ns0:rsidR="002A33C2" ns0:rsidRPr="008B62CE" ns0:rsidRDefault="002A33C2" ns0:rsidP="00800433">
+            <ns0:pPr>
+              <ns0:widowControl ns0:val="0"/>
+              <ns0:jc ns0:val="both"/>
+            </ns0:pPr>
+            <ns0:r>
+              <ns0:t>"____" ___________{{ТЕКУЩИЙ_ГОД}} г.</ns0:t>
+            </ns0:r>
+          </ns0:p>
+          <ns0:p ns2:paraId="042A890E" ns2:textId="77777777" ns0:rsidR="002A33C2" ns0:rsidRPr="008B62CE" ns0:rsidRDefault="002A33C2" ns0:rsidP="00800433">
+            <ns0:pPr>
+              <ns0:widowControl ns0:val="0"/>
+              <ns0:ind ns0:firstLine="709"/>
+              <ns0:jc ns0:val="both"/>
+            </ns0:pPr>
+          </ns0:p>
+          <ns0:p ns2:paraId="6ED88904" ns2:textId="77777777" ns0:rsidR="002A33C2" ns0:rsidRPr="008B62CE" ns0:rsidRDefault="002A33C2" ns0:rsidP="00800433">
+            <ns0:pPr>
+              <ns0:widowControl ns0:val="0"/>
+              <ns0:jc ns0:val="both"/>
+              <ns0:rPr>
+                <ns0:sz ns0:val="16"/>
+                <ns0:szCs ns0:val="16"/>
+              </ns0:rPr>
+            </ns0:pPr>
+            <ns0:r>
+              <ns0:t xml:space="preserve">       М.П.</ns0:t>
+            </ns0:r>
+          </ns0:p>
+        </ns0:tc>
+        <ns0:tc>
+          <ns0:tcPr>
+            <ns0:tcW ns0:w="4320" ns0:type="dxa"/>
+          </ns0:tcPr>
+          <ns0:p ns2:paraId="040D61BB" ns2:textId="77777777" ns0:rsidR="00676EC6" ns0:rsidRPr="008B62CE" ns0:rsidRDefault="002A33C2" ns0:rsidP="00800433">
+            <ns0:r>
+              <ns0:t>ЗАКАЗЧИК:</ns0:t>
+            </ns0:r>
+          </ns0:p>
+          <ns0:p ns2:paraId="106AFF67" ns2:textId="77777777" ns0:rsidR="00676EC6" ns0:rsidRPr="008B62CE" ns0:rsidRDefault="00676EC6" ns0:rsidP="00800433">
+            <ns0:pPr>
+              <ns0:rPr>
+                <ns0:bCs/>
+              </ns0:rPr>
+            </ns0:pPr>
+            <ns0:r>
+              <ns0:t>{{ЗАКАЗЧИК_ДИРЕКТОР_ДОЛЖНОСТЬ}}</ns0:t>
+            </ns0:r>
+            <ns0:r>
+              <ns0:rPr>
+                <ns0:bCs/>
+              </ns0:rPr>
+              <ns0:t xml:space="preserve"> </ns0:t>
+            </ns0:r>
+          </ns0:p>
+          <ns0:p ns2:paraId="73D4DC4B" ns2:textId="77777777" ns0:rsidR="00676EC6" ns0:rsidRPr="008B62CE" ns0:rsidRDefault="00676EC6" ns0:rsidP="00800433">
+            <ns0:pPr>
+              <ns0:rPr>
+                <ns0:bCs/>
+              </ns0:rPr>
+            </ns0:pPr>
+            <ns0:r>
+              <ns0:rPr>
+                <ns0:bCs/>
+              </ns0:rPr>
+              <ns0:t>{{ЗАКАЗЧИК_КРАТКОЕ_НАИМЕНОВАНИЕ}}</ns0:t>
+            </ns0:r>
+          </ns0:p>
+          <ns0:p ns2:paraId="48142D32" ns2:textId="77777777" ns0:rsidR="00676EC6" ns0:rsidRPr="008B62CE" ns0:rsidRDefault="00676EC6" ns0:rsidP="00800433">
+            <ns0:pPr>
+              <ns0:rPr>
+                <ns0:bCs/>
+              </ns0:rPr>
+            </ns0:pPr>
+          </ns0:p>
+          <ns0:p ns2:paraId="4916AC0F" ns2:textId="77777777" ns0:rsidR="002A33C2" ns0:rsidRPr="008B62CE" ns0:rsidRDefault="002A33C2" ns0:rsidP="00800433">
+            <ns0:pPr>
+              <ns0:rPr>
+                <ns0:bCs/>
+              </ns0:rPr>
+            </ns0:pPr>
+            <ns0:r>
+              <ns0:t>__________________ /{{ЗАКАЗЧИК_ДИРЕКТОР_ИНИЦИАЛЫ}}/</ns0:t>
+            </ns0:r>
+          </ns0:p>
+          <ns0:p ns2:paraId="05D38D93" ns2:textId="77777777" ns0:rsidR="002A33C2" ns0:rsidRPr="008B62CE" ns0:rsidRDefault="002A33C2" ns0:rsidP="00800433"/>
+          <ns0:p ns2:paraId="1FEAF6E1" ns2:textId="77777777" ns0:rsidR="002A33C2" ns0:rsidRPr="008B62CE" ns0:rsidRDefault="002A33C2" ns0:rsidP="00800433">
+            <ns0:pPr>
+              <ns0:widowControl ns0:val="0"/>
+              <ns0:jc ns0:val="both"/>
+            </ns0:pPr>
+            <ns0:r>
+              <ns0:t>"____"__________{{ТЕКУЩИЙ_ГОД}} г.</ns0:t>
+            </ns0:r>
+          </ns0:p>
+          <ns0:p ns2:paraId="140DCB3D" ns2:textId="77777777" ns0:rsidR="002A33C2" ns0:rsidRPr="008B62CE" ns0:rsidRDefault="002A33C2" ns0:rsidP="00800433">
+            <ns0:pPr>
+              <ns0:widowControl ns0:val="0"/>
+              <ns0:jc ns0:val="both"/>
+            </ns0:pPr>
+            <ns0:r>
+              <ns0:t xml:space="preserve">      </ns0:t>
+            </ns0:r>
+          </ns0:p>
+          <ns0:p ns2:paraId="703AB128" ns2:textId="77777777" ns0:rsidR="002A33C2" ns0:rsidRPr="008B62CE" ns0:rsidRDefault="002A33C2" ns0:rsidP="00800433">
+            <ns0:pPr>
+              <ns0:widowControl ns0:val="0"/>
+              <ns0:jc ns0:val="both"/>
+              <ns0:rPr>
+                <ns0:sz ns0:val="16"/>
+                <ns0:szCs ns0:val="16"/>
+              </ns0:rPr>
+            </ns0:pPr>
+            <ns0:r>
+              <ns0:t xml:space="preserve">      М.П.</ns0:t>
+            </ns0:r>
+          </ns0:p>
+        </ns0:tc>
+      </ns0:tr>
+    </ns0:tbl>
+    <ns0:p ns2:paraId="45069726" ns2:textId="77777777" ns0:rsidR="000E6E22" ns0:rsidRPr="008B62CE" ns0:rsidRDefault="000E6E22">
+      <ns0:pPr>
+        <ns0:pStyle ns0:val="a7"/>
+        <ns0:jc ns0:val="right"/>
+        <ns0:rPr>
+          <ns0:b ns0:val="0"/>
+          <ns0:sz ns0:val="24"/>
+        </ns0:rPr>
+      </ns0:pPr>
+    </ns0:p>
+    <ns0:p ns2:paraId="28E16C91" ns2:textId="77777777" ns0:rsidR="000E6E22" ns0:rsidRPr="008B62CE" ns0:rsidRDefault="000E6E22">
+      <ns0:pPr>
+        <ns0:pStyle ns0:val="a7"/>
+        <ns0:jc ns0:val="right"/>
+        <ns0:rPr>
+          <ns0:b ns0:val="0"/>
+          <ns0:sz ns0:val="24"/>
+        </ns0:rPr>
+      </ns0:pPr>
+    </ns0:p>
+    <ns0:p ns2:paraId="6B0EAF65" ns2:textId="77777777" ns0:rsidR="000E6E22" ns0:rsidRPr="008B62CE" ns0:rsidRDefault="000E6E22">
+      <ns0:pPr>
+        <ns0:pStyle ns0:val="a7"/>
+        <ns0:jc ns0:val="right"/>
+        <ns0:rPr>
+          <ns0:b ns0:val="0"/>
+          <ns0:sz ns0:val="24"/>
+        </ns0:rPr>
+      </ns0:pPr>
+    </ns0:p>
+    <ns0:p ns2:paraId="2D6BA2CA" ns2:textId="77777777" ns0:rsidR="000E6E22" ns0:rsidRPr="008B62CE" ns0:rsidRDefault="000E6E22">
+      <ns0:pPr>
+        <ns0:pStyle ns0:val="a7"/>
+        <ns0:jc ns0:val="right"/>
+        <ns0:rPr>
+          <ns0:b ns0:val="0"/>
+          <ns0:sz ns0:val="24"/>
+        </ns0:rPr>
+      </ns0:pPr>
+    </ns0:p>
+    <ns0:p ns2:paraId="1550E4D8" ns2:textId="77777777" ns0:rsidR="000E6E22" ns0:rsidRPr="008B62CE" ns0:rsidRDefault="000E6E22">
+      <ns0:pPr>
+        <ns0:pStyle ns0:val="a7"/>
+        <ns0:jc ns0:val="right"/>
+        <ns0:rPr>
+          <ns0:b ns0:val="0"/>
+          <ns0:sz ns0:val="24"/>
+        </ns0:rPr>
+      </ns0:pPr>
+    </ns0:p>
+    <ns0:p ns2:paraId="5B67F48E" ns2:textId="77777777" ns0:rsidR="001575C0" ns0:rsidRPr="008B62CE" ns0:rsidRDefault="001575C0">
+      <ns0:pPr>
+        <ns0:pStyle ns0:val="a7"/>
+        <ns0:jc ns0:val="right"/>
+        <ns0:rPr>
+          <ns0:b ns0:val="0"/>
+          <ns0:sz ns0:val="24"/>
+        </ns0:rPr>
+      </ns0:pPr>
+    </ns0:p>
+    <ns0:p ns2:paraId="3E1DCD5E" ns2:textId="77777777" ns0:rsidR="001575C0" ns0:rsidRPr="008B62CE" ns0:rsidRDefault="001575C0">
+      <ns0:pPr>
+        <ns0:pStyle ns0:val="a7"/>
+        <ns0:jc ns0:val="left"/>
+        <ns0:rPr>
+          <ns0:b ns0:val="0"/>
+          <ns0:sz ns0:val="24"/>
+        </ns0:rPr>
+      </ns0:pPr>
+    </ns0:p>
+    <ns0:p ns2:paraId="185C6A90" ns2:textId="77777777" ns0:rsidR="001575C0" ns0:rsidRPr="008B62CE" ns0:rsidRDefault="001575C0">
+      <ns0:pPr>
+        <ns0:pStyle ns0:val="a7"/>
+        <ns0:jc ns0:val="right"/>
+        <ns0:rPr>
+          <ns0:b ns0:val="0"/>
+          <ns0:sz ns0:val="24"/>
+        </ns0:rPr>
+      </ns0:pPr>
+    </ns0:p>
+    <ns0:p ns2:paraId="2C70E0DE" ns2:textId="77777777" ns0:rsidR="001575C0" ns0:rsidRPr="008B62CE" ns0:rsidRDefault="001575C0">
+      <ns0:pPr>
+        <ns0:pStyle ns0:val="a7"/>
+        <ns0:jc ns0:val="right"/>
+        <ns0:rPr>
+          <ns0:b ns0:val="0"/>
+          <ns0:sz ns0:val="24"/>
+        </ns0:rPr>
+      </ns0:pPr>
+    </ns0:p>
+    <ns0:sectPr ns0:rsidR="00434785" ns0:rsidRPr="00434785">
+      <ns0:headerReference ns0:type="default" ns3:id="rId9"/>
+      <ns0:footerReference ns0:type="even" ns3:id="rId10"/>
+      <ns0:footerReference ns0:type="default" ns3:id="rId11"/>
+      <ns0:pgSz ns0:w="11906" ns0:h="16838"/>
+      <ns0:pgMar ns0:top="567" ns0:right="424" ns0:bottom="0" ns0:left="1418" ns0:header="709" ns0:footer="709" ns0:gutter="0"/>
+      <ns0:pgNumType ns0:start="1"/>
+      <ns0:cols ns0:space="708"/>
+      <ns0:docGrid ns0:linePitch="360"/>
+    </ns0:sectPr>
+  </ns0:body>
+</ns0:document>
 </file>
 
 <file path=word/endnotes.xml><?xml version="1.0" encoding="utf-8"?>

</xml_diff>